<commit_message>
Docs: booking and outbound identity is Scott; discovery/intro calls host with Scott
Consolidated the Consumer, Commercial, and Investor Intro discovery/intro call
host references to Scott across the Implementation Guide, WIP-3, and Handoff, and
recorded the calendar setup (phone location, phone required). Founder roster, org,
history, and the later Investor Presentation/Close are unchanged.

Co-Authored-By: Claude Opus 4.8 <noreply@anthropic.com>
</commit_message>
<xml_diff>
--- a/Enyrgy_GHL_Implementation_Guide_v3_9.docx
+++ b/Enyrgy_GHL_Implementation_Guide_v3_9.docx
@@ -2100,7 +2100,7 @@
         <w:t xml:space="preserve"> </w:t>
       </w:r>
       <w:r>
-        <w:t xml:space="preserve">At lead score 70+, the SDR agent sends a booking message for the Consumer Discovery Call (David + Scott round-robin, 15 min) or Commercial Discovery (20 min). The Stale Lead Sentinel (WF-04) runs daily at 8am; any active-pipeline contact with last_agent_touch &gt; 5 days gets flagged requires_human_review and notifies Scott. Human takes over when the call is booked.</w:t>
+        <w:t xml:space="preserve">At lead score 70+, the SDR agent sends a booking message for the Consumer Discovery Call (Scott, 15 min) or Commercial Discovery (Scott, 20 min). The Stale Lead Sentinel (WF-04) runs daily at 8am; any active-pipeline contact with last_agent_touch &gt; 5 days gets flagged requires_human_review and notifies Scott. Human takes over when the call is booked.</w:t>
       </w:r>
     </w:p>
     <w:p>
@@ -2118,7 +2118,7 @@
         <w:t xml:space="preserve"> </w:t>
       </w:r>
       <w:r>
-        <w:t xml:space="preserve">David primary. Capture the key fields (health goal, current solution, Fitzpatrick skin type, finance preference for consumer; business type, locations, decision maker, units for commercial) and run the demo. After the call, mark Has Seen Demo = Yes, that fires WF-05.</w:t>
+        <w:t xml:space="preserve">Scott. Capture the key fields (health goal, current solution, Fitzpatrick skin type, finance preference for consumer; business type, locations, decision maker, units for commercial) and run the demo. After the call, mark Has Seen Demo = Yes, that fires WF-05.</w:t>
       </w:r>
     </w:p>
     <w:p>
@@ -2208,7 +2208,7 @@
         <w:t xml:space="preserve"> </w:t>
       </w:r>
       <w:r>
-        <w:t xml:space="preserve">On reply/booking, SDR moves them to Intro Meeting; David runs the 15-minute call (overview, traction, team). At the end of the call or immediately after, Scott sends the PPM directly. The agent has it queued and ready. No accreditation required before sending the PPM - this is confirmed compliant per Enyrgy’s securities attorney.</w:t>
+        <w:t xml:space="preserve">On reply/booking, SDR moves them to Intro Meeting; Scott runs the 15-minute call (overview, traction, team). At the end of the call or immediately after, Scott sends the PPM directly. The agent has it queued and ready. No accreditation required before sending the PPM - this is confirmed compliant per Enyrgy’s securities attorney.</w:t>
       </w:r>
     </w:p>
     <w:p>
@@ -2308,7 +2308,7 @@
         <w:t xml:space="preserve"> </w:t>
       </w:r>
       <w:r>
-        <w:t xml:space="preserve">every live call; outreach to warm/personal intros before funnel entry; discovery calls (David primary, Scott backup); investor intro and post-PPM due diligence conversations; commercial demo/ROI walkthrough; proposal negotiation; any contract/legal/financial instrument; any conversation with frustration, confusion, or complex objections; Sentinel-flagged judgment calls; escalated contacts.</w:t>
+        <w:t xml:space="preserve">every live call; outreach to warm/personal intros before funnel entry; discovery calls (Scott); investor intro and post-PPM due diligence conversations; commercial demo/ROI walkthrough; proposal negotiation; any contract/legal/financial instrument; any conversation with frustration, confusion, or complex objections; Sentinel-flagged judgment calls; escalated contacts.</w:t>
       </w:r>
     </w:p>
     <w:p>
@@ -4719,7 +4719,7 @@
               <w:jc w:val="left"/>
             </w:pPr>
             <w:r>
-              <w:t xml:space="preserve">David</w:t>
+              <w:t xml:space="preserve">Scott</w:t>
             </w:r>
           </w:p>
         </w:tc>
@@ -4819,20 +4819,16 @@
               <w:jc w:val="left"/>
             </w:pPr>
             <w:r>
-              <w:t xml:space="preserve">David + Scott</w:t>
-            </w:r>
-          </w:p>
-        </w:tc>
-        <w:tc>
-          <w:tcPr/>
-          <w:p>
-            <w:pPr>
-              <w:pStyle w:val="Compact"/>
-              <w:jc w:val="left"/>
-            </w:pPr>
-            <w:r>
-              <w:t xml:space="preserve">15 min</w:t>
-            </w:r>
+              <w:t xml:space="preserve">Scott 15 min</w:t>
+            </w:r>
+          </w:p>
+        </w:tc>
+        <w:tc>
+          <w:tcPr/>
+          <w:p>
+            <w:pPr>
+              <w:pStyle w:val="Compact"/>
+            </w:pPr>
           </w:p>
         </w:tc>
       </w:tr>
@@ -4869,20 +4865,16 @@
               <w:jc w:val="left"/>
             </w:pPr>
             <w:r>
-              <w:t xml:space="preserve">David + Scott</w:t>
-            </w:r>
-          </w:p>
-        </w:tc>
-        <w:tc>
-          <w:tcPr/>
-          <w:p>
-            <w:pPr>
-              <w:pStyle w:val="Compact"/>
-              <w:jc w:val="left"/>
-            </w:pPr>
-            <w:r>
-              <w:t xml:space="preserve">20 min</w:t>
-            </w:r>
+              <w:t xml:space="preserve">Scott 20 min</w:t>
+            </w:r>
+          </w:p>
+        </w:tc>
+        <w:tc>
+          <w:tcPr/>
+          <w:p>
+            <w:pPr>
+              <w:pStyle w:val="Compact"/>
+            </w:pPr>
           </w:p>
         </w:tc>
       </w:tr>
@@ -5585,7 +5577,7 @@
               <w:jc w:val="left"/>
             </w:pPr>
             <w:r>
-              <w:t xml:space="preserve">David</w:t>
+              <w:t xml:space="preserve">Scott</w:t>
             </w:r>
           </w:p>
         </w:tc>
@@ -17195,6 +17187,240 @@
       </w:tblBorders>
     </w:tblPr>
   </w:style>
+  <w:style w:customStyle="1" w:styleId="SourceCode" w:type="paragraph">
+    <w:name w:val="Source Code"/>
+    <w:basedOn w:val="Normal"/>
+    <w:link w:val="VerbatimChar"/>
+    <w:pPr>
+      <w:wordWrap w:val="off"/>
+    </w:pPr>
+  </w:style>
+  <w:style w:customStyle="1" w:styleId="KeywordTok" w:type="character">
+    <w:name w:val="KeywordTok"/>
+    <w:basedOn w:val="VerbatimChar"/>
+    <w:rPr>
+      <w:b/>
+      <w:color w:val="007020"/>
+    </w:rPr>
+  </w:style>
+  <w:style w:customStyle="1" w:styleId="DataTypeTok" w:type="character">
+    <w:name w:val="DataTypeTok"/>
+    <w:basedOn w:val="VerbatimChar"/>
+    <w:rPr>
+      <w:color w:val="902000"/>
+    </w:rPr>
+  </w:style>
+  <w:style w:customStyle="1" w:styleId="DecValTok" w:type="character">
+    <w:name w:val="DecValTok"/>
+    <w:basedOn w:val="VerbatimChar"/>
+    <w:rPr>
+      <w:color w:val="40a070"/>
+    </w:rPr>
+  </w:style>
+  <w:style w:customStyle="1" w:styleId="BaseNTok" w:type="character">
+    <w:name w:val="BaseNTok"/>
+    <w:basedOn w:val="VerbatimChar"/>
+    <w:rPr>
+      <w:color w:val="40a070"/>
+    </w:rPr>
+  </w:style>
+  <w:style w:customStyle="1" w:styleId="FloatTok" w:type="character">
+    <w:name w:val="FloatTok"/>
+    <w:basedOn w:val="VerbatimChar"/>
+    <w:rPr>
+      <w:color w:val="40a070"/>
+    </w:rPr>
+  </w:style>
+  <w:style w:customStyle="1" w:styleId="ConstantTok" w:type="character">
+    <w:name w:val="ConstantTok"/>
+    <w:basedOn w:val="VerbatimChar"/>
+    <w:rPr>
+      <w:color w:val="880000"/>
+    </w:rPr>
+  </w:style>
+  <w:style w:customStyle="1" w:styleId="CharTok" w:type="character">
+    <w:name w:val="CharTok"/>
+    <w:basedOn w:val="VerbatimChar"/>
+    <w:rPr>
+      <w:color w:val="4070a0"/>
+    </w:rPr>
+  </w:style>
+  <w:style w:customStyle="1" w:styleId="SpecialCharTok" w:type="character">
+    <w:name w:val="SpecialCharTok"/>
+    <w:basedOn w:val="VerbatimChar"/>
+    <w:rPr>
+      <w:color w:val="4070a0"/>
+    </w:rPr>
+  </w:style>
+  <w:style w:customStyle="1" w:styleId="StringTok" w:type="character">
+    <w:name w:val="StringTok"/>
+    <w:basedOn w:val="VerbatimChar"/>
+    <w:rPr>
+      <w:color w:val="4070a0"/>
+    </w:rPr>
+  </w:style>
+  <w:style w:customStyle="1" w:styleId="VerbatimStringTok" w:type="character">
+    <w:name w:val="VerbatimStringTok"/>
+    <w:basedOn w:val="VerbatimChar"/>
+    <w:rPr>
+      <w:color w:val="4070a0"/>
+    </w:rPr>
+  </w:style>
+  <w:style w:customStyle="1" w:styleId="SpecialStringTok" w:type="character">
+    <w:name w:val="SpecialStringTok"/>
+    <w:basedOn w:val="VerbatimChar"/>
+    <w:rPr>
+      <w:color w:val="bb6688"/>
+    </w:rPr>
+  </w:style>
+  <w:style w:customStyle="1" w:styleId="ImportTok" w:type="character">
+    <w:name w:val="ImportTok"/>
+    <w:basedOn w:val="VerbatimChar"/>
+    <w:rPr>
+      <w:b/>
+      <w:color w:val="008000"/>
+    </w:rPr>
+  </w:style>
+  <w:style w:customStyle="1" w:styleId="CommentTok" w:type="character">
+    <w:name w:val="CommentTok"/>
+    <w:basedOn w:val="VerbatimChar"/>
+    <w:rPr>
+      <w:i/>
+      <w:color w:val="60a0b0"/>
+    </w:rPr>
+  </w:style>
+  <w:style w:customStyle="1" w:styleId="DocumentationTok" w:type="character">
+    <w:name w:val="DocumentationTok"/>
+    <w:basedOn w:val="VerbatimChar"/>
+    <w:rPr>
+      <w:i/>
+      <w:color w:val="ba2121"/>
+    </w:rPr>
+  </w:style>
+  <w:style w:customStyle="1" w:styleId="AnnotationTok" w:type="character">
+    <w:name w:val="AnnotationTok"/>
+    <w:basedOn w:val="VerbatimChar"/>
+    <w:rPr>
+      <w:b/>
+      <w:i/>
+      <w:color w:val="60a0b0"/>
+    </w:rPr>
+  </w:style>
+  <w:style w:customStyle="1" w:styleId="CommentVarTok" w:type="character">
+    <w:name w:val="CommentVarTok"/>
+    <w:basedOn w:val="VerbatimChar"/>
+    <w:rPr>
+      <w:b/>
+      <w:i/>
+      <w:color w:val="60a0b0"/>
+    </w:rPr>
+  </w:style>
+  <w:style w:customStyle="1" w:styleId="OtherTok" w:type="character">
+    <w:name w:val="OtherTok"/>
+    <w:basedOn w:val="VerbatimChar"/>
+    <w:rPr>
+      <w:color w:val="007020"/>
+    </w:rPr>
+  </w:style>
+  <w:style w:customStyle="1" w:styleId="FunctionTok" w:type="character">
+    <w:name w:val="FunctionTok"/>
+    <w:basedOn w:val="VerbatimChar"/>
+    <w:rPr>
+      <w:color w:val="06287e"/>
+    </w:rPr>
+  </w:style>
+  <w:style w:customStyle="1" w:styleId="VariableTok" w:type="character">
+    <w:name w:val="VariableTok"/>
+    <w:basedOn w:val="VerbatimChar"/>
+    <w:rPr>
+      <w:color w:val="19177c"/>
+    </w:rPr>
+  </w:style>
+  <w:style w:customStyle="1" w:styleId="ControlFlowTok" w:type="character">
+    <w:name w:val="ControlFlowTok"/>
+    <w:basedOn w:val="VerbatimChar"/>
+    <w:rPr>
+      <w:b/>
+      <w:color w:val="007020"/>
+    </w:rPr>
+  </w:style>
+  <w:style w:customStyle="1" w:styleId="OperatorTok" w:type="character">
+    <w:name w:val="OperatorTok"/>
+    <w:basedOn w:val="VerbatimChar"/>
+    <w:rPr>
+      <w:color w:val="666666"/>
+    </w:rPr>
+  </w:style>
+  <w:style w:customStyle="1" w:styleId="BuiltInTok" w:type="character">
+    <w:name w:val="BuiltInTok"/>
+    <w:basedOn w:val="VerbatimChar"/>
+    <w:rPr>
+      <w:color w:val="008000"/>
+    </w:rPr>
+  </w:style>
+  <w:style w:customStyle="1" w:styleId="ExtensionTok" w:type="character">
+    <w:name w:val="ExtensionTok"/>
+    <w:basedOn w:val="VerbatimChar"/>
+    <w:rPr/>
+  </w:style>
+  <w:style w:customStyle="1" w:styleId="PreprocessorTok" w:type="character">
+    <w:name w:val="PreprocessorTok"/>
+    <w:basedOn w:val="VerbatimChar"/>
+    <w:rPr>
+      <w:color w:val="bc7a00"/>
+    </w:rPr>
+  </w:style>
+  <w:style w:customStyle="1" w:styleId="AttributeTok" w:type="character">
+    <w:name w:val="AttributeTok"/>
+    <w:basedOn w:val="VerbatimChar"/>
+    <w:rPr>
+      <w:color w:val="7d9029"/>
+    </w:rPr>
+  </w:style>
+  <w:style w:customStyle="1" w:styleId="RegionMarkerTok" w:type="character">
+    <w:name w:val="RegionMarkerTok"/>
+    <w:basedOn w:val="VerbatimChar"/>
+    <w:rPr/>
+  </w:style>
+  <w:style w:customStyle="1" w:styleId="InformationTok" w:type="character">
+    <w:name w:val="InformationTok"/>
+    <w:basedOn w:val="VerbatimChar"/>
+    <w:rPr>
+      <w:b/>
+      <w:i/>
+      <w:color w:val="60a0b0"/>
+    </w:rPr>
+  </w:style>
+  <w:style w:customStyle="1" w:styleId="WarningTok" w:type="character">
+    <w:name w:val="WarningTok"/>
+    <w:basedOn w:val="VerbatimChar"/>
+    <w:rPr>
+      <w:b/>
+      <w:i/>
+      <w:color w:val="60a0b0"/>
+    </w:rPr>
+  </w:style>
+  <w:style w:customStyle="1" w:styleId="AlertTok" w:type="character">
+    <w:name w:val="AlertTok"/>
+    <w:basedOn w:val="VerbatimChar"/>
+    <w:rPr>
+      <w:b/>
+      <w:color w:val="ff0000"/>
+    </w:rPr>
+  </w:style>
+  <w:style w:customStyle="1" w:styleId="ErrorTok" w:type="character">
+    <w:name w:val="ErrorTok"/>
+    <w:basedOn w:val="VerbatimChar"/>
+    <w:rPr>
+      <w:b/>
+      <w:color w:val="ff0000"/>
+    </w:rPr>
+  </w:style>
+  <w:style w:customStyle="1" w:styleId="NormalTok" w:type="character">
+    <w:name w:val="NormalTok"/>
+    <w:basedOn w:val="VerbatimChar"/>
+    <w:rPr/>
+  </w:style>
   <w:style w:type="paragraph" w:customStyle="1" w:styleId="SourceCode">
     <w:name w:val="Source Code"/>
     <w:basedOn w:val="Normal"/>

</xml_diff>

<commit_message>
PPM attorney-approved: lift placeholder guardrail across KB, agent blocks, and guides
PPM approved by securities attorney. Removed the 'PPM is a placeholder until
approved' caveat in KB S12, the CFO/KB-Manager/Compliance-Gate agent blocks, the
Voice-Style skill, the email-template precondition, WIP-3, the Implementation
Guide, the Phase 2 guide, and the Handoff open-tasks. General 'investor materials
must be attorney-approved' rule kept intact.

Co-Authored-By: Claude Opus 4.8 <noreply@anthropic.com>
</commit_message>
<xml_diff>
--- a/Enyrgy_GHL_Implementation_Guide_v3_9.docx
+++ b/Enyrgy_GHL_Implementation_Guide_v3_9.docx
@@ -13081,7 +13081,7 @@
         <w:t xml:space="preserve"> </w:t>
       </w:r>
       <w:r>
-        <w:t xml:space="preserve">Templates loaded; voicemail recordings and commercial ROI PDF still needed; PPM pending attorney.</w:t>
+        <w:t xml:space="preserve">Templates loaded; voicemail recordings and commercial ROI PDF still needed; PPM attorney-approved.</w:t>
       </w:r>
       <w:r>
         <w:t xml:space="preserve"> </w:t>
@@ -17421,6 +17421,240 @@
     <w:basedOn w:val="VerbatimChar"/>
     <w:rPr/>
   </w:style>
+  <w:style w:customStyle="1" w:styleId="SourceCode" w:type="paragraph">
+    <w:name w:val="Source Code"/>
+    <w:basedOn w:val="Normal"/>
+    <w:link w:val="VerbatimChar"/>
+    <w:pPr>
+      <w:wordWrap w:val="off"/>
+    </w:pPr>
+  </w:style>
+  <w:style w:customStyle="1" w:styleId="KeywordTok" w:type="character">
+    <w:name w:val="KeywordTok"/>
+    <w:basedOn w:val="VerbatimChar"/>
+    <w:rPr>
+      <w:b/>
+      <w:color w:val="007020"/>
+    </w:rPr>
+  </w:style>
+  <w:style w:customStyle="1" w:styleId="DataTypeTok" w:type="character">
+    <w:name w:val="DataTypeTok"/>
+    <w:basedOn w:val="VerbatimChar"/>
+    <w:rPr>
+      <w:color w:val="902000"/>
+    </w:rPr>
+  </w:style>
+  <w:style w:customStyle="1" w:styleId="DecValTok" w:type="character">
+    <w:name w:val="DecValTok"/>
+    <w:basedOn w:val="VerbatimChar"/>
+    <w:rPr>
+      <w:color w:val="40a070"/>
+    </w:rPr>
+  </w:style>
+  <w:style w:customStyle="1" w:styleId="BaseNTok" w:type="character">
+    <w:name w:val="BaseNTok"/>
+    <w:basedOn w:val="VerbatimChar"/>
+    <w:rPr>
+      <w:color w:val="40a070"/>
+    </w:rPr>
+  </w:style>
+  <w:style w:customStyle="1" w:styleId="FloatTok" w:type="character">
+    <w:name w:val="FloatTok"/>
+    <w:basedOn w:val="VerbatimChar"/>
+    <w:rPr>
+      <w:color w:val="40a070"/>
+    </w:rPr>
+  </w:style>
+  <w:style w:customStyle="1" w:styleId="ConstantTok" w:type="character">
+    <w:name w:val="ConstantTok"/>
+    <w:basedOn w:val="VerbatimChar"/>
+    <w:rPr>
+      <w:color w:val="880000"/>
+    </w:rPr>
+  </w:style>
+  <w:style w:customStyle="1" w:styleId="CharTok" w:type="character">
+    <w:name w:val="CharTok"/>
+    <w:basedOn w:val="VerbatimChar"/>
+    <w:rPr>
+      <w:color w:val="4070a0"/>
+    </w:rPr>
+  </w:style>
+  <w:style w:customStyle="1" w:styleId="SpecialCharTok" w:type="character">
+    <w:name w:val="SpecialCharTok"/>
+    <w:basedOn w:val="VerbatimChar"/>
+    <w:rPr>
+      <w:color w:val="4070a0"/>
+    </w:rPr>
+  </w:style>
+  <w:style w:customStyle="1" w:styleId="StringTok" w:type="character">
+    <w:name w:val="StringTok"/>
+    <w:basedOn w:val="VerbatimChar"/>
+    <w:rPr>
+      <w:color w:val="4070a0"/>
+    </w:rPr>
+  </w:style>
+  <w:style w:customStyle="1" w:styleId="VerbatimStringTok" w:type="character">
+    <w:name w:val="VerbatimStringTok"/>
+    <w:basedOn w:val="VerbatimChar"/>
+    <w:rPr>
+      <w:color w:val="4070a0"/>
+    </w:rPr>
+  </w:style>
+  <w:style w:customStyle="1" w:styleId="SpecialStringTok" w:type="character">
+    <w:name w:val="SpecialStringTok"/>
+    <w:basedOn w:val="VerbatimChar"/>
+    <w:rPr>
+      <w:color w:val="bb6688"/>
+    </w:rPr>
+  </w:style>
+  <w:style w:customStyle="1" w:styleId="ImportTok" w:type="character">
+    <w:name w:val="ImportTok"/>
+    <w:basedOn w:val="VerbatimChar"/>
+    <w:rPr>
+      <w:b/>
+      <w:color w:val="008000"/>
+    </w:rPr>
+  </w:style>
+  <w:style w:customStyle="1" w:styleId="CommentTok" w:type="character">
+    <w:name w:val="CommentTok"/>
+    <w:basedOn w:val="VerbatimChar"/>
+    <w:rPr>
+      <w:i/>
+      <w:color w:val="60a0b0"/>
+    </w:rPr>
+  </w:style>
+  <w:style w:customStyle="1" w:styleId="DocumentationTok" w:type="character">
+    <w:name w:val="DocumentationTok"/>
+    <w:basedOn w:val="VerbatimChar"/>
+    <w:rPr>
+      <w:i/>
+      <w:color w:val="ba2121"/>
+    </w:rPr>
+  </w:style>
+  <w:style w:customStyle="1" w:styleId="AnnotationTok" w:type="character">
+    <w:name w:val="AnnotationTok"/>
+    <w:basedOn w:val="VerbatimChar"/>
+    <w:rPr>
+      <w:b/>
+      <w:i/>
+      <w:color w:val="60a0b0"/>
+    </w:rPr>
+  </w:style>
+  <w:style w:customStyle="1" w:styleId="CommentVarTok" w:type="character">
+    <w:name w:val="CommentVarTok"/>
+    <w:basedOn w:val="VerbatimChar"/>
+    <w:rPr>
+      <w:b/>
+      <w:i/>
+      <w:color w:val="60a0b0"/>
+    </w:rPr>
+  </w:style>
+  <w:style w:customStyle="1" w:styleId="OtherTok" w:type="character">
+    <w:name w:val="OtherTok"/>
+    <w:basedOn w:val="VerbatimChar"/>
+    <w:rPr>
+      <w:color w:val="007020"/>
+    </w:rPr>
+  </w:style>
+  <w:style w:customStyle="1" w:styleId="FunctionTok" w:type="character">
+    <w:name w:val="FunctionTok"/>
+    <w:basedOn w:val="VerbatimChar"/>
+    <w:rPr>
+      <w:color w:val="06287e"/>
+    </w:rPr>
+  </w:style>
+  <w:style w:customStyle="1" w:styleId="VariableTok" w:type="character">
+    <w:name w:val="VariableTok"/>
+    <w:basedOn w:val="VerbatimChar"/>
+    <w:rPr>
+      <w:color w:val="19177c"/>
+    </w:rPr>
+  </w:style>
+  <w:style w:customStyle="1" w:styleId="ControlFlowTok" w:type="character">
+    <w:name w:val="ControlFlowTok"/>
+    <w:basedOn w:val="VerbatimChar"/>
+    <w:rPr>
+      <w:b/>
+      <w:color w:val="007020"/>
+    </w:rPr>
+  </w:style>
+  <w:style w:customStyle="1" w:styleId="OperatorTok" w:type="character">
+    <w:name w:val="OperatorTok"/>
+    <w:basedOn w:val="VerbatimChar"/>
+    <w:rPr>
+      <w:color w:val="666666"/>
+    </w:rPr>
+  </w:style>
+  <w:style w:customStyle="1" w:styleId="BuiltInTok" w:type="character">
+    <w:name w:val="BuiltInTok"/>
+    <w:basedOn w:val="VerbatimChar"/>
+    <w:rPr>
+      <w:color w:val="008000"/>
+    </w:rPr>
+  </w:style>
+  <w:style w:customStyle="1" w:styleId="ExtensionTok" w:type="character">
+    <w:name w:val="ExtensionTok"/>
+    <w:basedOn w:val="VerbatimChar"/>
+    <w:rPr/>
+  </w:style>
+  <w:style w:customStyle="1" w:styleId="PreprocessorTok" w:type="character">
+    <w:name w:val="PreprocessorTok"/>
+    <w:basedOn w:val="VerbatimChar"/>
+    <w:rPr>
+      <w:color w:val="bc7a00"/>
+    </w:rPr>
+  </w:style>
+  <w:style w:customStyle="1" w:styleId="AttributeTok" w:type="character">
+    <w:name w:val="AttributeTok"/>
+    <w:basedOn w:val="VerbatimChar"/>
+    <w:rPr>
+      <w:color w:val="7d9029"/>
+    </w:rPr>
+  </w:style>
+  <w:style w:customStyle="1" w:styleId="RegionMarkerTok" w:type="character">
+    <w:name w:val="RegionMarkerTok"/>
+    <w:basedOn w:val="VerbatimChar"/>
+    <w:rPr/>
+  </w:style>
+  <w:style w:customStyle="1" w:styleId="InformationTok" w:type="character">
+    <w:name w:val="InformationTok"/>
+    <w:basedOn w:val="VerbatimChar"/>
+    <w:rPr>
+      <w:b/>
+      <w:i/>
+      <w:color w:val="60a0b0"/>
+    </w:rPr>
+  </w:style>
+  <w:style w:customStyle="1" w:styleId="WarningTok" w:type="character">
+    <w:name w:val="WarningTok"/>
+    <w:basedOn w:val="VerbatimChar"/>
+    <w:rPr>
+      <w:b/>
+      <w:i/>
+      <w:color w:val="60a0b0"/>
+    </w:rPr>
+  </w:style>
+  <w:style w:customStyle="1" w:styleId="AlertTok" w:type="character">
+    <w:name w:val="AlertTok"/>
+    <w:basedOn w:val="VerbatimChar"/>
+    <w:rPr>
+      <w:b/>
+      <w:color w:val="ff0000"/>
+    </w:rPr>
+  </w:style>
+  <w:style w:customStyle="1" w:styleId="ErrorTok" w:type="character">
+    <w:name w:val="ErrorTok"/>
+    <w:basedOn w:val="VerbatimChar"/>
+    <w:rPr>
+      <w:b/>
+      <w:color w:val="ff0000"/>
+    </w:rPr>
+  </w:style>
+  <w:style w:customStyle="1" w:styleId="NormalTok" w:type="character">
+    <w:name w:val="NormalTok"/>
+    <w:basedOn w:val="VerbatimChar"/>
+    <w:rPr/>
+  </w:style>
   <w:style w:type="paragraph" w:customStyle="1" w:styleId="SourceCode">
     <w:name w:val="Source Code"/>
     <w:basedOn w:val="Normal"/>

</xml_diff>

<commit_message>
Docs: regenerate .docx for Handoff, WIP, EA, IG + new TODO to match Session 15 .md updates
Co-Authored-By: Claude Opus 4.8 <noreply@anthropic.com>
</commit_message>
<xml_diff>
--- a/Enyrgy_GHL_Implementation_Guide_v3_9.docx
+++ b/Enyrgy_GHL_Implementation_Guide_v3_9.docx
@@ -95,7 +95,123 @@
         <w:pStyle w:val="BodyText"/>
       </w:pPr>
       <w:r>
-        <w:t xml:space="preserve">Last Updated: July 26, 2026 · Version 3.9.4</w:t>
+        <w:t xml:space="preserve">Last Updated: July 28, 2026 · Version 3.9.5</w:t>
+      </w:r>
+    </w:p>
+    <w:p>
+      <w:pPr>
+        <w:pStyle w:val="BodyText"/>
+      </w:pPr>
+      <w:r>
+        <w:rPr>
+          <w:b/>
+          <w:bCs/>
+        </w:rPr>
+        <w:t xml:space="preserve">v3.9.5 Changes (Session 15):</w:t>
+      </w:r>
+      <w:r>
+        <w:t xml:space="preserve"> </w:t>
+      </w:r>
+      <w:r>
+        <w:t xml:space="preserve">Paperclip is now operating, not just built. Heartbeats are staged and tuned (Sentinel 24h, Quality Control daily, Dispatcher 8h, Sales Outreach 1h, SDR 2h, KB Manager 30d; remaining agents staged behind a watch-cost gate; executives + Audit and Compliance + PRD Gatherer + Onboarding stay event-driven with timer OFF). Two operating rules added from the ENY-20 incident: (1)</w:t>
+      </w:r>
+      <w:r>
+        <w:t xml:space="preserve"> </w:t>
+      </w:r>
+      <w:r>
+        <w:rPr>
+          <w:b/>
+          <w:bCs/>
+        </w:rPr>
+        <w:t xml:space="preserve">Agents confabulate under credit starvation</w:t>
+      </w:r>
+      <w:r>
+        <w:t xml:space="preserve"> </w:t>
+      </w:r>
+      <w:r>
+        <w:t xml:space="preserve">— when credit-starved or budget-hard-stopped, the org produces confident, specific, FALSE claims (a QC audit and a COO</w:t>
+      </w:r>
+      <w:r>
+        <w:t xml:space="preserve"> </w:t>
+      </w:r>
+      <w:r>
+        <w:t xml:space="preserve">“live verification”</w:t>
+      </w:r>
+      <w:r>
+        <w:t xml:space="preserve"> </w:t>
+      </w:r>
+      <w:r>
+        <w:t xml:space="preserve">both reported a systemic lifecycle failure that did not exist). Verify every agent audit/verification against the live GHL account before acting; escalations are leads, not facts. (2)</w:t>
+      </w:r>
+      <w:r>
+        <w:t xml:space="preserve"> </w:t>
+      </w:r>
+      <w:r>
+        <w:rPr>
+          <w:b/>
+          <w:bCs/>
+        </w:rPr>
+        <w:t xml:space="preserve">Keep Anthropic credit buffered and Paperclip budgets with headroom</w:t>
+      </w:r>
+      <w:r>
+        <w:t xml:space="preserve"> </w:t>
+      </w:r>
+      <w:r>
+        <w:t xml:space="preserve">— starvation multiplies cost (dying runs re-wake and replay a growing thread) and is the trigger for confabulation. Open platform bug: a run that dies on a credit/budget error must go to</w:t>
+      </w:r>
+      <w:r>
+        <w:t xml:space="preserve"> </w:t>
+      </w:r>
+      <w:r>
+        <w:rPr>
+          <w:rStyle w:val="VerbatimChar"/>
+        </w:rPr>
+        <w:t xml:space="preserve">blocked</w:t>
+      </w:r>
+      <w:r>
+        <w:t xml:space="preserve">, never</w:t>
+      </w:r>
+      <w:r>
+        <w:t xml:space="preserve"> </w:t>
+      </w:r>
+      <w:r>
+        <w:rPr>
+          <w:rStyle w:val="VerbatimChar"/>
+        </w:rPr>
+        <w:t xml:space="preserve">done</w:t>
+      </w:r>
+      <w:r>
+        <w:t xml:space="preserve"> </w:t>
+      </w:r>
+      <w:r>
+        <w:t xml:space="preserve">(it was auto-flipping to</w:t>
+      </w:r>
+      <w:r>
+        <w:t xml:space="preserve"> </w:t>
+      </w:r>
+      <w:r>
+        <w:rPr>
+          <w:rStyle w:val="VerbatimChar"/>
+        </w:rPr>
+        <w:t xml:space="preserve">done</w:t>
+      </w:r>
+      <w:r>
+        <w:t xml:space="preserve"> </w:t>
+      </w:r>
+      <w:r>
+        <w:t xml:space="preserve">with no work, masking the item). Consolidated open items now live in</w:t>
+      </w:r>
+      <w:r>
+        <w:t xml:space="preserve"> </w:t>
+      </w:r>
+      <w:r>
+        <w:rPr>
+          <w:rStyle w:val="VerbatimChar"/>
+        </w:rPr>
+        <w:t xml:space="preserve">Enyrgy_Master_TODO.md</w:t>
+      </w:r>
+      <w:r>
+        <w:t xml:space="preserve">.</w:t>
       </w:r>
     </w:p>
     <w:p>
@@ -1162,7 +1278,7 @@
         <w:t xml:space="preserve">Landing-Page Deploy Recipe 46</w:t>
       </w:r>
     </w:p>
-    <w:bookmarkStart w:id="21" w:name="X903a202284d525ce488a2bb7897e84a177c088d"/>
+    <w:bookmarkStart w:id="13" w:name="X903a202284d525ce488a2bb7897e84a177c088d"/>
     <w:p>
       <w:pPr>
         <w:pStyle w:val="Heading1"/>
@@ -1171,7 +1287,7 @@
         <w:t xml:space="preserve">SECTION 1: ENYRGY COMPANY CONTEXT &amp; UPDATED FACTS</w:t>
       </w:r>
     </w:p>
-    <w:bookmarkStart w:id="17" w:name="enyrgy-at-a-glance"/>
+    <w:bookmarkStart w:id="9" w:name="enyrgy-at-a-glance"/>
     <w:p>
       <w:pPr>
         <w:pStyle w:val="Heading2"/>
@@ -1188,8 +1304,8 @@
         <w:t xml:space="preserve">Enyrgy is a health-technology company that has developed the world’s first intelligent precision phototherapy platform, the Enyrgy Vitamin D Primal Light Platform. The mission: restore the body’s natural ability to respond to sunlight with precision, safety, and measurable benefit.</w:t>
       </w:r>
     </w:p>
-    <w:bookmarkEnd w:id="17"/>
-    <w:bookmarkStart w:id="18" w:name="updated-company-metrics"/>
+    <w:bookmarkEnd w:id="9"/>
+    <w:bookmarkStart w:id="10" w:name="updated-company-metrics"/>
     <w:p>
       <w:pPr>
         <w:pStyle w:val="Heading2"/>
@@ -1636,8 +1752,8 @@
         </w:tc>
       </w:tr>
     </w:tbl>
-    <w:bookmarkEnd w:id="18"/>
-    <w:bookmarkStart w:id="19" w:name="the-primal-light-platform-triple-pathway"/>
+    <w:bookmarkEnd w:id="10"/>
+    <w:bookmarkStart w:id="11" w:name="the-primal-light-platform-triple-pathway"/>
     <w:p>
       <w:pPr>
         <w:pStyle w:val="Heading2"/>
@@ -1718,8 +1834,8 @@
         <w:t xml:space="preserve">No other solution delivers all three simultaneously. Supplements = Vitamin D only. Sunlight = 60x more time + cancer risk. Red light = different mechanism entirely (90% of Enyrgy customers use both). Enyrgy is a new category.</w:t>
       </w:r>
     </w:p>
-    <w:bookmarkEnd w:id="19"/>
-    <w:bookmarkStart w:id="20" w:name="revenue-streams-pricing"/>
+    <w:bookmarkEnd w:id="11"/>
+    <w:bookmarkStart w:id="12" w:name="revenue-streams-pricing"/>
     <w:p>
       <w:pPr>
         <w:pStyle w:val="Heading2"/>
@@ -2011,9 +2127,9 @@
         </w:tc>
       </w:tr>
     </w:tbl>
-    <w:bookmarkEnd w:id="20"/>
-    <w:bookmarkEnd w:id="21"/>
-    <w:bookmarkStart w:id="27" w:name="X8b291bc1562de733447dfbc535b382740163587"/>
+    <w:bookmarkEnd w:id="12"/>
+    <w:bookmarkEnd w:id="13"/>
+    <w:bookmarkStart w:id="19" w:name="X8b291bc1562de733447dfbc535b382740163587"/>
     <w:p>
       <w:pPr>
         <w:pStyle w:val="Heading1"/>
@@ -2022,7 +2138,7 @@
         <w:t xml:space="preserve">SECTION 2: AUTOMATION ARCHITECTURE: PAPERCLIP AGENT SYSTEM + HUMAN IN THE LOOP (HITL)</w:t>
       </w:r>
     </w:p>
-    <w:bookmarkStart w:id="22" w:name="Xdf30dccaf5aa0188cc920d15a267cfbdac2c3d4"/>
+    <w:bookmarkStart w:id="14" w:name="Xdf30dccaf5aa0188cc920d15a267cfbdac2c3d4"/>
     <w:p>
       <w:pPr>
         <w:pStyle w:val="Heading2"/>
@@ -2039,8 +2155,8 @@
         <w:t xml:space="preserve">The dividing line is a rule: agents do anything that benefits from speed, consistency, and scale. Humans do anything that benefits from judgment, trust, and authority. The moment a prospect signals real intent, booking a call, replying with a real question, committing capital, they become a human conversation. Everything before and after that moment is agent territory.</w:t>
       </w:r>
     </w:p>
-    <w:bookmarkEnd w:id="22"/>
-    <w:bookmarkStart w:id="23" w:name="consumer-and-commercial-funnels"/>
+    <w:bookmarkEnd w:id="14"/>
+    <w:bookmarkStart w:id="15" w:name="consumer-and-commercial-funnels"/>
     <w:p>
       <w:pPr>
         <w:pStyle w:val="Heading2"/>
@@ -2139,8 +2255,8 @@
         <w:t xml:space="preserve">WF-05 triggers the SDR agent to send the personalized proposal same day. The agent owns the next 12 days (Day 2 SMS, Day 5 objection email, Day 8 first-90-days email, Day 12 human-call flag). If they order before Day 12, WF-06 fires on unit_shipped.</w:t>
       </w:r>
     </w:p>
-    <w:bookmarkEnd w:id="23"/>
-    <w:bookmarkStart w:id="24" w:name="investor-funnel"/>
+    <w:bookmarkEnd w:id="15"/>
+    <w:bookmarkStart w:id="16" w:name="investor-funnel"/>
     <w:p>
       <w:pPr>
         <w:pStyle w:val="Heading2"/>
@@ -2265,8 +2381,8 @@
         <w:t xml:space="preserve">Subscription agreement, promissory note, KYC/AML, wire, all human. On investment_funded, the contact moves to Active Investor and CSM takes over the ongoing relationship.</w:t>
       </w:r>
     </w:p>
-    <w:bookmarkEnd w:id="24"/>
-    <w:bookmarkStart w:id="25" w:name="the-hitl-framework"/>
+    <w:bookmarkEnd w:id="16"/>
+    <w:bookmarkStart w:id="17" w:name="the-hitl-framework"/>
     <w:p>
       <w:pPr>
         <w:pStyle w:val="Heading2"/>
@@ -2329,8 +2445,8 @@
         <w:t xml:space="preserve">when a contact crosses into live human conversation, apply drip_bypass so the agent does not send another automated email while a personal dialogue is active.</w:t>
       </w:r>
     </w:p>
-    <w:bookmarkEnd w:id="25"/>
-    <w:bookmarkStart w:id="26" w:name="practical-daily-operating-rhythm"/>
+    <w:bookmarkEnd w:id="17"/>
+    <w:bookmarkStart w:id="18" w:name="practical-daily-operating-rhythm"/>
     <w:p>
       <w:pPr>
         <w:pStyle w:val="Heading2"/>
@@ -2423,9 +2539,9 @@
         <w:t xml:space="preserve">WF-10 fires; review new partner prospects before drip enrollment.</w:t>
       </w:r>
     </w:p>
-    <w:bookmarkEnd w:id="26"/>
-    <w:bookmarkEnd w:id="27"/>
-    <w:bookmarkStart w:id="35" w:name="section-3-paperclip-ai-agent-org-chart"/>
+    <w:bookmarkEnd w:id="18"/>
+    <w:bookmarkEnd w:id="19"/>
+    <w:bookmarkStart w:id="27" w:name="section-3-paperclip-ai-agent-org-chart"/>
     <w:p>
       <w:pPr>
         <w:pStyle w:val="Heading1"/>
@@ -2442,7 +2558,7 @@
         <w:t xml:space="preserve">Lead enters GHL -&gt; Dispatcher identifies funnel type -&gt; correct drip auto-enrolls -&gt; GHL sends each scheduled touch, agents handle replies and exceptions -&gt; lead score updates after each interaction -&gt; at threshold, SDR books discovery call -&gt; human closes. No engagement after full sequence -&gt; WF-08 re-enrolls for reactivation after 60-day pause.</w:t>
       </w:r>
     </w:p>
-    <w:bookmarkStart w:id="28" w:name="c-suite-layer-3-agents"/>
+    <w:bookmarkStart w:id="20" w:name="c-suite-layer-3-agents"/>
     <w:p>
       <w:pPr>
         <w:pStyle w:val="Heading2"/>
@@ -2684,8 +2800,8 @@
         </w:tc>
       </w:tr>
     </w:tbl>
-    <w:bookmarkEnd w:id="28"/>
-    <w:bookmarkStart w:id="29" w:name="coo-division-7-agents"/>
+    <w:bookmarkEnd w:id="20"/>
+    <w:bookmarkStart w:id="21" w:name="coo-division-7-agents"/>
     <w:p>
       <w:pPr>
         <w:pStyle w:val="Heading2"/>
@@ -3026,8 +3142,8 @@
         </w:tc>
       </w:tr>
     </w:tbl>
-    <w:bookmarkEnd w:id="29"/>
-    <w:bookmarkStart w:id="30" w:name="cro-division-6-agents"/>
+    <w:bookmarkEnd w:id="21"/>
+    <w:bookmarkStart w:id="22" w:name="cro-division-6-agents"/>
     <w:p>
       <w:pPr>
         <w:pStyle w:val="Heading2"/>
@@ -3330,8 +3446,8 @@
         </w:tc>
       </w:tr>
     </w:tbl>
-    <w:bookmarkEnd w:id="30"/>
-    <w:bookmarkStart w:id="31" w:name="agent-to-workflow-mapping"/>
+    <w:bookmarkEnd w:id="22"/>
+    <w:bookmarkStart w:id="23" w:name="agent-to-workflow-mapping"/>
     <w:p>
       <w:pPr>
         <w:pStyle w:val="Heading2"/>
@@ -3786,8 +3902,8 @@
         </w:tc>
       </w:tr>
     </w:tbl>
-    <w:bookmarkEnd w:id="31"/>
-    <w:bookmarkStart w:id="32" w:name="compliance-gate-non-negotiable-rules"/>
+    <w:bookmarkEnd w:id="23"/>
+    <w:bookmarkStart w:id="24" w:name="compliance-gate-non-negotiable-rules"/>
     <w:p>
       <w:pPr>
         <w:pStyle w:val="Heading2"/>
@@ -3880,8 +3996,8 @@
         <w:t xml:space="preserve">all investor materials approved before loading into GHL.</w:t>
       </w:r>
     </w:p>
-    <w:bookmarkEnd w:id="32"/>
-    <w:bookmarkStart w:id="33" w:name="phase-2-recommended-agent-additions"/>
+    <w:bookmarkEnd w:id="24"/>
+    <w:bookmarkStart w:id="25" w:name="phase-2-recommended-agent-additions"/>
     <w:p>
       <w:pPr>
         <w:pStyle w:val="Heading2"/>
@@ -3898,8 +4014,8 @@
         <w:t xml:space="preserve">Reporting Agent (HIGH), Proposal Writer (HIGH), OEM Pipeline Agent (HIGH), Podcast Attribution Agent (MEDIUM), Clinical Concierge (MEDIUM), Billing Agent (MEDIUM).</w:t>
       </w:r>
     </w:p>
-    <w:bookmarkEnd w:id="33"/>
-    <w:bookmarkStart w:id="34" w:name="Xc2f99f9bd9420e4da2d5f0ff310a3de23f854a9"/>
+    <w:bookmarkEnd w:id="25"/>
+    <w:bookmarkStart w:id="26" w:name="Xc2f99f9bd9420e4da2d5f0ff310a3de23f854a9"/>
     <w:p>
       <w:pPr>
         <w:pStyle w:val="Heading2"/>
@@ -3926,9 +4042,9 @@
         <w:t xml:space="preserve">ATTORNEY CONFIRMED: PPM may be sent after intro meeting without accreditation. Accreditation required before accepting investment. Not before PPM.</w:t>
       </w:r>
     </w:p>
-    <w:bookmarkEnd w:id="34"/>
-    <w:bookmarkEnd w:id="35"/>
-    <w:bookmarkStart w:id="36" w:name="section-4-five-funnel-types-in-ghl"/>
+    <w:bookmarkEnd w:id="26"/>
+    <w:bookmarkEnd w:id="27"/>
+    <w:bookmarkStart w:id="28" w:name="section-4-five-funnel-types-in-ghl"/>
     <w:p>
       <w:pPr>
         <w:pStyle w:val="Heading1"/>
@@ -4278,8 +4394,8 @@
         </w:tc>
       </w:tr>
     </w:tbl>
-    <w:bookmarkEnd w:id="36"/>
-    <w:bookmarkStart w:id="39" w:name="section-5-ghl-account-structure"/>
+    <w:bookmarkEnd w:id="28"/>
+    <w:bookmarkStart w:id="31" w:name="section-5-ghl-account-structure"/>
     <w:p>
       <w:pPr>
         <w:pStyle w:val="Heading1"/>
@@ -4288,7 +4404,7 @@
         <w:t xml:space="preserve">SECTION 5: GHL ACCOUNT STRUCTURE</w:t>
       </w:r>
     </w:p>
-    <w:bookmarkStart w:id="37" w:name="key-urls"/>
+    <w:bookmarkStart w:id="29" w:name="key-urls"/>
     <w:p>
       <w:pPr>
         <w:pStyle w:val="Heading2"/>
@@ -4528,8 +4644,8 @@
         </w:tc>
       </w:tr>
     </w:tbl>
-    <w:bookmarkEnd w:id="37"/>
-    <w:bookmarkStart w:id="38" w:name="phone-system"/>
+    <w:bookmarkEnd w:id="29"/>
+    <w:bookmarkStart w:id="30" w:name="phone-system"/>
     <w:p>
       <w:pPr>
         <w:pStyle w:val="Heading2"/>
@@ -4593,9 +4709,9 @@
         <w:t xml:space="preserve">SHAKEN/STIR: Approved &amp; Verified</w:t>
       </w:r>
     </w:p>
-    <w:bookmarkEnd w:id="38"/>
-    <w:bookmarkEnd w:id="39"/>
-    <w:bookmarkStart w:id="40" w:name="section-6-calendar-reference"/>
+    <w:bookmarkEnd w:id="30"/>
+    <w:bookmarkEnd w:id="31"/>
+    <w:bookmarkStart w:id="32" w:name="section-6-calendar-reference"/>
     <w:p>
       <w:pPr>
         <w:pStyle w:val="Heading1"/>
@@ -4979,8 +5095,8 @@
         </w:tc>
       </w:tr>
     </w:tbl>
-    <w:bookmarkEnd w:id="40"/>
-    <w:bookmarkStart w:id="42" w:name="section-7-team-reference"/>
+    <w:bookmarkEnd w:id="32"/>
+    <w:bookmarkStart w:id="34" w:name="section-7-team-reference"/>
     <w:p>
       <w:pPr>
         <w:pStyle w:val="Heading1"/>
@@ -5406,7 +5522,7 @@
         </w:tc>
       </w:tr>
     </w:tbl>
-    <w:bookmarkStart w:id="41" w:name="funnel-ownership"/>
+    <w:bookmarkStart w:id="33" w:name="funnel-ownership"/>
     <w:p>
       <w:pPr>
         <w:pStyle w:val="Heading2"/>
@@ -5747,9 +5863,9 @@
         </w:tc>
       </w:tr>
     </w:tbl>
-    <w:bookmarkEnd w:id="41"/>
-    <w:bookmarkEnd w:id="42"/>
-    <w:bookmarkStart w:id="50" w:name="section-8-ghl-contact-fields"/>
+    <w:bookmarkEnd w:id="33"/>
+    <w:bookmarkEnd w:id="34"/>
+    <w:bookmarkStart w:id="42" w:name="section-8-ghl-contact-fields"/>
     <w:p>
       <w:pPr>
         <w:pStyle w:val="Heading1"/>
@@ -5758,7 +5874,7 @@
         <w:t xml:space="preserve">SECTION 8: GHL CONTACT FIELDS</w:t>
       </w:r>
     </w:p>
-    <w:bookmarkStart w:id="43" w:name="folder-structure"/>
+    <w:bookmarkStart w:id="35" w:name="folder-structure"/>
     <w:p>
       <w:pPr>
         <w:pStyle w:val="Heading2"/>
@@ -5972,8 +6088,8 @@
         </w:tc>
       </w:tr>
     </w:tbl>
-    <w:bookmarkEnd w:id="43"/>
-    <w:bookmarkStart w:id="44" w:name="universal-fields"/>
+    <w:bookmarkEnd w:id="35"/>
+    <w:bookmarkStart w:id="36" w:name="universal-fields"/>
     <w:p>
       <w:pPr>
         <w:pStyle w:val="Heading2"/>
@@ -5990,8 +6106,8 @@
         <w:t xml:space="preserve">Client Type (dropdown), Funnel Stage (dropdown), Assigned Agent (text), Last Agent Touch (date, Sentinel monitors &gt;5 days), Lead Score (0-100 auto), Qualification Status (dropdown), Communication Preference (dropdown), Compliance Reviewed (dropdown), How Heard Specific (text), Referral Source Contact ID (text).</w:t>
       </w:r>
     </w:p>
-    <w:bookmarkEnd w:id="44"/>
-    <w:bookmarkStart w:id="45" w:name="consumer-fields"/>
+    <w:bookmarkEnd w:id="36"/>
+    <w:bookmarkStart w:id="37" w:name="consumer-fields"/>
     <w:p>
       <w:pPr>
         <w:pStyle w:val="Heading2"/>
@@ -6008,8 +6124,8 @@
         <w:t xml:space="preserve">Vitamin D Deficient Self Reported, Current Solution, Health Goal, Skin Type Fitzpatrick (I-VI), Finance Preference (Cash/Financing/Installment/Rent/Not Sure), Use Case, How Heard Podcast, Unit Order Date, Unit Ship Date, Sessions Completed, Time Using Enyrgy, Results Noticed, Would Recommend, Marketing Permission.</w:t>
       </w:r>
     </w:p>
-    <w:bookmarkEnd w:id="45"/>
-    <w:bookmarkStart w:id="46" w:name="commercial-fields"/>
+    <w:bookmarkEnd w:id="37"/>
+    <w:bookmarkStart w:id="38" w:name="commercial-fields"/>
     <w:p>
       <w:pPr>
         <w:pStyle w:val="Heading2"/>
@@ -6026,8 +6142,8 @@
         <w:t xml:space="preserve">Business Type, Number of Locations, Current Wellness Offerings, Decision Maker Name, Estimated Units Needed, Estimated Deal Value, Has Seen Demo, ROI Model Sent.</w:t>
       </w:r>
     </w:p>
-    <w:bookmarkEnd w:id="46"/>
-    <w:bookmarkStart w:id="47" w:name="investor-fields"/>
+    <w:bookmarkEnd w:id="38"/>
+    <w:bookmarkStart w:id="39" w:name="investor-fields"/>
     <w:p>
       <w:pPr>
         <w:pStyle w:val="Heading2"/>
@@ -6044,8 +6160,8 @@
         <w:t xml:space="preserve">Investor Type, Accredited Verified (COMPLIANCE GATE), Minimum Investment Amount, Investment Structure Preference (Debt/Equity/Convertible/SAFE/Not Sure), Target Return, Has Received PPM, Investment Timeline, Amount Committed, Amount Funded.</w:t>
       </w:r>
     </w:p>
-    <w:bookmarkEnd w:id="47"/>
-    <w:bookmarkStart w:id="48" w:name="partner-fields"/>
+    <w:bookmarkEnd w:id="39"/>
+    <w:bookmarkStart w:id="40" w:name="partner-fields"/>
     <w:p>
       <w:pPr>
         <w:pStyle w:val="Heading2"/>
@@ -6062,8 +6178,8 @@
         <w:t xml:space="preserve">Partnership Model, Partnership Status, Distribution Reach, Territory, NDA Signed, LOI Signed, Contract Expiry, Monthly Units Capacity.</w:t>
       </w:r>
     </w:p>
-    <w:bookmarkEnd w:id="48"/>
-    <w:bookmarkStart w:id="49" w:name="vendor-fields"/>
+    <w:bookmarkEnd w:id="40"/>
+    <w:bookmarkStart w:id="41" w:name="vendor-fields"/>
     <w:p>
       <w:pPr>
         <w:pStyle w:val="Heading2"/>
@@ -6080,9 +6196,9 @@
         <w:t xml:space="preserve">Vendor Category, Vendor Status, Contract On File, Vendor Contract Expiry, Monthly Spend, Primary Contact Name, Vendor Notes.</w:t>
       </w:r>
     </w:p>
-    <w:bookmarkEnd w:id="49"/>
-    <w:bookmarkEnd w:id="50"/>
-    <w:bookmarkStart w:id="51" w:name="section-9-tag-taxonomy"/>
+    <w:bookmarkEnd w:id="41"/>
+    <w:bookmarkEnd w:id="42"/>
+    <w:bookmarkStart w:id="43" w:name="section-9-tag-taxonomy"/>
     <w:p>
       <w:pPr>
         <w:pStyle w:val="Heading1"/>
@@ -6298,8 +6414,8 @@
         <w:t xml:space="preserve">drip_bypass</w:t>
       </w:r>
     </w:p>
-    <w:bookmarkEnd w:id="51"/>
-    <w:bookmarkStart w:id="52" w:name="section-10-pipelines"/>
+    <w:bookmarkEnd w:id="43"/>
+    <w:bookmarkStart w:id="44" w:name="section-10-pipelines"/>
     <w:p>
       <w:pPr>
         <w:pStyle w:val="Heading1"/>
@@ -6487,8 +6603,8 @@
         </w:tc>
       </w:tr>
     </w:tbl>
-    <w:bookmarkEnd w:id="52"/>
-    <w:bookmarkStart w:id="58" w:name="section-11-drip-campaigns"/>
+    <w:bookmarkEnd w:id="44"/>
+    <w:bookmarkStart w:id="50" w:name="section-11-drip-campaigns"/>
     <w:p>
       <w:pPr>
         <w:pStyle w:val="Heading1"/>
@@ -6497,7 +6613,7 @@
         <w:t xml:space="preserve">SECTION 11: DRIP CAMPAIGNS</w:t>
       </w:r>
     </w:p>
-    <w:bookmarkStart w:id="53" w:name="campaign-overview"/>
+    <w:bookmarkStart w:id="45" w:name="campaign-overview"/>
     <w:p>
       <w:pPr>
         <w:pStyle w:val="Heading2"/>
@@ -6916,8 +7032,8 @@
         </w:tc>
       </w:tr>
     </w:tbl>
-    <w:bookmarkEnd w:id="53"/>
-    <w:bookmarkStart w:id="54" w:name="bypass-logic"/>
+    <w:bookmarkEnd w:id="45"/>
+    <w:bookmarkStart w:id="46" w:name="bypass-logic"/>
     <w:p>
       <w:pPr>
         <w:pStyle w:val="Heading2"/>
@@ -6969,8 +7085,8 @@
         <w:t xml:space="preserve">Consumer lead-magnet capture workflows apply magnet_lead + drip_bypass to route leads into purpose-built series and suppress the general Consumer Drip.</w:t>
       </w:r>
     </w:p>
-    <w:bookmarkEnd w:id="54"/>
-    <w:bookmarkStart w:id="55" w:name="consumer-drip-gating-new-in-v3.7"/>
+    <w:bookmarkEnd w:id="46"/>
+    <w:bookmarkStart w:id="47" w:name="consumer-drip-gating-new-in-v3.7"/>
     <w:p>
       <w:pPr>
         <w:pStyle w:val="Heading2"/>
@@ -6996,8 +7112,8 @@
         <w:t xml:space="preserve">: contacts whose tags do NOT include drip_bypass run all 12 touches; contacts with drip_bypass are routed to END. This prevents the collision where magnet leads received both their purpose-built series and the general drip. The Consumer Drip’s correct role is now general consumer leads who did NOT enter through a lead magnet.</w:t>
       </w:r>
     </w:p>
-    <w:bookmarkEnd w:id="55"/>
-    <w:bookmarkStart w:id="56" w:name="consumer-drip-12-touch-sequence"/>
+    <w:bookmarkEnd w:id="47"/>
+    <w:bookmarkStart w:id="48" w:name="consumer-drip-12-touch-sequence"/>
     <w:p>
       <w:pPr>
         <w:pStyle w:val="Heading2"/>
@@ -7689,8 +7805,8 @@
         </w:tc>
       </w:tr>
     </w:tbl>
-    <w:bookmarkEnd w:id="56"/>
-    <w:bookmarkStart w:id="57" w:name="investor-drip-8-touch-sequence"/>
+    <w:bookmarkEnd w:id="48"/>
+    <w:bookmarkStart w:id="49" w:name="investor-drip-8-touch-sequence"/>
     <w:p>
       <w:pPr>
         <w:pStyle w:val="Heading2"/>
@@ -8190,9 +8306,9 @@
         <w:t xml:space="preserve">ATTORNEY CONFIRMED: Touch 7 PPM fires after intro meeting is marked complete. No accreditation gate on PPM delivery. Accreditation form is sent when investor signals intent to commit (Stage 5). Per Enyrgy’s securities attorney.</w:t>
       </w:r>
     </w:p>
-    <w:bookmarkEnd w:id="57"/>
-    <w:bookmarkEnd w:id="58"/>
-    <w:bookmarkStart w:id="64" w:name="section-12-core-workflows"/>
+    <w:bookmarkEnd w:id="49"/>
+    <w:bookmarkEnd w:id="50"/>
+    <w:bookmarkStart w:id="56" w:name="section-12-core-workflows"/>
     <w:p>
       <w:pPr>
         <w:pStyle w:val="Heading1"/>
@@ -8201,7 +8317,7 @@
         <w:t xml:space="preserve">SECTION 12: CORE WORKFLOWS</w:t>
       </w:r>
     </w:p>
-    <w:bookmarkStart w:id="59" w:name="wf-01-through-wf-10"/>
+    <w:bookmarkStart w:id="51" w:name="wf-01-through-wf-10"/>
     <w:p>
       <w:pPr>
         <w:pStyle w:val="Heading2"/>
@@ -8815,8 +8931,8 @@
         </w:tc>
       </w:tr>
     </w:tbl>
-    <w:bookmarkEnd w:id="59"/>
-    <w:bookmarkStart w:id="60" w:name="X5bc6bf71dba644c700ee4f719d5b4f05d19bbd5"/>
+    <w:bookmarkEnd w:id="51"/>
+    <w:bookmarkStart w:id="52" w:name="X5bc6bf71dba644c700ee4f719d5b4f05d19bbd5"/>
     <w:p>
       <w:pPr>
         <w:pStyle w:val="Heading2"/>
@@ -9420,8 +9536,8 @@
         </w:tc>
       </w:tr>
     </w:tbl>
-    <w:bookmarkEnd w:id="60"/>
-    <w:bookmarkStart w:id="61" w:name="X8b635a9b8e26577bc07542dc589df6fb2ab55bd"/>
+    <w:bookmarkEnd w:id="52"/>
+    <w:bookmarkStart w:id="53" w:name="X8b635a9b8e26577bc07542dc589df6fb2ab55bd"/>
     <w:p>
       <w:pPr>
         <w:pStyle w:val="Heading2"/>
@@ -9968,8 +10084,8 @@
         <w:t xml:space="preserve">(feeds WF-06 onboarding), and the abandoned-checkout webhook (developer).</w:t>
       </w:r>
     </w:p>
-    <w:bookmarkEnd w:id="61"/>
-    <w:bookmarkStart w:id="62" w:name="X2641a18717343a2a2c6fd2506cd768d5e543fc6"/>
+    <w:bookmarkEnd w:id="53"/>
+    <w:bookmarkStart w:id="54" w:name="X2641a18717343a2a2c6fd2506cd768d5e543fc6"/>
     <w:p>
       <w:pPr>
         <w:pStyle w:val="Heading2"/>
@@ -10191,8 +10307,8 @@
         <w:t xml:space="preserve">condition, the bypass gate is a first-step If/Else inside the Consumer Drip, WF-02, and WF-04. Full detail in Section 24.</w:t>
       </w:r>
     </w:p>
-    <w:bookmarkEnd w:id="62"/>
-    <w:bookmarkStart w:id="63" w:name="lead-scoring-model"/>
+    <w:bookmarkEnd w:id="54"/>
+    <w:bookmarkStart w:id="55" w:name="lead-scoring-model"/>
     <w:p>
       <w:pPr>
         <w:pStyle w:val="Heading2"/>
@@ -10209,9 +10325,9 @@
         <w:t xml:space="preserve">Email Opened +6 · Appointment Confirmed +21 · Contact Reply +11 · Appointment Booked +21.</w:t>
       </w:r>
     </w:p>
-    <w:bookmarkEnd w:id="63"/>
-    <w:bookmarkEnd w:id="64"/>
-    <w:bookmarkStart w:id="65" w:name="X0c20422ed8ac108c0bc9dd737a232b220bacd70"/>
+    <w:bookmarkEnd w:id="55"/>
+    <w:bookmarkEnd w:id="56"/>
+    <w:bookmarkStart w:id="57" w:name="X0c20422ed8ac108c0bc9dd737a232b220bacd70"/>
     <w:p>
       <w:pPr>
         <w:pStyle w:val="Heading1"/>
@@ -10469,8 +10585,8 @@
         <w:t xml:space="preserve">the domain is in reputation warmup. Consumer opt-ins one at a time are a healthy warmup pattern. Do NOT bulk-send to the 600+ existing customer list from this domain on day one, ramp gradually.</w:t>
       </w:r>
     </w:p>
-    <w:bookmarkEnd w:id="65"/>
-    <w:bookmarkStart w:id="71" w:name="section-14-content-rules-updated-in-v3.7"/>
+    <w:bookmarkEnd w:id="57"/>
+    <w:bookmarkStart w:id="63" w:name="section-14-content-rules-updated-in-v3.7"/>
     <w:p>
       <w:pPr>
         <w:pStyle w:val="Heading1"/>
@@ -10479,7 +10595,7 @@
         <w:t xml:space="preserve">SECTION 14: CONTENT RULES (UPDATED in v3.7)</w:t>
       </w:r>
     </w:p>
-    <w:bookmarkStart w:id="66" w:name="X5efa0766421bd09f1227051e34376c42a99a8cb"/>
+    <w:bookmarkStart w:id="58" w:name="X5efa0766421bd09f1227051e34376c42a99a8cb"/>
     <w:p>
       <w:pPr>
         <w:pStyle w:val="Heading2"/>
@@ -10602,8 +10718,8 @@
         <w:t xml:space="preserve">match the skill to the asset’s JOB, not its topic. Landing pages and guides require a full skills pass even when derived from already-refined material. Evidence-forward credibility (not narrative) is required on research guides and conversion pages for skeptical buyers.</w:t>
       </w:r>
     </w:p>
-    <w:bookmarkEnd w:id="66"/>
-    <w:bookmarkStart w:id="67" w:name="writing-rules"/>
+    <w:bookmarkEnd w:id="58"/>
+    <w:bookmarkStart w:id="59" w:name="writing-rules"/>
     <w:p>
       <w:pPr>
         <w:pStyle w:val="Heading2"/>
@@ -10725,8 +10841,8 @@
         <w:t xml:space="preserve">Order URL: https://shop.enyrgy.com/products/uvb-light-therapy · Device Registration: https://api.enyrgy.com/</w:t>
       </w:r>
     </w:p>
-    <w:bookmarkEnd w:id="67"/>
-    <w:bookmarkStart w:id="68" w:name="brand-standards-new-in-v3.7-locked"/>
+    <w:bookmarkEnd w:id="59"/>
+    <w:bookmarkStart w:id="60" w:name="brand-standards-new-in-v3.7-locked"/>
     <w:p>
       <w:pPr>
         <w:pStyle w:val="Heading2"/>
@@ -10779,8 +10895,8 @@
         <w:t xml:space="preserve">Approved terms: BioCalibrated Sunshine™ (personalized-dosing/skin-type angle), Triple-Pathway Advantage™.</w:t>
       </w:r>
     </w:p>
-    <w:bookmarkEnd w:id="68"/>
-    <w:bookmarkStart w:id="69" w:name="Xfe01eca712cc1036100477333073c92282aeab4"/>
+    <w:bookmarkEnd w:id="60"/>
+    <w:bookmarkStart w:id="61" w:name="Xfe01eca712cc1036100477333073c92282aeab4"/>
     <w:p>
       <w:pPr>
         <w:pStyle w:val="Heading2"/>
@@ -10809,8 +10925,8 @@
         <w:t xml:space="preserve">is false framing and must not be used.</w:t>
       </w:r>
     </w:p>
-    <w:bookmarkEnd w:id="69"/>
-    <w:bookmarkStart w:id="70" w:name="prohibited-words-compliance"/>
+    <w:bookmarkEnd w:id="61"/>
+    <w:bookmarkStart w:id="62" w:name="prohibited-words-compliance"/>
     <w:p>
       <w:pPr>
         <w:pStyle w:val="Heading2"/>
@@ -10827,9 +10943,9 @@
         <w:t xml:space="preserve">treat, cure, diagnose, disease, prescription, FDA-approved, medical treatment, heal, fix, medication, illness, clinical diagnosis, therapeutic treatment. Review all client-facing content against the 2026 January FDA Guidelines for Wellness Products before use.</w:t>
       </w:r>
     </w:p>
-    <w:bookmarkEnd w:id="70"/>
-    <w:bookmarkEnd w:id="71"/>
-    <w:bookmarkStart w:id="72" w:name="section-15-approved-talking-points"/>
+    <w:bookmarkEnd w:id="62"/>
+    <w:bookmarkEnd w:id="63"/>
+    <w:bookmarkStart w:id="64" w:name="section-15-approved-talking-points"/>
     <w:p>
       <w:pPr>
         <w:pStyle w:val="Heading1"/>
@@ -11003,8 +11119,8 @@
         <w:t xml:space="preserve">Sunlight. Evolved.</w:t>
       </w:r>
     </w:p>
-    <w:bookmarkEnd w:id="72"/>
-    <w:bookmarkStart w:id="75" w:name="section-16-commercial-roi-model"/>
+    <w:bookmarkEnd w:id="64"/>
+    <w:bookmarkStart w:id="67" w:name="section-16-commercial-roi-model"/>
     <w:p>
       <w:pPr>
         <w:pStyle w:val="Heading1"/>
@@ -11013,7 +11129,7 @@
         <w:t xml:space="preserve">SECTION 16: COMMERCIAL ROI MODEL</w:t>
       </w:r>
     </w:p>
-    <w:bookmarkStart w:id="73" w:name="model-a-pay-per-modality"/>
+    <w:bookmarkStart w:id="65" w:name="model-a-pay-per-modality"/>
     <w:p>
       <w:pPr>
         <w:pStyle w:val="Heading2"/>
@@ -11218,8 +11334,8 @@
         <w:t xml:space="preserve">Device cost: $8,950. Payback at 50 clients: under 4 months.</w:t>
       </w:r>
     </w:p>
-    <w:bookmarkEnd w:id="73"/>
-    <w:bookmarkStart w:id="74" w:name="model-b-membership-tier-upgrade"/>
+    <w:bookmarkEnd w:id="65"/>
+    <w:bookmarkStart w:id="66" w:name="model-b-membership-tier-upgrade"/>
     <w:p>
       <w:pPr>
         <w:pStyle w:val="Heading2"/>
@@ -11254,9 +11370,9 @@
         <w:t xml:space="preserve">at 5 sessions/day at $50/session at 250 operating days = $62,500 gross Year 1; after device cost, $53,550 net = 6.0x ROI on a single unit.</w:t>
       </w:r>
     </w:p>
-    <w:bookmarkEnd w:id="74"/>
-    <w:bookmarkEnd w:id="75"/>
-    <w:bookmarkStart w:id="76" w:name="section-17-investor-offering-details"/>
+    <w:bookmarkEnd w:id="66"/>
+    <w:bookmarkEnd w:id="67"/>
+    <w:bookmarkStart w:id="68" w:name="section-17-investor-offering-details"/>
     <w:p>
       <w:pPr>
         <w:pStyle w:val="Heading1"/>
@@ -11530,8 +11646,8 @@
         </w:tc>
       </w:tr>
     </w:tbl>
-    <w:bookmarkEnd w:id="76"/>
-    <w:bookmarkStart w:id="77" w:name="section-18-key-reference-data"/>
+    <w:bookmarkEnd w:id="68"/>
+    <w:bookmarkStart w:id="69" w:name="section-18-key-reference-data"/>
     <w:p>
       <w:pPr>
         <w:pStyle w:val="Heading1"/>
@@ -12176,8 +12292,8 @@
         </w:tc>
       </w:tr>
     </w:tbl>
-    <w:bookmarkEnd w:id="77"/>
-    <w:bookmarkStart w:id="80" w:name="X17ff4415c04741fc8a2aa7a70f1e07a23764a6c"/>
+    <w:bookmarkEnd w:id="69"/>
+    <w:bookmarkStart w:id="72" w:name="X17ff4415c04741fc8a2aa7a70f1e07a23764a6c"/>
     <w:p>
       <w:pPr>
         <w:pStyle w:val="Heading1"/>
@@ -12186,7 +12302,7 @@
         <w:t xml:space="preserve">SECTION 19: OEM / WHITE-LABEL PARTNER PROGRAM</w:t>
       </w:r>
     </w:p>
-    <w:bookmarkStart w:id="78" w:name="current-partner-lumanova-luma-d-light"/>
+    <w:bookmarkStart w:id="70" w:name="current-partner-lumanova-luma-d-light"/>
     <w:p>
       <w:pPr>
         <w:pStyle w:val="Heading2"/>
@@ -12426,8 +12542,8 @@
         </w:tc>
       </w:tr>
     </w:tbl>
-    <w:bookmarkEnd w:id="78"/>
-    <w:bookmarkStart w:id="79" w:name="X1515f5e0007ad2b6c27b7502d1a1f844382ed83"/>
+    <w:bookmarkEnd w:id="70"/>
+    <w:bookmarkStart w:id="71" w:name="X1515f5e0007ad2b6c27b7502d1a1f844382ed83"/>
     <w:p>
       <w:pPr>
         <w:pStyle w:val="Heading2"/>
@@ -12444,9 +12560,9 @@
         <w:t xml:space="preserve">Distribution reach 25,000+ active customers; wellness franchise group, major distributor, or DTC health brand; US + at least 1 of UK/Canada/France/New Zealand; 50+ units/month within 12 months; premium science-backed brand fit.</w:t>
       </w:r>
     </w:p>
-    <w:bookmarkEnd w:id="79"/>
-    <w:bookmarkEnd w:id="80"/>
-    <w:bookmarkStart w:id="84" w:name="X687f7c3bf0944ae043cba8026f5843164b87cda"/>
+    <w:bookmarkEnd w:id="71"/>
+    <w:bookmarkEnd w:id="72"/>
+    <w:bookmarkStart w:id="76" w:name="X687f7c3bf0944ae043cba8026f5843164b87cda"/>
     <w:p>
       <w:pPr>
         <w:pStyle w:val="Heading1"/>
@@ -12473,7 +12589,7 @@
         <w:t xml:space="preserve">Every lead, regardless of source, must be in GHL within 24 hours. For human-sourced leads, enter the contact in the GHL mobile app before leaving the conversation. Leads not in GHL do not exist.</w:t>
       </w:r>
     </w:p>
-    <w:bookmarkStart w:id="81" w:name="X4acb111ecfd5dd1f7062b33943386e83dc7f6dc"/>
+    <w:bookmarkStart w:id="73" w:name="X4acb111ecfd5dd1f7062b33943386e83dc7f6dc"/>
     <w:p>
       <w:pPr>
         <w:pStyle w:val="Heading2"/>
@@ -12900,8 +13016,8 @@
         </w:tc>
       </w:tr>
     </w:tbl>
-    <w:bookmarkEnd w:id="81"/>
-    <w:bookmarkStart w:id="82" w:name="Xe3d2dae8991f0892c8c2daa36799b8b89543412"/>
+    <w:bookmarkEnd w:id="73"/>
+    <w:bookmarkStart w:id="74" w:name="Xe3d2dae8991f0892c8c2daa36799b8b89543412"/>
     <w:p>
       <w:pPr>
         <w:pStyle w:val="Heading2"/>
@@ -12918,8 +13034,8 @@
         <w:t xml:space="preserve">Podcast appearances (proven #1 channel), organic social (Vitamin D deficiency, seasonal mood, athletic recovery content), paid Meta/Google ads (Phase 2), referral program (WF-07), word-of-mouth/community, Lumanova/OEM channel.</w:t>
       </w:r>
     </w:p>
-    <w:bookmarkEnd w:id="82"/>
-    <w:bookmarkStart w:id="83" w:name="X381182024df858e43a1c7682279a9e1b008a029"/>
+    <w:bookmarkEnd w:id="74"/>
+    <w:bookmarkStart w:id="75" w:name="X381182024df858e43a1c7682279a9e1b008a029"/>
     <w:p>
       <w:pPr>
         <w:pStyle w:val="Heading2"/>
@@ -12991,9 +13107,9 @@
         <w:t xml:space="preserve">OEM/white-label targets (CRITICAL), large distributors, podcast/influencer affiliates, wellness franchises, clinical advisors, tech/app integration partners.</w:t>
       </w:r>
     </w:p>
-    <w:bookmarkEnd w:id="83"/>
-    <w:bookmarkEnd w:id="84"/>
-    <w:bookmarkStart w:id="85" w:name="Xe534da5b7f79c50a2ecfe134b884e34329c6953"/>
+    <w:bookmarkEnd w:id="75"/>
+    <w:bookmarkEnd w:id="76"/>
+    <w:bookmarkStart w:id="77" w:name="Xe534da5b7f79c50a2ecfe134b884e34329c6953"/>
     <w:p>
       <w:pPr>
         <w:pStyle w:val="Heading1"/>
@@ -13122,8 +13238,8 @@
         <w:t xml:space="preserve">NEW (v3.7): dedicated sending domain live; sender identity solved.</w:t>
       </w:r>
     </w:p>
-    <w:bookmarkEnd w:id="85"/>
-    <w:bookmarkStart w:id="90" w:name="section-22-client-type-playbooks"/>
+    <w:bookmarkEnd w:id="77"/>
+    <w:bookmarkStart w:id="82" w:name="section-22-client-type-playbooks"/>
     <w:p>
       <w:pPr>
         <w:pStyle w:val="Heading1"/>
@@ -13132,7 +13248,7 @@
         <w:t xml:space="preserve">SECTION 22: CLIENT TYPE PLAYBOOKS</w:t>
       </w:r>
     </w:p>
-    <w:bookmarkStart w:id="86" w:name="consumer-playbook-discovery-questions"/>
+    <w:bookmarkStart w:id="78" w:name="consumer-playbook-discovery-questions"/>
     <w:p>
       <w:pPr>
         <w:pStyle w:val="Heading2"/>
@@ -13435,8 +13551,8 @@
         </w:tc>
       </w:tr>
     </w:tbl>
-    <w:bookmarkEnd w:id="86"/>
-    <w:bookmarkStart w:id="87" w:name="top-consumer-objections"/>
+    <w:bookmarkEnd w:id="78"/>
+    <w:bookmarkStart w:id="79" w:name="top-consumer-objections"/>
     <w:p>
       <w:pPr>
         <w:pStyle w:val="Heading2"/>
@@ -13550,8 +13666,8 @@
         <w:t xml:space="preserve">Wellness device, not medical; makes no medical claims. Results backed by peer-reviewed science; advisory board includes Dr. Bruce Hollis.</w:t>
       </w:r>
     </w:p>
-    <w:bookmarkEnd w:id="87"/>
-    <w:bookmarkStart w:id="88" w:name="commercial-playbook"/>
+    <w:bookmarkEnd w:id="79"/>
+    <w:bookmarkStart w:id="80" w:name="commercial-playbook"/>
     <w:p>
       <w:pPr>
         <w:pStyle w:val="Heading2"/>
@@ -13641,8 +13757,8 @@
         <w:t xml:space="preserve">Included; the app calculates each client’s MED and controls the session.</w:t>
       </w:r>
     </w:p>
-    <w:bookmarkEnd w:id="88"/>
-    <w:bookmarkStart w:id="89" w:name="investor-playbook-pitch-flow"/>
+    <w:bookmarkEnd w:id="80"/>
+    <w:bookmarkStart w:id="81" w:name="investor-playbook-pitch-flow"/>
     <w:p>
       <w:pPr>
         <w:pStyle w:val="Heading2"/>
@@ -13735,9 +13851,9 @@
         <w:t xml:space="preserve">equity upside -&gt; conversion option at 20% discount to SEC valuation; crowded market -&gt; category of one (all three pathways); exit -&gt; strategic acquisition $100-150M, buyer profiles Philips/Apple Health/Peloton/AG1/LVMH.</w:t>
       </w:r>
     </w:p>
-    <w:bookmarkEnd w:id="89"/>
-    <w:bookmarkEnd w:id="90"/>
-    <w:bookmarkStart w:id="91" w:name="section-23-contact"/>
+    <w:bookmarkEnd w:id="81"/>
+    <w:bookmarkEnd w:id="82"/>
+    <w:bookmarkStart w:id="83" w:name="section-23-contact"/>
     <w:p>
       <w:pPr>
         <w:pStyle w:val="Heading1"/>
@@ -14171,8 +14287,8 @@
         <w:t xml:space="preserve">www.enyrgy.com · Facility: 5115 N 27th Ave, Bld 66, Phoenix, AZ 85017</w:t>
       </w:r>
     </w:p>
-    <w:bookmarkEnd w:id="91"/>
-    <w:bookmarkStart w:id="98" w:name="X2eb0bc4ebcb5446a412218d313bed2b732c6680"/>
+    <w:bookmarkEnd w:id="83"/>
+    <w:bookmarkStart w:id="90" w:name="X2eb0bc4ebcb5446a412218d313bed2b732c6680"/>
     <w:p>
       <w:pPr>
         <w:pStyle w:val="Heading1"/>
@@ -14181,7 +14297,7 @@
         <w:t xml:space="preserve">SECTION 24: CONSUMER FUNNEL: ICP-DARTBOARD SYSTEM (NEW in v3.7)</w:t>
       </w:r>
     </w:p>
-    <w:bookmarkStart w:id="92" w:name="the-model"/>
+    <w:bookmarkStart w:id="84" w:name="the-model"/>
     <w:p>
       <w:pPr>
         <w:pStyle w:val="Heading2"/>
@@ -14616,8 +14732,8 @@
         <w:t xml:space="preserve">Bullseye and Athlete get full A/B testing. Energy/Sleep gets one strong version. Winter is seasonal. The Tired Test is deliberately a quiz, not a guide, the Problem-Aware tired buyer will not open another PDF.</w:t>
       </w:r>
     </w:p>
-    <w:bookmarkEnd w:id="92"/>
-    <w:bookmarkStart w:id="93" w:name="end-to-end-routing"/>
+    <w:bookmarkEnd w:id="84"/>
+    <w:bookmarkStart w:id="85" w:name="end-to-end-routing"/>
     <w:p>
       <w:pPr>
         <w:pStyle w:val="Heading2"/>
@@ -15044,8 +15160,8 @@
         <w:t xml:space="preserve">All magnet leads converge into WF-17 Long-Term Nurture after their magnet series.</w:t>
       </w:r>
     </w:p>
-    <w:bookmarkEnd w:id="93"/>
-    <w:bookmarkStart w:id="94" w:name="the-suppression-system-drip_bypass"/>
+    <w:bookmarkEnd w:id="85"/>
+    <w:bookmarkStart w:id="86" w:name="the-suppression-system-drip_bypass"/>
     <w:p>
       <w:pPr>
         <w:pStyle w:val="Heading2"/>
@@ -15315,8 +15431,8 @@
         <w:t xml:space="preserve">Capture workflows must apply drip_bypass in the same action as type_consumer so the tags land together.</w:t>
       </w:r>
     </w:p>
-    <w:bookmarkEnd w:id="94"/>
-    <w:bookmarkStart w:id="95" w:name="the-magnets"/>
+    <w:bookmarkEnd w:id="86"/>
+    <w:bookmarkStart w:id="87" w:name="the-magnets"/>
     <w:p>
       <w:pPr>
         <w:pStyle w:val="Heading2"/>
@@ -15628,8 +15744,8 @@
         <w:t xml:space="preserve">Hosted PDFs (assets.cdn.filesafe.space/GtXjla7Ld1dordsTWrVy/media/): Synthesis Gap 6a3eb5fae2763b2eec13afcc.pdf · Recovery 6a3fd90fc408020f97c82b7f.pdf · Winter 6a3f1a46163e40d8627248b1.pdf.</w:t>
       </w:r>
     </w:p>
-    <w:bookmarkEnd w:id="95"/>
-    <w:bookmarkStart w:id="96" w:name="email-series"/>
+    <w:bookmarkEnd w:id="87"/>
+    <w:bookmarkStart w:id="88" w:name="email-series"/>
     <w:p>
       <w:pPr>
         <w:pStyle w:val="Heading2"/>
@@ -15994,8 +16110,8 @@
         <w:t xml:space="preserve">, sent from scott@enyrgy.com to match.</w:t>
       </w:r>
     </w:p>
-    <w:bookmarkEnd w:id="96"/>
-    <w:bookmarkStart w:id="97" w:name="landing-page-deploy-recipe-proven"/>
+    <w:bookmarkEnd w:id="88"/>
+    <w:bookmarkStart w:id="89" w:name="landing-page-deploy-recipe-proven"/>
     <w:p>
       <w:pPr>
         <w:pStyle w:val="Heading2"/>
@@ -16122,13 +16238,12 @@
         <w:t xml:space="preserve">CONFIDENTIAL, Enyrgy Inc, 5115 N 27th Ave, Bld 66, Phoenix, AZ 85017, enyrgy.com, Sunlight. Evolved., Implementation Guide v3.9.3</w:t>
       </w:r>
     </w:p>
-    <w:bookmarkEnd w:id="97"/>
-    <w:bookmarkEnd w:id="98"/>
+    <w:bookmarkEnd w:id="89"/>
+    <w:bookmarkEnd w:id="90"/>
     <w:sectPr>
-      <w:pgSz w:h="15840" w:orient="portrait" w:w="12240"/>
-      <w:pgMar w:bottom="1440" w:footer="708" w:gutter="0" w:header="708" w:left="1440" w:right="1440" w:top="1440"/>
-      <w:pgNumType/>
-      <w:docGrid w:linePitch="360"/>
+      <w:footnotePr>
+        <w:numRestart w:val="eachSect"/>
+      </w:footnotePr>
     </w:sectPr>
   </w:body>
 </w:document>
@@ -16138,28 +16253,6 @@
 <w:comments xmlns:w="http://schemas.openxmlformats.org/wordprocessingml/2006/main" xmlns:m="http://schemas.openxmlformats.org/officeDocument/2006/math" xmlns:r="http://schemas.openxmlformats.org/officeDocument/2006/relationships" xmlns:o="urn:schemas-microsoft-com:office:office" xmlns:v="urn:schemas-microsoft-com:vml" xmlns:w10="urn:schemas-microsoft-com:office:word" xmlns:a="http://schemas.openxmlformats.org/drawingml/2006/main" xmlns:pic="http://schemas.openxmlformats.org/drawingml/2006/picture" xmlns:wp="http://schemas.openxmlformats.org/drawingml/2006/wordprocessingDrawing"/>
 </file>
 
-<file path=word/footer1.xml><?xml version="1.0" encoding="utf-8"?>
-<w:ftr xmlns:wpc="http://schemas.microsoft.com/office/word/2010/wordprocessingCanvas" xmlns:mc="http://schemas.openxmlformats.org/markup-compatibility/2006" xmlns:o="urn:schemas-microsoft-com:office:office" xmlns:r="http://schemas.openxmlformats.org/officeDocument/2006/relationships" xmlns:m="http://schemas.openxmlformats.org/officeDocument/2006/math" xmlns:v="urn:schemas-microsoft-com:vml" xmlns:wp14="http://schemas.microsoft.com/office/word/2010/wordprocessingDrawing" xmlns:wp="http://schemas.openxmlformats.org/drawingml/2006/wordprocessingDrawing" xmlns:w10="urn:schemas-microsoft-com:office:word" xmlns:w="http://schemas.openxmlformats.org/wordprocessingml/2006/main" xmlns:w14="http://schemas.microsoft.com/office/word/2010/wordml" xmlns:w15="http://schemas.microsoft.com/office/word/2012/wordml" xmlns:wpg="http://schemas.microsoft.com/office/word/2010/wordprocessingGroup" xmlns:wpi="http://schemas.microsoft.com/office/word/2010/wordprocessingInk" xmlns:wne="http://schemas.microsoft.com/office/word/2006/wordml" xmlns:wps="http://schemas.microsoft.com/office/word/2010/wordprocessingShape">
-  <w:p>
-    <w:pPr>
-      <w:jc w:val="center"/>
-    </w:pPr>
-    <w:r>
-      <w:rPr>
-        <w:rFonts w:ascii="Montserrat" w:cs="Montserrat" w:eastAsia="Montserrat" w:hAnsi="Montserrat"/>
-        <w:color w:val="6B6B66"/>
-        <w:sz w:val="16"/>
-        <w:szCs w:val="16"/>
-      </w:rPr>
-      <w:fldChar w:fldCharType="begin"/>
-      <w:instrText xml:space="preserve">PAGE</w:instrText>
-      <w:fldChar w:fldCharType="separate"/>
-      <w:fldChar w:fldCharType="end"/>
-    </w:r>
-  </w:p>
-</w:ftr>
-</file>
-
 <file path=word/footnotes.xml><?xml version="1.0" encoding="utf-8"?>
 <w:footnotes xmlns:w="http://schemas.openxmlformats.org/wordprocessingml/2006/main" xmlns:m="http://schemas.openxmlformats.org/officeDocument/2006/math" xmlns:r="http://schemas.openxmlformats.org/officeDocument/2006/relationships" xmlns:o="urn:schemas-microsoft-com:office:office" xmlns:v="urn:schemas-microsoft-com:vml" xmlns:w10="urn:schemas-microsoft-com:office:word" xmlns:a="http://schemas.openxmlformats.org/drawingml/2006/main" xmlns:pic="http://schemas.openxmlformats.org/drawingml/2006/picture" xmlns:wp="http://schemas.openxmlformats.org/drawingml/2006/wordprocessingDrawing">
   <w:footnote w:type="continuationSeparator" w:id="0">
@@ -16179,117 +16272,8 @@
 </w:footnotes>
 </file>
 
-<file path=word/header1.xml><?xml version="1.0" encoding="utf-8"?>
-<w:hdr xmlns:wpc="http://schemas.microsoft.com/office/word/2010/wordprocessingCanvas" xmlns:mc="http://schemas.openxmlformats.org/markup-compatibility/2006" xmlns:o="urn:schemas-microsoft-com:office:office" xmlns:r="http://schemas.openxmlformats.org/officeDocument/2006/relationships" xmlns:m="http://schemas.openxmlformats.org/officeDocument/2006/math" xmlns:v="urn:schemas-microsoft-com:vml" xmlns:wp14="http://schemas.microsoft.com/office/word/2010/wordprocessingDrawing" xmlns:wp="http://schemas.openxmlformats.org/drawingml/2006/wordprocessingDrawing" xmlns:w10="urn:schemas-microsoft-com:office:word" xmlns:w="http://schemas.openxmlformats.org/wordprocessingml/2006/main" xmlns:w14="http://schemas.microsoft.com/office/word/2010/wordml" xmlns:w15="http://schemas.microsoft.com/office/word/2012/wordml" xmlns:wpg="http://schemas.microsoft.com/office/word/2010/wordprocessingGroup" xmlns:wpi="http://schemas.microsoft.com/office/word/2010/wordprocessingInk" xmlns:wne="http://schemas.microsoft.com/office/word/2006/wordml" xmlns:wps="http://schemas.microsoft.com/office/word/2010/wordprocessingShape" xmlns:cx="http://schemas.microsoft.com/office/drawing/2014/chartex" xmlns:cx1="http://schemas.microsoft.com/office/drawing/2015/9/8/chartex" xmlns:cx2="http://schemas.microsoft.com/office/drawing/2015/10/21/chartex" xmlns:cx3="http://schemas.microsoft.com/office/drawing/2016/5/9/chartex" xmlns:cx4="http://schemas.microsoft.com/office/drawing/2016/5/10/chartex" xmlns:cx5="http://schemas.microsoft.com/office/drawing/2016/5/11/chartex" xmlns:cx6="http://schemas.microsoft.com/office/drawing/2016/5/12/chartex" xmlns:cx7="http://schemas.microsoft.com/office/drawing/2016/5/13/chartex" xmlns:cx8="http://schemas.microsoft.com/office/drawing/2016/5/14/chartex" xmlns:w16cid="http://schemas.microsoft.com/office/word/2016/wordml/cid" xmlns:w16se="http://schemas.microsoft.com/office/word/2015/wordml/symex">
-  <w:p>
-    <w:pPr>
-      <w:pBdr>
-        <w:bottom w:val="single" w:color="E64C38" w:sz="8"/>
-      </w:pBdr>
-      <w:spacing w:after="120"/>
-      <w:jc w:val="left"/>
-    </w:pPr>
-    <w:r>
-      <w:rPr>
-        <w:rFonts w:ascii="Montserrat" w:cs="Montserrat" w:eastAsia="Montserrat" w:hAnsi="Montserrat"/>
-        <w:b/>
-        <w:bCs/>
-        <w:color w:val="E64C38"/>
-        <w:sz w:val="16"/>
-        <w:szCs w:val="16"/>
-      </w:rPr>
-      <w:t xml:space="preserve">Enyrgy GHL Session Handoff</w:t>
-    </w:r>
-  </w:p>
-</w:hdr>
-</file>
-
 <file path=word/numbering.xml><?xml version="1.0" encoding="utf-8"?>
-<w:numbering xmlns:m="http://schemas.openxmlformats.org/officeDocument/2006/math" xmlns:mc="http://schemas.openxmlformats.org/markup-compatibility/2006" xmlns:o="urn:schemas-microsoft-com:office:office" xmlns:r="http://schemas.openxmlformats.org/officeDocument/2006/relationships" xmlns:v="urn:schemas-microsoft-com:vml" xmlns:w="http://schemas.openxmlformats.org/wordprocessingml/2006/main" xmlns:w10="urn:schemas-microsoft-com:office:word" xmlns:w14="http://schemas.microsoft.com/office/word/2010/wordml" xmlns:w15="http://schemas.microsoft.com/office/word/2012/wordml" xmlns:wne="http://schemas.microsoft.com/office/word/2006/wordml" xmlns:wp="http://schemas.openxmlformats.org/drawingml/2006/wordprocessingDrawing" xmlns:wp14="http://schemas.microsoft.com/office/word/2010/wordprocessingDrawing" xmlns:wpc="http://schemas.microsoft.com/office/word/2010/wordprocessingCanvas" xmlns:wpg="http://schemas.microsoft.com/office/word/2010/wordprocessingGroup" xmlns:wpi="http://schemas.microsoft.com/office/word/2010/wordprocessingInk" xmlns:wps="http://schemas.microsoft.com/office/word/2010/wordprocessingShape" mc:Ignorable="w14 w15 wp14">
-  <w:abstractNum w15:restartNumberingAfterBreak="0" w:abstractNumId="1">
-    <w:multiLevelType w:val="hybridMultilevel"/>
-    <w:lvl w15:tentative="1" w:ilvl="0">
-      <w:start w:val="1"/>
-      <w:numFmt w:val="bullet"/>
-      <w:lvlText w:val="●"/>
-      <w:lvlJc w:val="left"/>
-      <w:pPr>
-        <w:ind w:hanging="360" w:left="720"/>
-      </w:pPr>
-    </w:lvl>
-    <w:lvl w15:tentative="1" w:ilvl="1">
-      <w:start w:val="1"/>
-      <w:numFmt w:val="bullet"/>
-      <w:lvlText w:val="○"/>
-      <w:lvlJc w:val="left"/>
-      <w:pPr>
-        <w:ind w:hanging="360" w:left="1440"/>
-      </w:pPr>
-    </w:lvl>
-    <w:lvl w15:tentative="1" w:ilvl="2">
-      <w:start w:val="1"/>
-      <w:numFmt w:val="bullet"/>
-      <w:lvlText w:val="■"/>
-      <w:lvlJc w:val="left"/>
-      <w:pPr>
-        <w:ind w:hanging="360" w:left="2160"/>
-      </w:pPr>
-    </w:lvl>
-    <w:lvl w15:tentative="1" w:ilvl="3">
-      <w:start w:val="1"/>
-      <w:numFmt w:val="bullet"/>
-      <w:lvlText w:val="●"/>
-      <w:lvlJc w:val="left"/>
-      <w:pPr>
-        <w:ind w:hanging="360" w:left="2880"/>
-      </w:pPr>
-    </w:lvl>
-    <w:lvl w15:tentative="1" w:ilvl="4">
-      <w:start w:val="1"/>
-      <w:numFmt w:val="bullet"/>
-      <w:lvlText w:val="○"/>
-      <w:lvlJc w:val="left"/>
-      <w:pPr>
-        <w:ind w:hanging="360" w:left="3600"/>
-      </w:pPr>
-    </w:lvl>
-    <w:lvl w15:tentative="1" w:ilvl="5">
-      <w:start w:val="1"/>
-      <w:numFmt w:val="bullet"/>
-      <w:lvlText w:val="■"/>
-      <w:lvlJc w:val="left"/>
-      <w:pPr>
-        <w:ind w:hanging="360" w:left="4320"/>
-      </w:pPr>
-    </w:lvl>
-    <w:lvl w15:tentative="1" w:ilvl="6">
-      <w:start w:val="1"/>
-      <w:numFmt w:val="bullet"/>
-      <w:lvlText w:val="●"/>
-      <w:lvlJc w:val="left"/>
-      <w:pPr>
-        <w:ind w:hanging="360" w:left="5040"/>
-      </w:pPr>
-    </w:lvl>
-    <w:lvl w15:tentative="1" w:ilvl="7">
-      <w:start w:val="1"/>
-      <w:numFmt w:val="bullet"/>
-      <w:lvlText w:val="●"/>
-      <w:lvlJc w:val="left"/>
-      <w:pPr>
-        <w:ind w:hanging="360" w:left="5760"/>
-      </w:pPr>
-    </w:lvl>
-    <w:lvl w15:tentative="1" w:ilvl="8">
-      <w:start w:val="1"/>
-      <w:numFmt w:val="bullet"/>
-      <w:lvlText w:val="●"/>
-      <w:lvlJc w:val="left"/>
-      <w:pPr>
-        <w:ind w:hanging="360" w:left="6480"/>
-      </w:pPr>
-    </w:lvl>
-  </w:abstractNum>
+<w:numbering xmlns:w="http://schemas.openxmlformats.org/wordprocessingml/2006/main">
   <w:abstractNum w:abstractNumId="990">
     <w:nsid w:val="0000A990"/>
     <w:multiLevelType w:val="multilevel"/>
@@ -16639,12 +16623,6 @@
       </w:pPr>
     </w:lvl>
   </w:abstractNum>
-  <w:num w:numId="1">
-    <w:abstractNumId w:val="1"/>
-    <w:lvlOverride w:ilvl="0">
-      <w:startOverride w:val="1"/>
-    </w:lvlOverride>
-  </w:num>
   <w:num w:numId="1000">
     <w:abstractNumId w:val="990"/>
   </w:num>
@@ -16757,903 +16735,668 @@
 </file>
 
 <file path=word/styles.xml><?xml version="1.0" encoding="utf-8"?>
-<w:styles xmlns:mc="http://schemas.openxmlformats.org/markup-compatibility/2006" xmlns:r="http://schemas.openxmlformats.org/officeDocument/2006/relationships" xmlns:w="http://schemas.openxmlformats.org/wordprocessingml/2006/main" xmlns:w14="http://schemas.microsoft.com/office/word/2010/wordml" xmlns:w15="http://schemas.microsoft.com/office/word/2012/wordml" mc:Ignorable="w14 w15">
+<w:styles xmlns:r="http://schemas.openxmlformats.org/officeDocument/2006/relationships" xmlns:w="http://schemas.openxmlformats.org/wordprocessingml/2006/main">
   <w:docDefaults>
     <w:rPrDefault>
       <w:rPr>
-        <w:rFonts w:ascii="Montserrat" w:cs="Montserrat" w:eastAsia="Montserrat" w:hAnsi="Montserrat"/>
-        <w:color w:val="1A1A1A"/>
-        <w:sz w:val="21"/>
-        <w:szCs w:val="21"/>
+        <w:rFonts w:asciiTheme="minorHAnsi" w:cstheme="minorBidi" w:eastAsiaTheme="minorEastAsia" w:hAnsiTheme="minorHAnsi"/>
+        <w:sz w:val="24"/>
+        <w:szCs w:val="24"/>
+        <w:lang w:bidi="ar-SA" w:eastAsia="zh-CN" w:val="en-US"/>
       </w:rPr>
     </w:rPrDefault>
-    <w:pPrDefault/>
+    <w:pPrDefault>
+      <w:pPr>
+        <w:spacing w:after="200"/>
+      </w:pPr>
+    </w:pPrDefault>
   </w:docDefaults>
+  <w:latentStyles w:count="276" w:defLockedState="0" w:defQFormat="0" w:defSemiHidden="0" w:defUIPriority="0" w:defUnhideWhenUsed="0"/>
+  <w:style w:default="1" w:styleId="Normal" w:type="paragraph">
+    <w:name w:val="Normal"/>
+    <w:qFormat/>
+  </w:style>
+  <w:style w:styleId="BodyText" w:type="paragraph">
+    <w:name w:val="Body Text"/>
+    <w:basedOn w:val="Normal"/>
+    <w:link w:val="BodyTextChar"/>
+    <w:qFormat/>
+    <w:pPr>
+      <w:spacing w:after="180" w:before="180"/>
+    </w:pPr>
+  </w:style>
+  <w:style w:customStyle="1" w:styleId="FirstParagraph" w:type="paragraph">
+    <w:name w:val="First Paragraph"/>
+    <w:basedOn w:val="BodyText"/>
+    <w:next w:val="BodyText"/>
+    <w:qFormat/>
+  </w:style>
+  <w:style w:customStyle="1" w:styleId="Compact" w:type="paragraph">
+    <w:name w:val="Compact"/>
+    <w:basedOn w:val="BodyText"/>
+    <w:qFormat/>
+    <w:pPr>
+      <w:spacing w:after="36" w:before="36"/>
+    </w:pPr>
+  </w:style>
   <w:style w:styleId="Title" w:type="paragraph">
     <w:name w:val="Title"/>
     <w:basedOn w:val="Normal"/>
-    <w:next w:val="Normal"/>
+    <w:next w:val="BodyText"/>
+    <w:link w:val="TitleChar"/>
+    <w:uiPriority w:val="10"/>
     <w:qFormat/>
+    <w:rsid w:val="00A10FD9"/>
+    <w:pPr>
+      <w:spacing w:after="80" w:line="240" w:lineRule="auto"/>
+      <w:contextualSpacing/>
+      <w:jc w:val="center"/>
+    </w:pPr>
     <w:rPr>
+      <w:rFonts w:asciiTheme="majorHAnsi" w:cstheme="majorBidi" w:eastAsiaTheme="majorEastAsia" w:hAnsiTheme="majorHAnsi"/>
       <w:sz w:val="56"/>
       <w:szCs w:val="56"/>
     </w:rPr>
   </w:style>
-  <w:style w:styleId="Heading1" w:type="paragraph">
-    <w:name w:val="Heading 1"/>
-    <w:basedOn w:val="Normal"/>
-    <w:next w:val="Normal"/>
-    <w:qFormat/>
+  <w:style w:customStyle="1" w:styleId="TitleChar" w:type="character">
+    <w:name w:val="Title Char"/>
+    <w:basedOn w:val="DefaultParagraphFont"/>
+    <w:link w:val="Title"/>
+    <w:uiPriority w:val="10"/>
+    <w:rsid w:val="00A10FD9"/>
     <w:rPr>
-      <w:color w:val="2E74B5"/>
-      <w:sz w:val="32"/>
-      <w:szCs w:val="32"/>
+      <w:rFonts w:asciiTheme="majorHAnsi" w:cstheme="majorBidi" w:eastAsiaTheme="majorEastAsia" w:hAnsiTheme="majorHAnsi"/>
+      <w:sz w:val="56"/>
+      <w:szCs w:val="56"/>
     </w:rPr>
   </w:style>
-  <w:style w:styleId="Heading2" w:type="paragraph">
-    <w:name w:val="Heading 2"/>
-    <w:basedOn w:val="Normal"/>
-    <w:next w:val="Normal"/>
+  <w:style w:styleId="Subtitle" w:type="paragraph">
+    <w:name w:val="Subtitle"/>
+    <w:basedOn w:val="Title"/>
+    <w:next w:val="BodyText"/>
+    <w:link w:val="SubtitleChar"/>
+    <w:uiPriority w:val="11"/>
     <w:qFormat/>
+    <w:rsid w:val="00A10FD9"/>
+    <w:pPr>
+      <w:numPr>
+        <w:ilvl w:val="1"/>
+      </w:numPr>
+    </w:pPr>
     <w:rPr>
-      <w:color w:val="2E74B5"/>
-      <w:sz w:val="26"/>
-      <w:szCs w:val="26"/>
+      <w:rFonts w:cstheme="majorBidi" w:eastAsiaTheme="majorEastAsia"/>
+      <w:spacing w:val="15"/>
+      <w:sz w:val="28"/>
+      <w:szCs w:val="28"/>
     </w:rPr>
   </w:style>
-  <w:style w:styleId="Heading3" w:type="paragraph">
-    <w:name w:val="Heading 3"/>
-    <w:basedOn w:val="Normal"/>
-    <w:next w:val="Normal"/>
+  <w:style w:customStyle="1" w:styleId="SubtitleChar" w:type="character">
+    <w:name w:val="Subtitle Char"/>
+    <w:basedOn w:val="DefaultParagraphFont"/>
+    <w:link w:val="Subtitle"/>
+    <w:uiPriority w:val="11"/>
+    <w:rsid w:val="00A10FD9"/>
+    <w:rPr>
+      <w:rFonts w:cstheme="majorBidi" w:eastAsiaTheme="majorEastAsia"/>
+      <w:color w:themeColor="text1" w:themeTint="A6" w:val="595959"/>
+      <w:spacing w:val="15"/>
+      <w:sz w:val="28"/>
+      <w:szCs w:val="28"/>
+    </w:rPr>
+  </w:style>
+  <w:style w:customStyle="1" w:styleId="Author" w:type="paragraph">
+    <w:name w:val="Author"/>
+    <w:basedOn w:val="Title"/>
+    <w:next w:val="BodyText"/>
     <w:qFormat/>
+    <w:pPr>
+      <w:keepNext/>
+      <w:keepLines/>
+    </w:pPr>
     <w:rPr>
-      <w:color w:val="1F4D78"/>
       <w:sz w:val="24"/>
       <w:szCs w:val="24"/>
     </w:rPr>
   </w:style>
-  <w:style w:styleId="Heading4" w:type="paragraph">
-    <w:name w:val="Heading 4"/>
-    <w:basedOn w:val="Normal"/>
-    <w:next w:val="Normal"/>
+  <w:style w:styleId="Date" w:type="paragraph">
+    <w:name w:val="Date"/>
+    <w:basedOn w:val="Title"/>
+    <w:next w:val="BodyText"/>
     <w:qFormat/>
+    <w:pPr>
+      <w:keepNext/>
+      <w:keepLines/>
+    </w:pPr>
     <w:rPr>
-      <w:i/>
-      <w:iCs/>
-      <w:color w:val="2E74B5"/>
+      <w:sz w:val="24"/>
+      <w:szCs w:val="24"/>
     </w:rPr>
   </w:style>
-  <w:style w:styleId="Heading5" w:type="paragraph">
-    <w:name w:val="Heading 5"/>
+  <w:style w:customStyle="1" w:styleId="AbstractTitle" w:type="paragraph">
+    <w:name w:val="Abstract Title"/>
     <w:basedOn w:val="Normal"/>
-    <w:next w:val="Normal"/>
+    <w:next w:val="Abstract"/>
     <w:qFormat/>
+    <w:pPr>
+      <w:keepNext/>
+      <w:keepLines/>
+      <w:spacing w:after="0" w:before="300"/>
+      <w:jc w:val="center"/>
+    </w:pPr>
     <w:rPr>
-      <w:color w:val="2E74B5"/>
+      <w:b/>
+      <w:sz w:val="20"/>
+      <w:szCs w:val="20"/>
     </w:rPr>
   </w:style>
-  <w:style w:styleId="Heading6" w:type="paragraph">
-    <w:name w:val="Heading 6"/>
+  <w:style w:customStyle="1" w:styleId="Abstract" w:type="paragraph">
+    <w:name w:val="Abstract"/>
     <w:basedOn w:val="Normal"/>
-    <w:next w:val="Normal"/>
+    <w:next w:val="BodyText"/>
     <w:qFormat/>
-    <w:rPr>
-      <w:color w:val="1F4D78"/>
-    </w:rPr>
-  </w:style>
-  <w:style w:styleId="Strong" w:type="paragraph">
-    <w:name w:val="Strong"/>
-    <w:basedOn w:val="Normal"/>
-    <w:next w:val="Normal"/>
-    <w:qFormat/>
-    <w:rPr>
-      <w:b/>
-      <w:bCs/>
-    </w:rPr>
-  </w:style>
-  <w:style w:styleId="ListParagraph" w:type="paragraph">
-    <w:name w:val="List Paragraph"/>
-    <w:basedOn w:val="Normal"/>
-    <w:qFormat/>
-  </w:style>
-  <w:style w:styleId="Hyperlink" w:type="character">
-    <w:name w:val="Hyperlink"/>
-    <w:basedOn w:val="DefaultParagraphFont"/>
-    <w:uiPriority w:val="99"/>
-    <w:unhideWhenUsed/>
-    <w:rPr>
-      <w:color w:val="0563C1"/>
-      <w:u w:val="single"/>
-    </w:rPr>
-  </w:style>
-  <w:style w:styleId="FootnoteReference" w:type="character">
-    <w:name w:val="footnote reference"/>
-    <w:basedOn w:val="DefaultParagraphFont"/>
-    <w:uiPriority w:val="99"/>
-    <w:semiHidden/>
-    <w:unhideWhenUsed/>
-    <w:rPr>
-      <w:vertAlign w:val="superscript"/>
-    </w:rPr>
-  </w:style>
-  <w:style w:styleId="FootnoteText" w:type="paragraph">
-    <w:name w:val="footnote text"/>
-    <w:basedOn w:val="Normal"/>
-    <w:link w:val="FootnoteTextChar"/>
-    <w:uiPriority w:val="99"/>
-    <w:semiHidden/>
-    <w:unhideWhenUsed/>
     <w:pPr>
-      <w:spacing w:after="0" w:line="240" w:lineRule="auto"/>
+      <w:keepNext/>
+      <w:keepLines/>
+      <w:spacing w:after="300" w:before="100"/>
     </w:pPr>
     <w:rPr>
       <w:sz w:val="20"/>
       <w:szCs w:val="20"/>
     </w:rPr>
   </w:style>
-  <w:style w:styleId="FootnoteTextChar" w:type="character">
-    <w:name w:val="Footnote Text Char"/>
-    <w:basedOn w:val="DefaultParagraphFont"/>
-    <w:link w:val="FootnoteText"/>
-    <w:uiPriority w:val="99"/>
+  <w:style w:styleId="Bibliography" w:type="paragraph">
+    <w:name w:val="Bibliography"/>
+    <w:basedOn w:val="Normal"/>
+    <w:next w:val="Bibliography"/>
+    <w:qFormat/>
+    <w:pPr/>
+    <w:rPr/>
+  </w:style>
+  <w:style w:styleId="Heading1" w:type="paragraph">
+    <w:name w:val="heading 1"/>
+    <w:basedOn w:val="Normal"/>
+    <w:next w:val="BodyText"/>
+    <w:link w:val="Heading1Char"/>
+    <w:uiPriority w:val="9"/>
+    <w:qFormat/>
+    <w:rsid w:val="00A10FD9"/>
+    <w:pPr>
+      <w:keepNext/>
+      <w:keepLines/>
+      <w:spacing w:after="80" w:before="360"/>
+      <w:outlineLvl w:val="0"/>
+    </w:pPr>
+    <w:rPr>
+      <w:rFonts w:asciiTheme="majorHAnsi" w:cstheme="majorBidi" w:eastAsiaTheme="majorEastAsia" w:hAnsiTheme="majorHAnsi"/>
+      <w:color w:themeColor="accent1" w:themeShade="BF" w:val="0F4761"/>
+      <w:sz w:val="40"/>
+      <w:szCs w:val="40"/>
+    </w:rPr>
+  </w:style>
+  <w:style w:styleId="Heading2" w:type="paragraph">
+    <w:name w:val="heading 2"/>
+    <w:basedOn w:val="Normal"/>
+    <w:next w:val="BodyText"/>
+    <w:link w:val="Heading2Char"/>
+    <w:uiPriority w:val="9"/>
     <w:semiHidden/>
     <w:unhideWhenUsed/>
+    <w:qFormat/>
+    <w:rsid w:val="00A10FD9"/>
+    <w:pPr>
+      <w:keepNext/>
+      <w:keepLines/>
+      <w:spacing w:after="80" w:before="160"/>
+      <w:outlineLvl w:val="1"/>
+    </w:pPr>
     <w:rPr>
-      <w:sz w:val="20"/>
-      <w:szCs w:val="20"/>
+      <w:rFonts w:asciiTheme="majorHAnsi" w:cstheme="majorBidi" w:eastAsiaTheme="majorEastAsia" w:hAnsiTheme="majorHAnsi"/>
+      <w:color w:themeColor="accent1" w:themeShade="BF" w:val="0F4761"/>
+      <w:sz w:val="32"/>
+      <w:szCs w:val="32"/>
     </w:rPr>
   </w:style>
-  <w:style w:styleId="EndnoteReference" w:type="character">
-    <w:name w:val="endnote reference"/>
-    <w:basedOn w:val="DefaultParagraphFont"/>
-    <w:uiPriority w:val="99"/>
+  <w:style w:styleId="Heading3" w:type="paragraph">
+    <w:name w:val="heading 3"/>
+    <w:basedOn w:val="Normal"/>
+    <w:next w:val="BodyText"/>
+    <w:link w:val="Heading3Char"/>
+    <w:uiPriority w:val="9"/>
     <w:semiHidden/>
     <w:unhideWhenUsed/>
+    <w:qFormat/>
+    <w:rsid w:val="00A10FD9"/>
+    <w:pPr>
+      <w:keepNext/>
+      <w:keepLines/>
+      <w:spacing w:after="80" w:before="160"/>
+      <w:outlineLvl w:val="2"/>
+    </w:pPr>
+    <w:rPr>
+      <w:rFonts w:cstheme="majorBidi" w:eastAsiaTheme="majorEastAsia"/>
+      <w:color w:themeColor="accent1" w:themeShade="BF" w:val="0F4761"/>
+      <w:sz w:val="28"/>
+      <w:szCs w:val="28"/>
+    </w:rPr>
+  </w:style>
+  <w:style w:styleId="Heading4" w:type="paragraph">
+    <w:name w:val="heading 4"/>
+    <w:basedOn w:val="Normal"/>
+    <w:next w:val="BodyText"/>
+    <w:link w:val="Heading4Char"/>
+    <w:uiPriority w:val="9"/>
+    <w:semiHidden/>
+    <w:unhideWhenUsed/>
+    <w:qFormat/>
+    <w:rsid w:val="00A10FD9"/>
+    <w:pPr>
+      <w:keepNext/>
+      <w:keepLines/>
+      <w:spacing w:after="40" w:before="80"/>
+      <w:outlineLvl w:val="3"/>
+    </w:pPr>
+    <w:rPr>
+      <w:rFonts w:cstheme="majorBidi" w:eastAsiaTheme="majorEastAsia"/>
+      <w:i/>
+      <w:iCs/>
+      <w:color w:themeColor="accent1" w:themeShade="BF" w:val="0F4761"/>
+    </w:rPr>
+  </w:style>
+  <w:style w:styleId="Heading5" w:type="paragraph">
+    <w:name w:val="heading 5"/>
+    <w:basedOn w:val="Normal"/>
+    <w:next w:val="BodyText"/>
+    <w:link w:val="Heading5Char"/>
+    <w:uiPriority w:val="9"/>
+    <w:semiHidden/>
+    <w:unhideWhenUsed/>
+    <w:qFormat/>
+    <w:rsid w:val="00A10FD9"/>
+    <w:pPr>
+      <w:keepNext/>
+      <w:keepLines/>
+      <w:spacing w:after="40" w:before="80"/>
+      <w:outlineLvl w:val="4"/>
+    </w:pPr>
+    <w:rPr>
+      <w:rFonts w:cstheme="majorBidi" w:eastAsiaTheme="majorEastAsia"/>
+      <w:color w:themeColor="accent1" w:themeShade="BF" w:val="0F4761"/>
+    </w:rPr>
+  </w:style>
+  <w:style w:styleId="Heading6" w:type="paragraph">
+    <w:name w:val="heading 6"/>
+    <w:basedOn w:val="Normal"/>
+    <w:next w:val="BodyText"/>
+    <w:link w:val="Heading6Char"/>
+    <w:uiPriority w:val="9"/>
+    <w:semiHidden/>
+    <w:unhideWhenUsed/>
+    <w:qFormat/>
+    <w:rsid w:val="00A10FD9"/>
+    <w:pPr>
+      <w:keepNext/>
+      <w:keepLines/>
+      <w:spacing w:after="0" w:before="40"/>
+      <w:outlineLvl w:val="5"/>
+    </w:pPr>
+    <w:rPr>
+      <w:rFonts w:cstheme="majorBidi" w:eastAsiaTheme="majorEastAsia"/>
+      <w:i/>
+      <w:iCs/>
+      <w:color w:themeColor="text1" w:themeTint="A6" w:val="595959"/>
+    </w:rPr>
+  </w:style>
+  <w:style w:styleId="Heading7" w:type="paragraph">
+    <w:name w:val="heading 7"/>
+    <w:basedOn w:val="Normal"/>
+    <w:next w:val="BodyText"/>
+    <w:link w:val="Heading7Char"/>
+    <w:uiPriority w:val="9"/>
+    <w:semiHidden/>
+    <w:unhideWhenUsed/>
+    <w:qFormat/>
+    <w:rsid w:val="00A10FD9"/>
+    <w:pPr>
+      <w:keepNext/>
+      <w:keepLines/>
+      <w:spacing w:after="0" w:before="40"/>
+      <w:outlineLvl w:val="6"/>
+    </w:pPr>
+    <w:rPr>
+      <w:rFonts w:cstheme="majorBidi" w:eastAsiaTheme="majorEastAsia"/>
+      <w:color w:themeColor="text1" w:themeTint="A6" w:val="595959"/>
+    </w:rPr>
+  </w:style>
+  <w:style w:styleId="Heading8" w:type="paragraph">
+    <w:name w:val="heading 8"/>
+    <w:basedOn w:val="Normal"/>
+    <w:next w:val="BodyText"/>
+    <w:link w:val="Heading8Char"/>
+    <w:uiPriority w:val="9"/>
+    <w:semiHidden/>
+    <w:unhideWhenUsed/>
+    <w:qFormat/>
+    <w:rsid w:val="00A10FD9"/>
+    <w:pPr>
+      <w:keepNext/>
+      <w:keepLines/>
+      <w:spacing w:after="0"/>
+      <w:outlineLvl w:val="7"/>
+    </w:pPr>
+    <w:rPr>
+      <w:rFonts w:cstheme="majorBidi" w:eastAsiaTheme="majorEastAsia"/>
+      <w:i/>
+      <w:iCs/>
+      <w:color w:themeColor="text1" w:themeTint="D8" w:val="272727"/>
+    </w:rPr>
+  </w:style>
+  <w:style w:styleId="Heading9" w:type="paragraph">
+    <w:name w:val="heading 9"/>
+    <w:basedOn w:val="Normal"/>
+    <w:next w:val="BodyText"/>
+    <w:link w:val="Heading9Char"/>
+    <w:uiPriority w:val="9"/>
+    <w:semiHidden/>
+    <w:unhideWhenUsed/>
+    <w:qFormat/>
+    <w:rsid w:val="00A10FD9"/>
+    <w:pPr>
+      <w:keepNext/>
+      <w:keepLines/>
+      <w:spacing w:after="0"/>
+      <w:outlineLvl w:val="8"/>
+    </w:pPr>
+    <w:rPr>
+      <w:rFonts w:cstheme="majorBidi" w:eastAsiaTheme="majorEastAsia"/>
+      <w:color w:themeColor="text1" w:themeTint="D8" w:val="272727"/>
+    </w:rPr>
+  </w:style>
+  <w:style w:customStyle="1" w:styleId="Heading1Char" w:type="character">
+    <w:name w:val="Heading 1 Char"/>
+    <w:basedOn w:val="DefaultParagraphFont"/>
+    <w:link w:val="Heading1"/>
+    <w:uiPriority w:val="9"/>
+    <w:rsid w:val="00A10FD9"/>
+    <w:rPr>
+      <w:rFonts w:asciiTheme="majorHAnsi" w:cstheme="majorBidi" w:eastAsiaTheme="majorEastAsia" w:hAnsiTheme="majorHAnsi"/>
+      <w:color w:themeColor="accent1" w:themeShade="BF" w:val="0F4761"/>
+      <w:sz w:val="40"/>
+      <w:szCs w:val="40"/>
+    </w:rPr>
+  </w:style>
+  <w:style w:customStyle="1" w:styleId="Heading2Char" w:type="character">
+    <w:name w:val="Heading 2 Char"/>
+    <w:basedOn w:val="DefaultParagraphFont"/>
+    <w:link w:val="Heading2"/>
+    <w:uiPriority w:val="9"/>
+    <w:semiHidden/>
+    <w:rsid w:val="00A10FD9"/>
+    <w:rPr>
+      <w:rFonts w:asciiTheme="majorHAnsi" w:cstheme="majorBidi" w:eastAsiaTheme="majorEastAsia" w:hAnsiTheme="majorHAnsi"/>
+      <w:color w:themeColor="accent1" w:themeShade="BF" w:val="0F4761"/>
+      <w:sz w:val="32"/>
+      <w:szCs w:val="32"/>
+    </w:rPr>
+  </w:style>
+  <w:style w:customStyle="1" w:styleId="Heading3Char" w:type="character">
+    <w:name w:val="Heading 3 Char"/>
+    <w:basedOn w:val="DefaultParagraphFont"/>
+    <w:link w:val="Heading3"/>
+    <w:uiPriority w:val="9"/>
+    <w:semiHidden/>
+    <w:rsid w:val="00A10FD9"/>
+    <w:rPr>
+      <w:rFonts w:cstheme="majorBidi" w:eastAsiaTheme="majorEastAsia"/>
+      <w:color w:themeColor="accent1" w:themeShade="BF" w:val="0F4761"/>
+      <w:sz w:val="28"/>
+      <w:szCs w:val="28"/>
+    </w:rPr>
+  </w:style>
+  <w:style w:customStyle="1" w:styleId="Heading4Char" w:type="character">
+    <w:name w:val="Heading 4 Char"/>
+    <w:basedOn w:val="DefaultParagraphFont"/>
+    <w:link w:val="Heading4"/>
+    <w:uiPriority w:val="9"/>
+    <w:semiHidden/>
+    <w:rsid w:val="00A10FD9"/>
+    <w:rPr>
+      <w:rFonts w:cstheme="majorBidi" w:eastAsiaTheme="majorEastAsia"/>
+      <w:i/>
+      <w:iCs/>
+      <w:color w:themeColor="accent1" w:themeShade="BF" w:val="0F4761"/>
+    </w:rPr>
+  </w:style>
+  <w:style w:customStyle="1" w:styleId="Heading5Char" w:type="character">
+    <w:name w:val="Heading 5 Char"/>
+    <w:basedOn w:val="DefaultParagraphFont"/>
+    <w:link w:val="Heading5"/>
+    <w:uiPriority w:val="9"/>
+    <w:semiHidden/>
+    <w:rsid w:val="00A10FD9"/>
+    <w:rPr>
+      <w:rFonts w:cstheme="majorBidi" w:eastAsiaTheme="majorEastAsia"/>
+      <w:color w:themeColor="accent1" w:themeShade="BF" w:val="0F4761"/>
+    </w:rPr>
+  </w:style>
+  <w:style w:customStyle="1" w:styleId="Heading6Char" w:type="character">
+    <w:name w:val="Heading 6 Char"/>
+    <w:basedOn w:val="DefaultParagraphFont"/>
+    <w:link w:val="Heading6"/>
+    <w:uiPriority w:val="9"/>
+    <w:semiHidden/>
+    <w:rsid w:val="00A10FD9"/>
+    <w:rPr>
+      <w:rFonts w:cstheme="majorBidi" w:eastAsiaTheme="majorEastAsia"/>
+      <w:i/>
+      <w:iCs/>
+      <w:color w:themeColor="text1" w:themeTint="A6" w:val="595959"/>
+    </w:rPr>
+  </w:style>
+  <w:style w:customStyle="1" w:styleId="Heading7Char" w:type="character">
+    <w:name w:val="Heading 7 Char"/>
+    <w:basedOn w:val="DefaultParagraphFont"/>
+    <w:link w:val="Heading7"/>
+    <w:uiPriority w:val="9"/>
+    <w:semiHidden/>
+    <w:rsid w:val="00A10FD9"/>
+    <w:rPr>
+      <w:rFonts w:cstheme="majorBidi" w:eastAsiaTheme="majorEastAsia"/>
+      <w:color w:themeColor="text1" w:themeTint="A6" w:val="595959"/>
+    </w:rPr>
+  </w:style>
+  <w:style w:customStyle="1" w:styleId="Heading8Char" w:type="character">
+    <w:name w:val="Heading 8 Char"/>
+    <w:basedOn w:val="DefaultParagraphFont"/>
+    <w:link w:val="Heading8"/>
+    <w:uiPriority w:val="9"/>
+    <w:semiHidden/>
+    <w:rsid w:val="00A10FD9"/>
+    <w:rPr>
+      <w:rFonts w:cstheme="majorBidi" w:eastAsiaTheme="majorEastAsia"/>
+      <w:i/>
+      <w:iCs/>
+      <w:color w:themeColor="text1" w:themeTint="D8" w:val="272727"/>
+    </w:rPr>
+  </w:style>
+  <w:style w:customStyle="1" w:styleId="Heading9Char" w:type="character">
+    <w:name w:val="Heading 9 Char"/>
+    <w:basedOn w:val="DefaultParagraphFont"/>
+    <w:link w:val="Heading9"/>
+    <w:uiPriority w:val="9"/>
+    <w:semiHidden/>
+    <w:rsid w:val="00A10FD9"/>
+    <w:rPr>
+      <w:rFonts w:cstheme="majorBidi" w:eastAsiaTheme="majorEastAsia"/>
+      <w:color w:themeColor="text1" w:themeTint="D8" w:val="272727"/>
+    </w:rPr>
+  </w:style>
+  <w:style w:styleId="BlockText" w:type="paragraph">
+    <w:name w:val="Block Text"/>
+    <w:basedOn w:val="BodyText"/>
+    <w:next w:val="BodyText"/>
+    <w:uiPriority w:val="9"/>
+    <w:unhideWhenUsed/>
+    <w:qFormat/>
+    <w:pPr>
+      <w:spacing w:after="100" w:before="100"/>
+      <w:ind w:firstLine="0" w:left="480" w:right="480"/>
+    </w:pPr>
+  </w:style>
+  <w:style w:styleId="FootnoteText" w:type="paragraph">
+    <w:name w:val="Footnote Text"/>
+    <w:basedOn w:val="Normal"/>
+    <w:next w:val="FootnoteText"/>
+    <w:uiPriority w:val="9"/>
+    <w:unhideWhenUsed/>
+    <w:qFormat/>
+  </w:style>
+  <w:style w:styleId="FootnoteBlockText" w:type="paragraph">
+    <w:name w:val="Footnote Block Text"/>
+    <w:basedOn w:val="FootnoteText"/>
+    <w:next w:val="FootnoteText"/>
+    <w:uiPriority w:val="9"/>
+    <w:unhideWhenUsed/>
+    <w:qFormat/>
+    <w:pPr>
+      <w:spacing w:after="100" w:before="100"/>
+      <w:ind w:firstLine="0" w:left="480" w:right="480"/>
+    </w:pPr>
+  </w:style>
+  <w:style w:default="1" w:styleId="DefaultParagraphFont" w:type="character">
+    <w:name w:val="Default Paragraph Font"/>
+    <w:semiHidden/>
+    <w:unhideWhenUsed/>
+  </w:style>
+  <w:style w:default="1" w:styleId="Table" w:type="table">
+    <w:name w:val="Table"/>
+    <w:basedOn w:val="TableNormal"/>
+    <w:semiHidden/>
+    <w:unhideWhenUsed/>
+    <w:qFormat/>
+    <w:tblPr>
+      <w:tblBorders>
+        <w:top w:val="single" w:sz="4" w:space="0" w:color="808080"/>
+        <w:left w:val="single" w:sz="4" w:space="0" w:color="808080"/>
+        <w:bottom w:val="single" w:sz="4" w:space="0" w:color="808080"/>
+        <w:right w:val="single" w:sz="4" w:space="0" w:color="808080"/>
+        <w:insideH w:val="single" w:sz="4" w:space="0" w:color="808080"/>
+        <w:insideV w:val="single" w:sz="4" w:space="0" w:color="808080"/>
+      </w:tblBorders>
+      <w:tblInd w:type="dxa" w:w="0"/>
+      <w:tblCellMar>
+        <w:top w:type="dxa" w:w="0"/>
+        <w:left w:type="dxa" w:w="108"/>
+        <w:bottom w:type="dxa" w:w="0"/>
+        <w:right w:type="dxa" w:w="108"/>
+      </w:tblCellMar>
+    </w:tblPr>
+    <w:tblStylePr w:type="firstRow">
+      <w:tcPr>
+        <w:tcBorders>
+          <w:bottom w:val="single"/>
+        </w:tcBorders>
+        <w:vAlign w:val="bottom"/>
+      </w:tcPr>
+    </w:tblStylePr>
+  </w:style>
+  <w:style w:customStyle="1" w:styleId="DefinitionTerm" w:type="paragraph">
+    <w:name w:val="Definition Term"/>
+    <w:basedOn w:val="Normal"/>
+    <w:next w:val="Definition"/>
+    <w:pPr>
+      <w:keepNext/>
+      <w:keepLines/>
+      <w:spacing w:after="0"/>
+    </w:pPr>
+    <w:rPr>
+      <w:b/>
+    </w:rPr>
+  </w:style>
+  <w:style w:customStyle="1" w:styleId="Definition" w:type="paragraph">
+    <w:name w:val="Definition"/>
+    <w:basedOn w:val="Normal"/>
+  </w:style>
+  <w:style w:styleId="Caption" w:type="paragraph">
+    <w:name w:val="Caption"/>
+    <w:basedOn w:val="Normal"/>
+    <w:link w:val="BodyTextChar"/>
+    <w:pPr>
+      <w:spacing w:after="120" w:before="0"/>
+    </w:pPr>
+    <w:rPr>
+      <w:i/>
+    </w:rPr>
+  </w:style>
+  <w:style w:customStyle="1" w:styleId="TableCaption" w:type="paragraph">
+    <w:name w:val="Table Caption"/>
+    <w:basedOn w:val="Caption"/>
+    <w:pPr>
+      <w:keepNext/>
+    </w:pPr>
+  </w:style>
+  <w:style w:customStyle="1" w:styleId="ImageCaption" w:type="paragraph">
+    <w:name w:val="Image Caption"/>
+    <w:basedOn w:val="Caption"/>
+  </w:style>
+  <w:style w:customStyle="1" w:styleId="Figure" w:type="paragraph">
+    <w:name w:val="Figure"/>
+    <w:basedOn w:val="Normal"/>
+  </w:style>
+  <w:style w:customStyle="1" w:styleId="CaptionedFigure" w:type="paragraph">
+    <w:name w:val="Captioned Figure"/>
+    <w:basedOn w:val="Figure"/>
+    <w:pPr>
+      <w:keepNext/>
+    </w:pPr>
+  </w:style>
+  <w:style w:customStyle="1" w:styleId="BodyTextChar" w:type="character">
+    <w:name w:val="Body Text Char"/>
+    <w:basedOn w:val="DefaultParagraphFont"/>
+    <w:link w:val="BodyText"/>
+  </w:style>
+  <w:style w:customStyle="1" w:styleId="VerbatimChar" w:type="character">
+    <w:name w:val="Verbatim Char"/>
+    <w:basedOn w:val="BodyTextChar"/>
+    <w:rPr>
+      <w:rFonts w:ascii="Consolas" w:hAnsi="Consolas"/>
+      <w:sz w:val="22"/>
+    </w:rPr>
+  </w:style>
+  <w:style w:customStyle="1" w:styleId="SectionNumber" w:type="character">
+    <w:name w:val="Section Number"/>
+    <w:basedOn w:val="BodyTextChar"/>
+  </w:style>
+  <w:style w:styleId="FootnoteReference" w:type="character">
+    <w:name w:val="Footnote Reference"/>
+    <w:basedOn w:val="BodyTextChar"/>
     <w:rPr>
       <w:vertAlign w:val="superscript"/>
     </w:rPr>
   </w:style>
-  <w:style w:styleId="EndnoteText" w:type="paragraph">
-    <w:name w:val="endnote text"/>
-    <w:basedOn w:val="Normal"/>
-    <w:link w:val="EndnoteTextChar"/>
-    <w:uiPriority w:val="99"/>
-    <w:semiHidden/>
+  <w:style w:styleId="Hyperlink" w:type="character">
+    <w:name w:val="Hyperlink"/>
+    <w:basedOn w:val="BodyTextChar"/>
+    <w:rPr>
+      <w:color w:themeColor="accent1" w:val="4F81BD"/>
+    </w:rPr>
+  </w:style>
+  <w:style w:styleId="TOCHeading" w:type="paragraph">
+    <w:name w:val="TOC Heading"/>
+    <w:basedOn w:val="Heading1"/>
+    <w:next w:val="BodyText"/>
+    <w:uiPriority w:val="39"/>
     <w:unhideWhenUsed/>
+    <w:qFormat/>
     <w:pPr>
-      <w:spacing w:after="0" w:line="240" w:lineRule="auto"/>
+      <w:spacing w:before="240" w:line="259" w:lineRule="auto"/>
+      <w:outlineLvl w:val="9"/>
     </w:pPr>
     <w:rPr>
-      <w:sz w:val="20"/>
-      <w:szCs w:val="20"/>
+      <w:rFonts w:asciiTheme="majorHAnsi" w:cstheme="majorBidi" w:eastAsiaTheme="majorEastAsia" w:hAnsiTheme="majorHAnsi"/>
+      <w:b w:val="0"/>
+      <w:bCs w:val="0"/>
+      <w:color w:themeColor="accent1" w:themeShade="BF" w:val="365F91"/>
     </w:rPr>
-  </w:style>
-  <w:style w:styleId="EndnoteTextChar" w:type="character">
-    <w:name w:val="Endnote Text Char"/>
-    <w:basedOn w:val="DefaultParagraphFont"/>
-    <w:link w:val="EndnoteText"/>
-    <w:uiPriority w:val="99"/>
-    <w:semiHidden/>
-    <w:unhideWhenUsed/>
-    <w:rPr>
-      <w:sz w:val="20"/>
-      <w:szCs w:val="20"/>
-    </w:rPr>
-  </w:style>
-  <w:style w:customStyle="1" w:styleId="SourceCode" w:type="paragraph">
-    <w:name w:val="Source Code"/>
-    <w:basedOn w:val="Normal"/>
-    <w:link w:val="VerbatimChar"/>
-    <w:pPr>
-      <w:wordWrap w:val="off"/>
-    </w:pPr>
-  </w:style>
-  <w:style w:customStyle="1" w:styleId="KeywordTok" w:type="character">
-    <w:name w:val="KeywordTok"/>
-    <w:basedOn w:val="VerbatimChar"/>
-    <w:rPr>
-      <w:b/>
-      <w:color w:val="007020"/>
-    </w:rPr>
-  </w:style>
-  <w:style w:customStyle="1" w:styleId="DataTypeTok" w:type="character">
-    <w:name w:val="DataTypeTok"/>
-    <w:basedOn w:val="VerbatimChar"/>
-    <w:rPr>
-      <w:color w:val="902000"/>
-    </w:rPr>
-  </w:style>
-  <w:style w:customStyle="1" w:styleId="DecValTok" w:type="character">
-    <w:name w:val="DecValTok"/>
-    <w:basedOn w:val="VerbatimChar"/>
-    <w:rPr>
-      <w:color w:val="40a070"/>
-    </w:rPr>
-  </w:style>
-  <w:style w:customStyle="1" w:styleId="BaseNTok" w:type="character">
-    <w:name w:val="BaseNTok"/>
-    <w:basedOn w:val="VerbatimChar"/>
-    <w:rPr>
-      <w:color w:val="40a070"/>
-    </w:rPr>
-  </w:style>
-  <w:style w:customStyle="1" w:styleId="FloatTok" w:type="character">
-    <w:name w:val="FloatTok"/>
-    <w:basedOn w:val="VerbatimChar"/>
-    <w:rPr>
-      <w:color w:val="40a070"/>
-    </w:rPr>
-  </w:style>
-  <w:style w:customStyle="1" w:styleId="ConstantTok" w:type="character">
-    <w:name w:val="ConstantTok"/>
-    <w:basedOn w:val="VerbatimChar"/>
-    <w:rPr>
-      <w:color w:val="880000"/>
-    </w:rPr>
-  </w:style>
-  <w:style w:customStyle="1" w:styleId="CharTok" w:type="character">
-    <w:name w:val="CharTok"/>
-    <w:basedOn w:val="VerbatimChar"/>
-    <w:rPr>
-      <w:color w:val="4070a0"/>
-    </w:rPr>
-  </w:style>
-  <w:style w:customStyle="1" w:styleId="SpecialCharTok" w:type="character">
-    <w:name w:val="SpecialCharTok"/>
-    <w:basedOn w:val="VerbatimChar"/>
-    <w:rPr>
-      <w:color w:val="4070a0"/>
-    </w:rPr>
-  </w:style>
-  <w:style w:customStyle="1" w:styleId="StringTok" w:type="character">
-    <w:name w:val="StringTok"/>
-    <w:basedOn w:val="VerbatimChar"/>
-    <w:rPr>
-      <w:color w:val="4070a0"/>
-    </w:rPr>
-  </w:style>
-  <w:style w:customStyle="1" w:styleId="VerbatimStringTok" w:type="character">
-    <w:name w:val="VerbatimStringTok"/>
-    <w:basedOn w:val="VerbatimChar"/>
-    <w:rPr>
-      <w:color w:val="4070a0"/>
-    </w:rPr>
-  </w:style>
-  <w:style w:customStyle="1" w:styleId="SpecialStringTok" w:type="character">
-    <w:name w:val="SpecialStringTok"/>
-    <w:basedOn w:val="VerbatimChar"/>
-    <w:rPr>
-      <w:color w:val="bb6688"/>
-    </w:rPr>
-  </w:style>
-  <w:style w:customStyle="1" w:styleId="ImportTok" w:type="character">
-    <w:name w:val="ImportTok"/>
-    <w:basedOn w:val="VerbatimChar"/>
-    <w:rPr>
-      <w:b/>
-      <w:color w:val="008000"/>
-    </w:rPr>
-  </w:style>
-  <w:style w:customStyle="1" w:styleId="CommentTok" w:type="character">
-    <w:name w:val="CommentTok"/>
-    <w:basedOn w:val="VerbatimChar"/>
-    <w:rPr>
-      <w:i/>
-      <w:color w:val="60a0b0"/>
-    </w:rPr>
-  </w:style>
-  <w:style w:customStyle="1" w:styleId="DocumentationTok" w:type="character">
-    <w:name w:val="DocumentationTok"/>
-    <w:basedOn w:val="VerbatimChar"/>
-    <w:rPr>
-      <w:i/>
-      <w:color w:val="ba2121"/>
-    </w:rPr>
-  </w:style>
-  <w:style w:customStyle="1" w:styleId="AnnotationTok" w:type="character">
-    <w:name w:val="AnnotationTok"/>
-    <w:basedOn w:val="VerbatimChar"/>
-    <w:rPr>
-      <w:b/>
-      <w:i/>
-      <w:color w:val="60a0b0"/>
-    </w:rPr>
-  </w:style>
-  <w:style w:customStyle="1" w:styleId="CommentVarTok" w:type="character">
-    <w:name w:val="CommentVarTok"/>
-    <w:basedOn w:val="VerbatimChar"/>
-    <w:rPr>
-      <w:b/>
-      <w:i/>
-      <w:color w:val="60a0b0"/>
-    </w:rPr>
-  </w:style>
-  <w:style w:customStyle="1" w:styleId="OtherTok" w:type="character">
-    <w:name w:val="OtherTok"/>
-    <w:basedOn w:val="VerbatimChar"/>
-    <w:rPr>
-      <w:color w:val="007020"/>
-    </w:rPr>
-  </w:style>
-  <w:style w:customStyle="1" w:styleId="FunctionTok" w:type="character">
-    <w:name w:val="FunctionTok"/>
-    <w:basedOn w:val="VerbatimChar"/>
-    <w:rPr>
-      <w:color w:val="06287e"/>
-    </w:rPr>
-  </w:style>
-  <w:style w:customStyle="1" w:styleId="VariableTok" w:type="character">
-    <w:name w:val="VariableTok"/>
-    <w:basedOn w:val="VerbatimChar"/>
-    <w:rPr>
-      <w:color w:val="19177c"/>
-    </w:rPr>
-  </w:style>
-  <w:style w:customStyle="1" w:styleId="ControlFlowTok" w:type="character">
-    <w:name w:val="ControlFlowTok"/>
-    <w:basedOn w:val="VerbatimChar"/>
-    <w:rPr>
-      <w:b/>
-      <w:color w:val="007020"/>
-    </w:rPr>
-  </w:style>
-  <w:style w:customStyle="1" w:styleId="OperatorTok" w:type="character">
-    <w:name w:val="OperatorTok"/>
-    <w:basedOn w:val="VerbatimChar"/>
-    <w:rPr>
-      <w:color w:val="666666"/>
-    </w:rPr>
-  </w:style>
-  <w:style w:customStyle="1" w:styleId="BuiltInTok" w:type="character">
-    <w:name w:val="BuiltInTok"/>
-    <w:basedOn w:val="VerbatimChar"/>
-    <w:rPr>
-      <w:color w:val="008000"/>
-    </w:rPr>
-  </w:style>
-  <w:style w:customStyle="1" w:styleId="ExtensionTok" w:type="character">
-    <w:name w:val="ExtensionTok"/>
-    <w:basedOn w:val="VerbatimChar"/>
-    <w:rPr/>
-  </w:style>
-  <w:style w:customStyle="1" w:styleId="PreprocessorTok" w:type="character">
-    <w:name w:val="PreprocessorTok"/>
-    <w:basedOn w:val="VerbatimChar"/>
-    <w:rPr>
-      <w:color w:val="bc7a00"/>
-    </w:rPr>
-  </w:style>
-  <w:style w:customStyle="1" w:styleId="AttributeTok" w:type="character">
-    <w:name w:val="AttributeTok"/>
-    <w:basedOn w:val="VerbatimChar"/>
-    <w:rPr>
-      <w:color w:val="7d9029"/>
-    </w:rPr>
-  </w:style>
-  <w:style w:customStyle="1" w:styleId="RegionMarkerTok" w:type="character">
-    <w:name w:val="RegionMarkerTok"/>
-    <w:basedOn w:val="VerbatimChar"/>
-    <w:rPr/>
-  </w:style>
-  <w:style w:customStyle="1" w:styleId="InformationTok" w:type="character">
-    <w:name w:val="InformationTok"/>
-    <w:basedOn w:val="VerbatimChar"/>
-    <w:rPr>
-      <w:b/>
-      <w:i/>
-      <w:color w:val="60a0b0"/>
-    </w:rPr>
-  </w:style>
-  <w:style w:customStyle="1" w:styleId="WarningTok" w:type="character">
-    <w:name w:val="WarningTok"/>
-    <w:basedOn w:val="VerbatimChar"/>
-    <w:rPr>
-      <w:b/>
-      <w:i/>
-      <w:color w:val="60a0b0"/>
-    </w:rPr>
-  </w:style>
-  <w:style w:customStyle="1" w:styleId="AlertTok" w:type="character">
-    <w:name w:val="AlertTok"/>
-    <w:basedOn w:val="VerbatimChar"/>
-    <w:rPr>
-      <w:b/>
-      <w:color w:val="ff0000"/>
-    </w:rPr>
-  </w:style>
-  <w:style w:customStyle="1" w:styleId="ErrorTok" w:type="character">
-    <w:name w:val="ErrorTok"/>
-    <w:basedOn w:val="VerbatimChar"/>
-    <w:rPr>
-      <w:b/>
-      <w:color w:val="ff0000"/>
-    </w:rPr>
-  </w:style>
-  <w:style w:customStyle="1" w:styleId="NormalTok" w:type="character">
-    <w:name w:val="NormalTok"/>
-    <w:basedOn w:val="VerbatimChar"/>
-    <w:rPr/>
-  </w:style>
-  <w:style w:styleId="Table" w:type="table">
-    <w:name w:val="Table"/>
-    <w:tblPr>
-      <w:tblBorders>
-        <w:top w:color="000000" w:space="0" w:sz="4" w:val="single"/>
-        <w:left w:color="000000" w:space="0" w:sz="4" w:val="single"/>
-        <w:bottom w:color="000000" w:space="0" w:sz="4" w:val="single"/>
-        <w:right w:color="000000" w:space="0" w:sz="4" w:val="single"/>
-        <w:insideH w:color="000000" w:space="0" w:sz="4" w:val="single"/>
-        <w:insideV w:color="000000" w:space="0" w:sz="4" w:val="single"/>
-      </w:tblBorders>
-    </w:tblPr>
-  </w:style>
-  <w:style w:customStyle="1" w:styleId="SourceCode" w:type="paragraph">
-    <w:name w:val="Source Code"/>
-    <w:basedOn w:val="Normal"/>
-    <w:link w:val="VerbatimChar"/>
-    <w:pPr>
-      <w:wordWrap w:val="off"/>
-    </w:pPr>
-  </w:style>
-  <w:style w:customStyle="1" w:styleId="KeywordTok" w:type="character">
-    <w:name w:val="KeywordTok"/>
-    <w:basedOn w:val="VerbatimChar"/>
-    <w:rPr>
-      <w:b/>
-      <w:color w:val="007020"/>
-    </w:rPr>
-  </w:style>
-  <w:style w:customStyle="1" w:styleId="DataTypeTok" w:type="character">
-    <w:name w:val="DataTypeTok"/>
-    <w:basedOn w:val="VerbatimChar"/>
-    <w:rPr>
-      <w:color w:val="902000"/>
-    </w:rPr>
-  </w:style>
-  <w:style w:customStyle="1" w:styleId="DecValTok" w:type="character">
-    <w:name w:val="DecValTok"/>
-    <w:basedOn w:val="VerbatimChar"/>
-    <w:rPr>
-      <w:color w:val="40a070"/>
-    </w:rPr>
-  </w:style>
-  <w:style w:customStyle="1" w:styleId="BaseNTok" w:type="character">
-    <w:name w:val="BaseNTok"/>
-    <w:basedOn w:val="VerbatimChar"/>
-    <w:rPr>
-      <w:color w:val="40a070"/>
-    </w:rPr>
-  </w:style>
-  <w:style w:customStyle="1" w:styleId="FloatTok" w:type="character">
-    <w:name w:val="FloatTok"/>
-    <w:basedOn w:val="VerbatimChar"/>
-    <w:rPr>
-      <w:color w:val="40a070"/>
-    </w:rPr>
-  </w:style>
-  <w:style w:customStyle="1" w:styleId="ConstantTok" w:type="character">
-    <w:name w:val="ConstantTok"/>
-    <w:basedOn w:val="VerbatimChar"/>
-    <w:rPr>
-      <w:color w:val="880000"/>
-    </w:rPr>
-  </w:style>
-  <w:style w:customStyle="1" w:styleId="CharTok" w:type="character">
-    <w:name w:val="CharTok"/>
-    <w:basedOn w:val="VerbatimChar"/>
-    <w:rPr>
-      <w:color w:val="4070a0"/>
-    </w:rPr>
-  </w:style>
-  <w:style w:customStyle="1" w:styleId="SpecialCharTok" w:type="character">
-    <w:name w:val="SpecialCharTok"/>
-    <w:basedOn w:val="VerbatimChar"/>
-    <w:rPr>
-      <w:color w:val="4070a0"/>
-    </w:rPr>
-  </w:style>
-  <w:style w:customStyle="1" w:styleId="StringTok" w:type="character">
-    <w:name w:val="StringTok"/>
-    <w:basedOn w:val="VerbatimChar"/>
-    <w:rPr>
-      <w:color w:val="4070a0"/>
-    </w:rPr>
-  </w:style>
-  <w:style w:customStyle="1" w:styleId="VerbatimStringTok" w:type="character">
-    <w:name w:val="VerbatimStringTok"/>
-    <w:basedOn w:val="VerbatimChar"/>
-    <w:rPr>
-      <w:color w:val="4070a0"/>
-    </w:rPr>
-  </w:style>
-  <w:style w:customStyle="1" w:styleId="SpecialStringTok" w:type="character">
-    <w:name w:val="SpecialStringTok"/>
-    <w:basedOn w:val="VerbatimChar"/>
-    <w:rPr>
-      <w:color w:val="bb6688"/>
-    </w:rPr>
-  </w:style>
-  <w:style w:customStyle="1" w:styleId="ImportTok" w:type="character">
-    <w:name w:val="ImportTok"/>
-    <w:basedOn w:val="VerbatimChar"/>
-    <w:rPr>
-      <w:b/>
-      <w:color w:val="008000"/>
-    </w:rPr>
-  </w:style>
-  <w:style w:customStyle="1" w:styleId="CommentTok" w:type="character">
-    <w:name w:val="CommentTok"/>
-    <w:basedOn w:val="VerbatimChar"/>
-    <w:rPr>
-      <w:i/>
-      <w:color w:val="60a0b0"/>
-    </w:rPr>
-  </w:style>
-  <w:style w:customStyle="1" w:styleId="DocumentationTok" w:type="character">
-    <w:name w:val="DocumentationTok"/>
-    <w:basedOn w:val="VerbatimChar"/>
-    <w:rPr>
-      <w:i/>
-      <w:color w:val="ba2121"/>
-    </w:rPr>
-  </w:style>
-  <w:style w:customStyle="1" w:styleId="AnnotationTok" w:type="character">
-    <w:name w:val="AnnotationTok"/>
-    <w:basedOn w:val="VerbatimChar"/>
-    <w:rPr>
-      <w:b/>
-      <w:i/>
-      <w:color w:val="60a0b0"/>
-    </w:rPr>
-  </w:style>
-  <w:style w:customStyle="1" w:styleId="CommentVarTok" w:type="character">
-    <w:name w:val="CommentVarTok"/>
-    <w:basedOn w:val="VerbatimChar"/>
-    <w:rPr>
-      <w:b/>
-      <w:i/>
-      <w:color w:val="60a0b0"/>
-    </w:rPr>
-  </w:style>
-  <w:style w:customStyle="1" w:styleId="OtherTok" w:type="character">
-    <w:name w:val="OtherTok"/>
-    <w:basedOn w:val="VerbatimChar"/>
-    <w:rPr>
-      <w:color w:val="007020"/>
-    </w:rPr>
-  </w:style>
-  <w:style w:customStyle="1" w:styleId="FunctionTok" w:type="character">
-    <w:name w:val="FunctionTok"/>
-    <w:basedOn w:val="VerbatimChar"/>
-    <w:rPr>
-      <w:color w:val="06287e"/>
-    </w:rPr>
-  </w:style>
-  <w:style w:customStyle="1" w:styleId="VariableTok" w:type="character">
-    <w:name w:val="VariableTok"/>
-    <w:basedOn w:val="VerbatimChar"/>
-    <w:rPr>
-      <w:color w:val="19177c"/>
-    </w:rPr>
-  </w:style>
-  <w:style w:customStyle="1" w:styleId="ControlFlowTok" w:type="character">
-    <w:name w:val="ControlFlowTok"/>
-    <w:basedOn w:val="VerbatimChar"/>
-    <w:rPr>
-      <w:b/>
-      <w:color w:val="007020"/>
-    </w:rPr>
-  </w:style>
-  <w:style w:customStyle="1" w:styleId="OperatorTok" w:type="character">
-    <w:name w:val="OperatorTok"/>
-    <w:basedOn w:val="VerbatimChar"/>
-    <w:rPr>
-      <w:color w:val="666666"/>
-    </w:rPr>
-  </w:style>
-  <w:style w:customStyle="1" w:styleId="BuiltInTok" w:type="character">
-    <w:name w:val="BuiltInTok"/>
-    <w:basedOn w:val="VerbatimChar"/>
-    <w:rPr>
-      <w:color w:val="008000"/>
-    </w:rPr>
-  </w:style>
-  <w:style w:customStyle="1" w:styleId="ExtensionTok" w:type="character">
-    <w:name w:val="ExtensionTok"/>
-    <w:basedOn w:val="VerbatimChar"/>
-    <w:rPr/>
-  </w:style>
-  <w:style w:customStyle="1" w:styleId="PreprocessorTok" w:type="character">
-    <w:name w:val="PreprocessorTok"/>
-    <w:basedOn w:val="VerbatimChar"/>
-    <w:rPr>
-      <w:color w:val="bc7a00"/>
-    </w:rPr>
-  </w:style>
-  <w:style w:customStyle="1" w:styleId="AttributeTok" w:type="character">
-    <w:name w:val="AttributeTok"/>
-    <w:basedOn w:val="VerbatimChar"/>
-    <w:rPr>
-      <w:color w:val="7d9029"/>
-    </w:rPr>
-  </w:style>
-  <w:style w:customStyle="1" w:styleId="RegionMarkerTok" w:type="character">
-    <w:name w:val="RegionMarkerTok"/>
-    <w:basedOn w:val="VerbatimChar"/>
-    <w:rPr/>
-  </w:style>
-  <w:style w:customStyle="1" w:styleId="InformationTok" w:type="character">
-    <w:name w:val="InformationTok"/>
-    <w:basedOn w:val="VerbatimChar"/>
-    <w:rPr>
-      <w:b/>
-      <w:i/>
-      <w:color w:val="60a0b0"/>
-    </w:rPr>
-  </w:style>
-  <w:style w:customStyle="1" w:styleId="WarningTok" w:type="character">
-    <w:name w:val="WarningTok"/>
-    <w:basedOn w:val="VerbatimChar"/>
-    <w:rPr>
-      <w:b/>
-      <w:i/>
-      <w:color w:val="60a0b0"/>
-    </w:rPr>
-  </w:style>
-  <w:style w:customStyle="1" w:styleId="AlertTok" w:type="character">
-    <w:name w:val="AlertTok"/>
-    <w:basedOn w:val="VerbatimChar"/>
-    <w:rPr>
-      <w:b/>
-      <w:color w:val="ff0000"/>
-    </w:rPr>
-  </w:style>
-  <w:style w:customStyle="1" w:styleId="ErrorTok" w:type="character">
-    <w:name w:val="ErrorTok"/>
-    <w:basedOn w:val="VerbatimChar"/>
-    <w:rPr>
-      <w:b/>
-      <w:color w:val="ff0000"/>
-    </w:rPr>
-  </w:style>
-  <w:style w:customStyle="1" w:styleId="NormalTok" w:type="character">
-    <w:name w:val="NormalTok"/>
-    <w:basedOn w:val="VerbatimChar"/>
-    <w:rPr/>
-  </w:style>
-  <w:style w:customStyle="1" w:styleId="SourceCode" w:type="paragraph">
-    <w:name w:val="Source Code"/>
-    <w:basedOn w:val="Normal"/>
-    <w:link w:val="VerbatimChar"/>
-    <w:pPr>
-      <w:wordWrap w:val="off"/>
-    </w:pPr>
-  </w:style>
-  <w:style w:customStyle="1" w:styleId="KeywordTok" w:type="character">
-    <w:name w:val="KeywordTok"/>
-    <w:basedOn w:val="VerbatimChar"/>
-    <w:rPr>
-      <w:b/>
-      <w:color w:val="007020"/>
-    </w:rPr>
-  </w:style>
-  <w:style w:customStyle="1" w:styleId="DataTypeTok" w:type="character">
-    <w:name w:val="DataTypeTok"/>
-    <w:basedOn w:val="VerbatimChar"/>
-    <w:rPr>
-      <w:color w:val="902000"/>
-    </w:rPr>
-  </w:style>
-  <w:style w:customStyle="1" w:styleId="DecValTok" w:type="character">
-    <w:name w:val="DecValTok"/>
-    <w:basedOn w:val="VerbatimChar"/>
-    <w:rPr>
-      <w:color w:val="40a070"/>
-    </w:rPr>
-  </w:style>
-  <w:style w:customStyle="1" w:styleId="BaseNTok" w:type="character">
-    <w:name w:val="BaseNTok"/>
-    <w:basedOn w:val="VerbatimChar"/>
-    <w:rPr>
-      <w:color w:val="40a070"/>
-    </w:rPr>
-  </w:style>
-  <w:style w:customStyle="1" w:styleId="FloatTok" w:type="character">
-    <w:name w:val="FloatTok"/>
-    <w:basedOn w:val="VerbatimChar"/>
-    <w:rPr>
-      <w:color w:val="40a070"/>
-    </w:rPr>
-  </w:style>
-  <w:style w:customStyle="1" w:styleId="ConstantTok" w:type="character">
-    <w:name w:val="ConstantTok"/>
-    <w:basedOn w:val="VerbatimChar"/>
-    <w:rPr>
-      <w:color w:val="880000"/>
-    </w:rPr>
-  </w:style>
-  <w:style w:customStyle="1" w:styleId="CharTok" w:type="character">
-    <w:name w:val="CharTok"/>
-    <w:basedOn w:val="VerbatimChar"/>
-    <w:rPr>
-      <w:color w:val="4070a0"/>
-    </w:rPr>
-  </w:style>
-  <w:style w:customStyle="1" w:styleId="SpecialCharTok" w:type="character">
-    <w:name w:val="SpecialCharTok"/>
-    <w:basedOn w:val="VerbatimChar"/>
-    <w:rPr>
-      <w:color w:val="4070a0"/>
-    </w:rPr>
-  </w:style>
-  <w:style w:customStyle="1" w:styleId="StringTok" w:type="character">
-    <w:name w:val="StringTok"/>
-    <w:basedOn w:val="VerbatimChar"/>
-    <w:rPr>
-      <w:color w:val="4070a0"/>
-    </w:rPr>
-  </w:style>
-  <w:style w:customStyle="1" w:styleId="VerbatimStringTok" w:type="character">
-    <w:name w:val="VerbatimStringTok"/>
-    <w:basedOn w:val="VerbatimChar"/>
-    <w:rPr>
-      <w:color w:val="4070a0"/>
-    </w:rPr>
-  </w:style>
-  <w:style w:customStyle="1" w:styleId="SpecialStringTok" w:type="character">
-    <w:name w:val="SpecialStringTok"/>
-    <w:basedOn w:val="VerbatimChar"/>
-    <w:rPr>
-      <w:color w:val="bb6688"/>
-    </w:rPr>
-  </w:style>
-  <w:style w:customStyle="1" w:styleId="ImportTok" w:type="character">
-    <w:name w:val="ImportTok"/>
-    <w:basedOn w:val="VerbatimChar"/>
-    <w:rPr>
-      <w:b/>
-      <w:color w:val="008000"/>
-    </w:rPr>
-  </w:style>
-  <w:style w:customStyle="1" w:styleId="CommentTok" w:type="character">
-    <w:name w:val="CommentTok"/>
-    <w:basedOn w:val="VerbatimChar"/>
-    <w:rPr>
-      <w:i/>
-      <w:color w:val="60a0b0"/>
-    </w:rPr>
-  </w:style>
-  <w:style w:customStyle="1" w:styleId="DocumentationTok" w:type="character">
-    <w:name w:val="DocumentationTok"/>
-    <w:basedOn w:val="VerbatimChar"/>
-    <w:rPr>
-      <w:i/>
-      <w:color w:val="ba2121"/>
-    </w:rPr>
-  </w:style>
-  <w:style w:customStyle="1" w:styleId="AnnotationTok" w:type="character">
-    <w:name w:val="AnnotationTok"/>
-    <w:basedOn w:val="VerbatimChar"/>
-    <w:rPr>
-      <w:b/>
-      <w:i/>
-      <w:color w:val="60a0b0"/>
-    </w:rPr>
-  </w:style>
-  <w:style w:customStyle="1" w:styleId="CommentVarTok" w:type="character">
-    <w:name w:val="CommentVarTok"/>
-    <w:basedOn w:val="VerbatimChar"/>
-    <w:rPr>
-      <w:b/>
-      <w:i/>
-      <w:color w:val="60a0b0"/>
-    </w:rPr>
-  </w:style>
-  <w:style w:customStyle="1" w:styleId="OtherTok" w:type="character">
-    <w:name w:val="OtherTok"/>
-    <w:basedOn w:val="VerbatimChar"/>
-    <w:rPr>
-      <w:color w:val="007020"/>
-    </w:rPr>
-  </w:style>
-  <w:style w:customStyle="1" w:styleId="FunctionTok" w:type="character">
-    <w:name w:val="FunctionTok"/>
-    <w:basedOn w:val="VerbatimChar"/>
-    <w:rPr>
-      <w:color w:val="06287e"/>
-    </w:rPr>
-  </w:style>
-  <w:style w:customStyle="1" w:styleId="VariableTok" w:type="character">
-    <w:name w:val="VariableTok"/>
-    <w:basedOn w:val="VerbatimChar"/>
-    <w:rPr>
-      <w:color w:val="19177c"/>
-    </w:rPr>
-  </w:style>
-  <w:style w:customStyle="1" w:styleId="ControlFlowTok" w:type="character">
-    <w:name w:val="ControlFlowTok"/>
-    <w:basedOn w:val="VerbatimChar"/>
-    <w:rPr>
-      <w:b/>
-      <w:color w:val="007020"/>
-    </w:rPr>
-  </w:style>
-  <w:style w:customStyle="1" w:styleId="OperatorTok" w:type="character">
-    <w:name w:val="OperatorTok"/>
-    <w:basedOn w:val="VerbatimChar"/>
-    <w:rPr>
-      <w:color w:val="666666"/>
-    </w:rPr>
-  </w:style>
-  <w:style w:customStyle="1" w:styleId="BuiltInTok" w:type="character">
-    <w:name w:val="BuiltInTok"/>
-    <w:basedOn w:val="VerbatimChar"/>
-    <w:rPr>
-      <w:color w:val="008000"/>
-    </w:rPr>
-  </w:style>
-  <w:style w:customStyle="1" w:styleId="ExtensionTok" w:type="character">
-    <w:name w:val="ExtensionTok"/>
-    <w:basedOn w:val="VerbatimChar"/>
-    <w:rPr/>
-  </w:style>
-  <w:style w:customStyle="1" w:styleId="PreprocessorTok" w:type="character">
-    <w:name w:val="PreprocessorTok"/>
-    <w:basedOn w:val="VerbatimChar"/>
-    <w:rPr>
-      <w:color w:val="bc7a00"/>
-    </w:rPr>
-  </w:style>
-  <w:style w:customStyle="1" w:styleId="AttributeTok" w:type="character">
-    <w:name w:val="AttributeTok"/>
-    <w:basedOn w:val="VerbatimChar"/>
-    <w:rPr>
-      <w:color w:val="7d9029"/>
-    </w:rPr>
-  </w:style>
-  <w:style w:customStyle="1" w:styleId="RegionMarkerTok" w:type="character">
-    <w:name w:val="RegionMarkerTok"/>
-    <w:basedOn w:val="VerbatimChar"/>
-    <w:rPr/>
-  </w:style>
-  <w:style w:customStyle="1" w:styleId="InformationTok" w:type="character">
-    <w:name w:val="InformationTok"/>
-    <w:basedOn w:val="VerbatimChar"/>
-    <w:rPr>
-      <w:b/>
-      <w:i/>
-      <w:color w:val="60a0b0"/>
-    </w:rPr>
-  </w:style>
-  <w:style w:customStyle="1" w:styleId="WarningTok" w:type="character">
-    <w:name w:val="WarningTok"/>
-    <w:basedOn w:val="VerbatimChar"/>
-    <w:rPr>
-      <w:b/>
-      <w:i/>
-      <w:color w:val="60a0b0"/>
-    </w:rPr>
-  </w:style>
-  <w:style w:customStyle="1" w:styleId="AlertTok" w:type="character">
-    <w:name w:val="AlertTok"/>
-    <w:basedOn w:val="VerbatimChar"/>
-    <w:rPr>
-      <w:b/>
-      <w:color w:val="ff0000"/>
-    </w:rPr>
-  </w:style>
-  <w:style w:customStyle="1" w:styleId="ErrorTok" w:type="character">
-    <w:name w:val="ErrorTok"/>
-    <w:basedOn w:val="VerbatimChar"/>
-    <w:rPr>
-      <w:b/>
-      <w:color w:val="ff0000"/>
-    </w:rPr>
-  </w:style>
-  <w:style w:customStyle="1" w:styleId="NormalTok" w:type="character">
-    <w:name w:val="NormalTok"/>
-    <w:basedOn w:val="VerbatimChar"/>
-    <w:rPr/>
   </w:style>
   <w:style w:type="paragraph" w:customStyle="1" w:styleId="SourceCode">
     <w:name w:val="Source Code"/>

</xml_diff>

<commit_message>
IG: add missing WF-21 Vitamin D Assessment webhook URL (Handoff already had it)
Co-Authored-By: Claude Opus 4.8 <noreply@anthropic.com>
</commit_message>
<xml_diff>
--- a/Enyrgy_GHL_Implementation_Guide_v3_9.docx
+++ b/Enyrgy_GHL_Implementation_Guide_v3_9.docx
@@ -10275,6 +10275,17 @@
       </w:pPr>
       <w:r>
         <w:t xml:space="preserve">WF-19 (Winter Protocol): https://services.leadconnectorhq.com/hooks/GtXjla7Ld1dordsTWrVy/webhook-trigger/ad11ef02-14c8-4dbc-b1dd-bb5c9f3203bd</w:t>
+      </w:r>
+    </w:p>
+    <w:p>
+      <w:pPr>
+        <w:numPr>
+          <w:ilvl w:val="0"/>
+          <w:numId w:val="1007"/>
+        </w:numPr>
+      </w:pPr>
+      <w:r>
+        <w:t xml:space="preserve">WF-21 (Vitamin D Assessment): https://services.leadconnectorhq.com/hooks/GtXjla7Ld1dordsTWrVy/webhook-trigger/d2692dc6-1e9f-466c-8525-58c466c426bd</w:t>
       </w:r>
     </w:p>
     <w:p>

</xml_diff>

<commit_message>
Impl Guide: retire 3.8B and 'supplements fail 1 in 4' from the investor pitch flow
The investor pitch outline still opened on two claims the KB retired. It is a
spoken track rather than a sent asset, which is likely how it survived the
sweep that caught the drips, but it is the line someone reads straight off the
page into an investor meeting.

3.8B deficient worldwide -> vitamin D runs low in 77 percent of indoor adults.
supplements fail 1 in 4 -> about one in four trial participants were low
responders to supplementation. KB section 8 names the old phrase as never-use
and explicitly supersedes Implementation Guide v3.9 Section 22.

Co-Authored-By: Claude Opus 5 <noreply@anthropic.com>
</commit_message>
<xml_diff>
--- a/Enyrgy_GHL_Implementation_Guide_v3_9.docx
+++ b/Enyrgy_GHL_Implementation_Guide_v3_9.docx
@@ -1515,14 +1515,6 @@
     </w:p>
     <w:tbl>
       <w:tblPr>
-        <w:tblBorders>
-          <w:top w:val="single" w:sz="6" w:space="0" w:color="AAAAAA"/>
-          <w:left w:val="single" w:sz="6" w:space="0" w:color="AAAAAA"/>
-          <w:bottom w:val="single" w:sz="6" w:space="0" w:color="AAAAAA"/>
-          <w:right w:val="single" w:sz="6" w:space="0" w:color="AAAAAA"/>
-          <w:insideH w:val="single" w:sz="6" w:space="0" w:color="AAAAAA"/>
-          <w:insideV w:val="single" w:sz="6" w:space="0" w:color="AAAAAA"/>
-        </w:tblBorders>
         <w:tblStyle w:val="Table"/>
         <w:tblW w:type="pct" w:w="4929"/>
         <w:tblLayout w:type="fixed"/>
@@ -2053,14 +2045,6 @@
     </w:p>
     <w:tbl>
       <w:tblPr>
-        <w:tblBorders>
-          <w:top w:val="single" w:sz="6" w:space="0" w:color="AAAAAA"/>
-          <w:left w:val="single" w:sz="6" w:space="0" w:color="AAAAAA"/>
-          <w:bottom w:val="single" w:sz="6" w:space="0" w:color="AAAAAA"/>
-          <w:right w:val="single" w:sz="6" w:space="0" w:color="AAAAAA"/>
-          <w:insideH w:val="single" w:sz="6" w:space="0" w:color="AAAAAA"/>
-          <w:insideV w:val="single" w:sz="6" w:space="0" w:color="AAAAAA"/>
-        </w:tblBorders>
         <w:tblStyle w:val="Table"/>
         <w:tblW w:type="pct" w:w="4914"/>
         <w:tblLayout w:type="fixed"/>
@@ -2784,14 +2768,6 @@
     </w:p>
     <w:tbl>
       <w:tblPr>
-        <w:tblBorders>
-          <w:top w:val="single" w:sz="6" w:space="0" w:color="AAAAAA"/>
-          <w:left w:val="single" w:sz="6" w:space="0" w:color="AAAAAA"/>
-          <w:bottom w:val="single" w:sz="6" w:space="0" w:color="AAAAAA"/>
-          <w:right w:val="single" w:sz="6" w:space="0" w:color="AAAAAA"/>
-          <w:insideH w:val="single" w:sz="6" w:space="0" w:color="AAAAAA"/>
-          <w:insideV w:val="single" w:sz="6" w:space="0" w:color="AAAAAA"/>
-        </w:tblBorders>
         <w:tblStyle w:val="Table"/>
         <w:tblW w:type="pct" w:w="4921"/>
         <w:tblLayout w:type="fixed"/>
@@ -3035,14 +3011,6 @@
     </w:p>
     <w:tbl>
       <w:tblPr>
-        <w:tblBorders>
-          <w:top w:val="single" w:sz="6" w:space="0" w:color="AAAAAA"/>
-          <w:left w:val="single" w:sz="6" w:space="0" w:color="AAAAAA"/>
-          <w:bottom w:val="single" w:sz="6" w:space="0" w:color="AAAAAA"/>
-          <w:right w:val="single" w:sz="6" w:space="0" w:color="AAAAAA"/>
-          <w:insideH w:val="single" w:sz="6" w:space="0" w:color="AAAAAA"/>
-          <w:insideV w:val="single" w:sz="6" w:space="0" w:color="AAAAAA"/>
-        </w:tblBorders>
         <w:tblStyle w:val="Table"/>
         <w:tblW w:type="pct" w:w="4908"/>
         <w:tblLayout w:type="fixed"/>
@@ -3385,14 +3353,6 @@
     </w:p>
     <w:tbl>
       <w:tblPr>
-        <w:tblBorders>
-          <w:top w:val="single" w:sz="6" w:space="0" w:color="AAAAAA"/>
-          <w:left w:val="single" w:sz="6" w:space="0" w:color="AAAAAA"/>
-          <w:bottom w:val="single" w:sz="6" w:space="0" w:color="AAAAAA"/>
-          <w:right w:val="single" w:sz="6" w:space="0" w:color="AAAAAA"/>
-          <w:insideH w:val="single" w:sz="6" w:space="0" w:color="AAAAAA"/>
-          <w:insideV w:val="single" w:sz="6" w:space="0" w:color="AAAAAA"/>
-        </w:tblBorders>
         <w:tblStyle w:val="Table"/>
         <w:tblW w:type="pct" w:w="4906"/>
         <w:tblLayout w:type="fixed"/>
@@ -3697,14 +3657,6 @@
     </w:p>
     <w:tbl>
       <w:tblPr>
-        <w:tblBorders>
-          <w:top w:val="single" w:sz="6" w:space="0" w:color="AAAAAA"/>
-          <w:left w:val="single" w:sz="6" w:space="0" w:color="AAAAAA"/>
-          <w:bottom w:val="single" w:sz="6" w:space="0" w:color="AAAAAA"/>
-          <w:right w:val="single" w:sz="6" w:space="0" w:color="AAAAAA"/>
-          <w:insideH w:val="single" w:sz="6" w:space="0" w:color="AAAAAA"/>
-          <w:insideV w:val="single" w:sz="6" w:space="0" w:color="AAAAAA"/>
-        </w:tblBorders>
         <w:tblStyle w:val="Table"/>
         <w:tblW w:type="pct" w:w="4890"/>
         <w:tblLayout w:type="fixed"/>
@@ -4310,14 +4262,6 @@
     </w:p>
     <w:tbl>
       <w:tblPr>
-        <w:tblBorders>
-          <w:top w:val="single" w:sz="6" w:space="0" w:color="AAAAAA"/>
-          <w:left w:val="single" w:sz="6" w:space="0" w:color="AAAAAA"/>
-          <w:bottom w:val="single" w:sz="6" w:space="0" w:color="AAAAAA"/>
-          <w:right w:val="single" w:sz="6" w:space="0" w:color="AAAAAA"/>
-          <w:insideH w:val="single" w:sz="6" w:space="0" w:color="AAAAAA"/>
-          <w:insideV w:val="single" w:sz="6" w:space="0" w:color="AAAAAA"/>
-        </w:tblBorders>
         <w:tblStyle w:val="Table"/>
         <w:tblW w:type="pct" w:w="4932"/>
         <w:tblLayout w:type="fixed"/>
@@ -4670,14 +4614,6 @@
     </w:p>
     <w:tbl>
       <w:tblPr>
-        <w:tblBorders>
-          <w:top w:val="single" w:sz="6" w:space="0" w:color="AAAAAA"/>
-          <w:left w:val="single" w:sz="6" w:space="0" w:color="AAAAAA"/>
-          <w:bottom w:val="single" w:sz="6" w:space="0" w:color="AAAAAA"/>
-          <w:right w:val="single" w:sz="6" w:space="0" w:color="AAAAAA"/>
-          <w:insideH w:val="single" w:sz="6" w:space="0" w:color="AAAAAA"/>
-          <w:insideV w:val="single" w:sz="6" w:space="0" w:color="AAAAAA"/>
-        </w:tblBorders>
         <w:tblStyle w:val="Table"/>
         <w:tblW w:type="pct" w:w="4899"/>
         <w:tblLayout w:type="fixed"/>
@@ -5050,14 +4986,6 @@
     </w:p>
     <w:tbl>
       <w:tblPr>
-        <w:tblBorders>
-          <w:top w:val="single" w:sz="6" w:space="0" w:color="AAAAAA"/>
-          <w:left w:val="single" w:sz="6" w:space="0" w:color="AAAAAA"/>
-          <w:bottom w:val="single" w:sz="6" w:space="0" w:color="AAAAAA"/>
-          <w:right w:val="single" w:sz="6" w:space="0" w:color="AAAAAA"/>
-          <w:insideH w:val="single" w:sz="6" w:space="0" w:color="AAAAAA"/>
-          <w:insideV w:val="single" w:sz="6" w:space="0" w:color="AAAAAA"/>
-        </w:tblBorders>
         <w:tblStyle w:val="Table"/>
         <w:tblW w:type="pct" w:w="4888"/>
         <w:tblLayout w:type="fixed"/>
@@ -5443,14 +5371,6 @@
     </w:p>
     <w:tbl>
       <w:tblPr>
-        <w:tblBorders>
-          <w:top w:val="single" w:sz="6" w:space="0" w:color="AAAAAA"/>
-          <w:left w:val="single" w:sz="6" w:space="0" w:color="AAAAAA"/>
-          <w:bottom w:val="single" w:sz="6" w:space="0" w:color="AAAAAA"/>
-          <w:right w:val="single" w:sz="6" w:space="0" w:color="AAAAAA"/>
-          <w:insideH w:val="single" w:sz="6" w:space="0" w:color="AAAAAA"/>
-          <w:insideV w:val="single" w:sz="6" w:space="0" w:color="AAAAAA"/>
-        </w:tblBorders>
         <w:tblStyle w:val="Table"/>
         <w:tblW w:type="pct" w:w="4892"/>
         <w:tblLayout w:type="fixed"/>
@@ -5877,14 +5797,6 @@
     </w:p>
     <w:tbl>
       <w:tblPr>
-        <w:tblBorders>
-          <w:top w:val="single" w:sz="6" w:space="0" w:color="AAAAAA"/>
-          <w:left w:val="single" w:sz="6" w:space="0" w:color="AAAAAA"/>
-          <w:bottom w:val="single" w:sz="6" w:space="0" w:color="AAAAAA"/>
-          <w:right w:val="single" w:sz="6" w:space="0" w:color="AAAAAA"/>
-          <w:insideH w:val="single" w:sz="6" w:space="0" w:color="AAAAAA"/>
-          <w:insideV w:val="single" w:sz="6" w:space="0" w:color="AAAAAA"/>
-        </w:tblBorders>
         <w:tblStyle w:val="Table"/>
         <w:tblW w:type="pct" w:w="4878"/>
         <w:tblLayout w:type="fixed"/>
@@ -6237,14 +6149,6 @@
     </w:p>
     <w:tbl>
       <w:tblPr>
-        <w:tblBorders>
-          <w:top w:val="single" w:sz="6" w:space="0" w:color="AAAAAA"/>
-          <w:left w:val="single" w:sz="6" w:space="0" w:color="AAAAAA"/>
-          <w:bottom w:val="single" w:sz="6" w:space="0" w:color="AAAAAA"/>
-          <w:right w:val="single" w:sz="6" w:space="0" w:color="AAAAAA"/>
-          <w:insideH w:val="single" w:sz="6" w:space="0" w:color="AAAAAA"/>
-          <w:insideV w:val="single" w:sz="6" w:space="0" w:color="AAAAAA"/>
-        </w:tblBorders>
         <w:tblStyle w:val="Table"/>
         <w:tblW w:type="pct" w:w="4870"/>
         <w:tblLayout w:type="fixed"/>
@@ -6818,14 +6722,6 @@
     </w:p>
     <w:tbl>
       <w:tblPr>
-        <w:tblBorders>
-          <w:top w:val="single" w:sz="6" w:space="0" w:color="AAAAAA"/>
-          <w:left w:val="single" w:sz="6" w:space="0" w:color="AAAAAA"/>
-          <w:bottom w:val="single" w:sz="6" w:space="0" w:color="AAAAAA"/>
-          <w:right w:val="single" w:sz="6" w:space="0" w:color="AAAAAA"/>
-          <w:insideH w:val="single" w:sz="6" w:space="0" w:color="AAAAAA"/>
-          <w:insideV w:val="single" w:sz="6" w:space="0" w:color="AAAAAA"/>
-        </w:tblBorders>
         <w:tblStyle w:val="Table"/>
         <w:tblW w:type="pct" w:w="4957"/>
         <w:tblLayout w:type="fixed"/>
@@ -7024,14 +6920,6 @@
     </w:p>
     <w:tbl>
       <w:tblPr>
-        <w:tblBorders>
-          <w:top w:val="single" w:sz="6" w:space="0" w:color="AAAAAA"/>
-          <w:left w:val="single" w:sz="6" w:space="0" w:color="AAAAAA"/>
-          <w:bottom w:val="single" w:sz="6" w:space="0" w:color="AAAAAA"/>
-          <w:right w:val="single" w:sz="6" w:space="0" w:color="AAAAAA"/>
-          <w:insideH w:val="single" w:sz="6" w:space="0" w:color="AAAAAA"/>
-          <w:insideV w:val="single" w:sz="6" w:space="0" w:color="AAAAAA"/>
-        </w:tblBorders>
         <w:tblStyle w:val="Table"/>
         <w:tblW w:type="pct" w:w="4908"/>
         <w:tblLayout w:type="fixed"/>
@@ -7643,14 +7531,6 @@
     </w:p>
     <w:tbl>
       <w:tblPr>
-        <w:tblBorders>
-          <w:top w:val="single" w:sz="6" w:space="0" w:color="AAAAAA"/>
-          <w:left w:val="single" w:sz="6" w:space="0" w:color="AAAAAA"/>
-          <w:bottom w:val="single" w:sz="6" w:space="0" w:color="AAAAAA"/>
-          <w:right w:val="single" w:sz="6" w:space="0" w:color="AAAAAA"/>
-          <w:insideH w:val="single" w:sz="6" w:space="0" w:color="AAAAAA"/>
-          <w:insideV w:val="single" w:sz="6" w:space="0" w:color="AAAAAA"/>
-        </w:tblBorders>
         <w:tblStyle w:val="Table"/>
         <w:tblW w:type="pct" w:w="4922"/>
         <w:tblLayout w:type="fixed"/>
@@ -8344,14 +8224,6 @@
     </w:p>
     <w:tbl>
       <w:tblPr>
-        <w:tblBorders>
-          <w:top w:val="single" w:sz="6" w:space="0" w:color="AAAAAA"/>
-          <w:left w:val="single" w:sz="6" w:space="0" w:color="AAAAAA"/>
-          <w:bottom w:val="single" w:sz="6" w:space="0" w:color="AAAAAA"/>
-          <w:right w:val="single" w:sz="6" w:space="0" w:color="AAAAAA"/>
-          <w:insideH w:val="single" w:sz="6" w:space="0" w:color="AAAAAA"/>
-          <w:insideV w:val="single" w:sz="6" w:space="0" w:color="AAAAAA"/>
-        </w:tblBorders>
         <w:tblStyle w:val="Table"/>
         <w:tblW w:type="pct" w:w="4908"/>
         <w:tblLayout w:type="fixed"/>
@@ -8863,14 +8735,6 @@
     </w:p>
     <w:tbl>
       <w:tblPr>
-        <w:tblBorders>
-          <w:top w:val="single" w:sz="6" w:space="0" w:color="AAAAAA"/>
-          <w:left w:val="single" w:sz="6" w:space="0" w:color="AAAAAA"/>
-          <w:bottom w:val="single" w:sz="6" w:space="0" w:color="AAAAAA"/>
-          <w:right w:val="single" w:sz="6" w:space="0" w:color="AAAAAA"/>
-          <w:insideH w:val="single" w:sz="6" w:space="0" w:color="AAAAAA"/>
-          <w:insideV w:val="single" w:sz="6" w:space="0" w:color="AAAAAA"/>
-        </w:tblBorders>
         <w:tblStyle w:val="Table"/>
         <w:tblW w:type="pct" w:w="4939"/>
         <w:tblLayout w:type="fixed"/>
@@ -9568,14 +9432,6 @@
     </w:p>
     <w:tbl>
       <w:tblPr>
-        <w:tblBorders>
-          <w:top w:val="single" w:sz="6" w:space="0" w:color="AAAAAA"/>
-          <w:left w:val="single" w:sz="6" w:space="0" w:color="AAAAAA"/>
-          <w:bottom w:val="single" w:sz="6" w:space="0" w:color="AAAAAA"/>
-          <w:right w:val="single" w:sz="6" w:space="0" w:color="AAAAAA"/>
-          <w:insideH w:val="single" w:sz="6" w:space="0" w:color="AAAAAA"/>
-          <w:insideV w:val="single" w:sz="6" w:space="0" w:color="AAAAAA"/>
-        </w:tblBorders>
         <w:tblStyle w:val="Table"/>
         <w:tblW w:type="pct" w:w="4937"/>
         <w:tblLayout w:type="fixed"/>
@@ -10181,14 +10037,6 @@
     </w:p>
     <w:tbl>
       <w:tblPr>
-        <w:tblBorders>
-          <w:top w:val="single" w:sz="6" w:space="0" w:color="AAAAAA"/>
-          <w:left w:val="single" w:sz="6" w:space="0" w:color="AAAAAA"/>
-          <w:bottom w:val="single" w:sz="6" w:space="0" w:color="AAAAAA"/>
-          <w:right w:val="single" w:sz="6" w:space="0" w:color="AAAAAA"/>
-          <w:insideH w:val="single" w:sz="6" w:space="0" w:color="AAAAAA"/>
-          <w:insideV w:val="single" w:sz="6" w:space="0" w:color="AAAAAA"/>
-        </w:tblBorders>
         <w:tblStyle w:val="Table"/>
         <w:tblW w:type="pct" w:w="5000"/>
         <w:tblLayout w:type="fixed"/>
@@ -10584,14 +10432,6 @@
     </w:p>
     <w:tbl>
       <w:tblPr>
-        <w:tblBorders>
-          <w:top w:val="single" w:sz="6" w:space="0" w:color="AAAAAA"/>
-          <w:left w:val="single" w:sz="6" w:space="0" w:color="AAAAAA"/>
-          <w:bottom w:val="single" w:sz="6" w:space="0" w:color="AAAAAA"/>
-          <w:right w:val="single" w:sz="6" w:space="0" w:color="AAAAAA"/>
-          <w:insideH w:val="single" w:sz="6" w:space="0" w:color="AAAAAA"/>
-          <w:insideV w:val="single" w:sz="6" w:space="0" w:color="AAAAAA"/>
-        </w:tblBorders>
         <w:tblStyle w:val="Table"/>
         <w:tblW w:type="pct" w:w="5000"/>
         <w:tblLayout w:type="fixed"/>
@@ -11471,14 +11311,6 @@
     </w:p>
     <w:tbl>
       <w:tblPr>
-        <w:tblBorders>
-          <w:top w:val="single" w:sz="6" w:space="0" w:color="AAAAAA"/>
-          <w:left w:val="single" w:sz="6" w:space="0" w:color="AAAAAA"/>
-          <w:bottom w:val="single" w:sz="6" w:space="0" w:color="AAAAAA"/>
-          <w:right w:val="single" w:sz="6" w:space="0" w:color="AAAAAA"/>
-          <w:insideH w:val="single" w:sz="6" w:space="0" w:color="AAAAAA"/>
-          <w:insideV w:val="single" w:sz="6" w:space="0" w:color="AAAAAA"/>
-        </w:tblBorders>
         <w:tblStyle w:val="Table"/>
         <w:tblW w:type="pct" w:w="4913"/>
         <w:tblLayout w:type="fixed"/>
@@ -12281,14 +12113,6 @@
     </w:p>
     <w:tbl>
       <w:tblPr>
-        <w:tblBorders>
-          <w:top w:val="single" w:sz="6" w:space="0" w:color="AAAAAA"/>
-          <w:left w:val="single" w:sz="6" w:space="0" w:color="AAAAAA"/>
-          <w:bottom w:val="single" w:sz="6" w:space="0" w:color="AAAAAA"/>
-          <w:right w:val="single" w:sz="6" w:space="0" w:color="AAAAAA"/>
-          <w:insideH w:val="single" w:sz="6" w:space="0" w:color="AAAAAA"/>
-          <w:insideV w:val="single" w:sz="6" w:space="0" w:color="AAAAAA"/>
-        </w:tblBorders>
         <w:tblStyle w:val="Table"/>
         <w:tblW w:type="pct" w:w="4865"/>
         <w:tblLayout w:type="fixed"/>
@@ -12532,14 +12356,6 @@
     </w:p>
     <w:tbl>
       <w:tblPr>
-        <w:tblBorders>
-          <w:top w:val="single" w:sz="6" w:space="0" w:color="AAAAAA"/>
-          <w:left w:val="single" w:sz="6" w:space="0" w:color="AAAAAA"/>
-          <w:bottom w:val="single" w:sz="6" w:space="0" w:color="AAAAAA"/>
-          <w:right w:val="single" w:sz="6" w:space="0" w:color="AAAAAA"/>
-          <w:insideH w:val="single" w:sz="6" w:space="0" w:color="AAAAAA"/>
-          <w:insideV w:val="single" w:sz="6" w:space="0" w:color="AAAAAA"/>
-        </w:tblBorders>
         <w:tblStyle w:val="Table"/>
         <w:tblW w:type="pct" w:w="4907"/>
         <w:tblLayout w:type="fixed"/>
@@ -12807,14 +12623,6 @@
     </w:p>
     <w:tbl>
       <w:tblPr>
-        <w:tblBorders>
-          <w:top w:val="single" w:sz="6" w:space="0" w:color="AAAAAA"/>
-          <w:left w:val="single" w:sz="6" w:space="0" w:color="AAAAAA"/>
-          <w:bottom w:val="single" w:sz="6" w:space="0" w:color="AAAAAA"/>
-          <w:right w:val="single" w:sz="6" w:space="0" w:color="AAAAAA"/>
-          <w:insideH w:val="single" w:sz="6" w:space="0" w:color="AAAAAA"/>
-          <w:insideV w:val="single" w:sz="6" w:space="0" w:color="AAAAAA"/>
-        </w:tblBorders>
         <w:tblStyle w:val="Table"/>
         <w:tblW w:type="pct" w:w="4920"/>
         <w:tblLayout w:type="fixed"/>
@@ -13470,14 +13278,6 @@
     </w:p>
     <w:tbl>
       <w:tblPr>
-        <w:tblBorders>
-          <w:top w:val="single" w:sz="6" w:space="0" w:color="AAAAAA"/>
-          <w:left w:val="single" w:sz="6" w:space="0" w:color="AAAAAA"/>
-          <w:bottom w:val="single" w:sz="6" w:space="0" w:color="AAAAAA"/>
-          <w:right w:val="single" w:sz="6" w:space="0" w:color="AAAAAA"/>
-          <w:insideH w:val="single" w:sz="6" w:space="0" w:color="AAAAAA"/>
-          <w:insideV w:val="single" w:sz="6" w:space="0" w:color="AAAAAA"/>
-        </w:tblBorders>
         <w:tblStyle w:val="Table"/>
         <w:tblW w:type="pct" w:w="4910"/>
         <w:tblLayout w:type="fixed"/>
@@ -13773,14 +13573,6 @@
     </w:p>
     <w:tbl>
       <w:tblPr>
-        <w:tblBorders>
-          <w:top w:val="single" w:sz="6" w:space="0" w:color="AAAAAA"/>
-          <w:left w:val="single" w:sz="6" w:space="0" w:color="AAAAAA"/>
-          <w:bottom w:val="single" w:sz="6" w:space="0" w:color="AAAAAA"/>
-          <w:right w:val="single" w:sz="6" w:space="0" w:color="AAAAAA"/>
-          <w:insideH w:val="single" w:sz="6" w:space="0" w:color="AAAAAA"/>
-          <w:insideV w:val="single" w:sz="6" w:space="0" w:color="AAAAAA"/>
-        </w:tblBorders>
         <w:tblStyle w:val="Table"/>
         <w:tblW w:type="pct" w:w="4911"/>
         <w:tblLayout w:type="fixed"/>
@@ -14432,14 +14224,6 @@
     </w:p>
     <w:tbl>
       <w:tblPr>
-        <w:tblBorders>
-          <w:top w:val="single" w:sz="6" w:space="0" w:color="AAAAAA"/>
-          <w:left w:val="single" w:sz="6" w:space="0" w:color="AAAAAA"/>
-          <w:bottom w:val="single" w:sz="6" w:space="0" w:color="AAAAAA"/>
-          <w:right w:val="single" w:sz="6" w:space="0" w:color="AAAAAA"/>
-          <w:insideH w:val="single" w:sz="6" w:space="0" w:color="AAAAAA"/>
-          <w:insideV w:val="single" w:sz="6" w:space="0" w:color="AAAAAA"/>
-        </w:tblBorders>
         <w:tblStyle w:val="Table"/>
         <w:tblW w:type="pct" w:w="4933"/>
         <w:tblLayout w:type="fixed"/>
@@ -14956,7 +14740,7 @@
         </w:numPr>
       </w:pPr>
       <w:r>
-        <w:t xml:space="preserve">Company &amp; Problem (5 min): 3.8B deficient worldwide, supplements fail 1 in 4, no scalable UVB solution.</w:t>
+        <w:t xml:space="preserve">Company &amp; Problem (5 min): vitamin D runs low in 77 percent of indoor adults, about one in four trial participants were low responders to supplementation, no scalable UVB solution.</w:t>
       </w:r>
     </w:p>
     <w:p>
@@ -15045,14 +14829,6 @@
     </w:p>
     <w:tbl>
       <w:tblPr>
-        <w:tblBorders>
-          <w:top w:val="single" w:sz="6" w:space="0" w:color="AAAAAA"/>
-          <w:left w:val="single" w:sz="6" w:space="0" w:color="AAAAAA"/>
-          <w:bottom w:val="single" w:sz="6" w:space="0" w:color="AAAAAA"/>
-          <w:right w:val="single" w:sz="6" w:space="0" w:color="AAAAAA"/>
-          <w:insideH w:val="single" w:sz="6" w:space="0" w:color="AAAAAA"/>
-          <w:insideV w:val="single" w:sz="6" w:space="0" w:color="AAAAAA"/>
-        </w:tblBorders>
         <w:tblStyle w:val="Table"/>
         <w:tblW w:type="pct" w:w="4892"/>
         <w:tblLayout w:type="fixed"/>
@@ -15505,14 +15281,6 @@
     </w:p>
     <w:tbl>
       <w:tblPr>
-        <w:tblBorders>
-          <w:top w:val="single" w:sz="6" w:space="0" w:color="AAAAAA"/>
-          <w:left w:val="single" w:sz="6" w:space="0" w:color="AAAAAA"/>
-          <w:bottom w:val="single" w:sz="6" w:space="0" w:color="AAAAAA"/>
-          <w:right w:val="single" w:sz="6" w:space="0" w:color="AAAAAA"/>
-          <w:insideH w:val="single" w:sz="6" w:space="0" w:color="AAAAAA"/>
-          <w:insideV w:val="single" w:sz="6" w:space="0" w:color="AAAAAA"/>
-        </w:tblBorders>
         <w:tblStyle w:val="Table"/>
         <w:tblW w:type="pct" w:w="4929"/>
         <w:tblLayout w:type="fixed"/>
@@ -15941,14 +15709,6 @@
     </w:p>
     <w:tbl>
       <w:tblPr>
-        <w:tblBorders>
-          <w:top w:val="single" w:sz="6" w:space="0" w:color="AAAAAA"/>
-          <w:left w:val="single" w:sz="6" w:space="0" w:color="AAAAAA"/>
-          <w:bottom w:val="single" w:sz="6" w:space="0" w:color="AAAAAA"/>
-          <w:right w:val="single" w:sz="6" w:space="0" w:color="AAAAAA"/>
-          <w:insideH w:val="single" w:sz="6" w:space="0" w:color="AAAAAA"/>
-          <w:insideV w:val="single" w:sz="6" w:space="0" w:color="AAAAAA"/>
-        </w:tblBorders>
         <w:tblStyle w:val="Table"/>
         <w:tblW w:type="pct" w:w="4912"/>
         <w:tblLayout w:type="fixed"/>
@@ -16459,14 +16219,6 @@
     </w:p>
     <w:tbl>
       <w:tblPr>
-        <w:tblBorders>
-          <w:top w:val="single" w:sz="6" w:space="0" w:color="AAAAAA"/>
-          <w:left w:val="single" w:sz="6" w:space="0" w:color="AAAAAA"/>
-          <w:bottom w:val="single" w:sz="6" w:space="0" w:color="AAAAAA"/>
-          <w:right w:val="single" w:sz="6" w:space="0" w:color="AAAAAA"/>
-          <w:insideH w:val="single" w:sz="6" w:space="0" w:color="AAAAAA"/>
-          <w:insideV w:val="single" w:sz="6" w:space="0" w:color="AAAAAA"/>
-        </w:tblBorders>
         <w:tblStyle w:val="Table"/>
         <w:tblW w:type="pct" w:w="4913"/>
         <w:tblLayout w:type="fixed"/>
@@ -16656,14 +16408,6 @@
     </w:p>
     <w:tbl>
       <w:tblPr>
-        <w:tblBorders>
-          <w:top w:val="single" w:sz="6" w:space="0" w:color="AAAAAA"/>
-          <w:left w:val="single" w:sz="6" w:space="0" w:color="AAAAAA"/>
-          <w:bottom w:val="single" w:sz="6" w:space="0" w:color="AAAAAA"/>
-          <w:right w:val="single" w:sz="6" w:space="0" w:color="AAAAAA"/>
-          <w:insideH w:val="single" w:sz="6" w:space="0" w:color="AAAAAA"/>
-          <w:insideV w:val="single" w:sz="6" w:space="0" w:color="AAAAAA"/>
-        </w:tblBorders>
         <w:tblStyle w:val="Table"/>
         <w:tblW w:type="pct" w:w="4954"/>
         <w:tblLayout w:type="fixed"/>
@@ -16977,14 +16721,6 @@
     </w:p>
     <w:tbl>
       <w:tblPr>
-        <w:tblBorders>
-          <w:top w:val="single" w:sz="6" w:space="0" w:color="AAAAAA"/>
-          <w:left w:val="single" w:sz="6" w:space="0" w:color="AAAAAA"/>
-          <w:bottom w:val="single" w:sz="6" w:space="0" w:color="AAAAAA"/>
-          <w:right w:val="single" w:sz="6" w:space="0" w:color="AAAAAA"/>
-          <w:insideH w:val="single" w:sz="6" w:space="0" w:color="AAAAAA"/>
-          <w:insideV w:val="single" w:sz="6" w:space="0" w:color="AAAAAA"/>
-        </w:tblBorders>
         <w:tblStyle w:val="Table"/>
         <w:tblW w:type="pct" w:w="4885"/>
         <w:tblLayout w:type="fixed"/>

</xml_diff>

<commit_message>
GHL guide: name WF-41 and WF-43, document the registration lifecycle
Scott supplied the two names. WF-41 is Dealer Deal Approved, WF-43 is
Dealer Commission Payout. Triggers and actions are still marked CONFIRM.

Added the lifecycle, which the Commercial pipeline stages already imply:
submitted, conflict-checked, held for 90 days through the sales stages,
paid out after the status flips to Won.

Co-Authored-By: Claude Opus 5 <noreply@anthropic.com>
</commit_message>
<xml_diff>
--- a/Enyrgy_GHL_Implementation_Guide_v3_9.docx
+++ b/Enyrgy_GHL_Implementation_Guide_v3_9.docx
@@ -11702,17 +11702,21 @@
               <w:pStyle w:val="Compact"/>
             </w:pPr>
             <w:r>
-              <w:t xml:space="preserve">WF-41</w:t>
-            </w:r>
-          </w:p>
-        </w:tc>
-        <w:tc>
-          <w:tcPr/>
-          <w:p>
-            <w:pPr>
-              <w:pStyle w:val="Compact"/>
-            </w:pPr>
-            <w:r>
+              <w:t xml:space="preserve">WF-41 Dealer Deal Approved</w:t>
+            </w:r>
+          </w:p>
+        </w:tc>
+        <w:tc>
+          <w:tcPr/>
+          <w:p>
+            <w:pPr>
+              <w:pStyle w:val="Compact"/>
+            </w:pPr>
+            <w:r>
+              <w:rPr>
+                <w:b/>
+                <w:bCs/>
+              </w:rPr>
               <w:t xml:space="preserve">CONFIRM</w:t>
             </w:r>
           </w:p>
@@ -11724,18 +11728,18 @@
               <w:pStyle w:val="Compact"/>
             </w:pPr>
             <w:r>
-              <w:t xml:space="preserve">CONFIRM</w:t>
-            </w:r>
-          </w:p>
-        </w:tc>
-        <w:tc>
-          <w:tcPr/>
-          <w:p>
-            <w:pPr>
-              <w:pStyle w:val="Compact"/>
-            </w:pPr>
-            <w:r>
-              <w:t xml:space="preserve">Not sourceable from the repository. Scott to supply.</w:t>
+              <w:t xml:space="preserve">Clear the registration after the conflict check and start the 90 day clock</w:t>
+            </w:r>
+          </w:p>
+        </w:tc>
+        <w:tc>
+          <w:tcPr/>
+          <w:p>
+            <w:pPr>
+              <w:pStyle w:val="Compact"/>
+            </w:pPr>
+            <w:r>
+              <w:t xml:space="preserve">Trigger and actions still to be confirmed against the live account.</w:t>
             </w:r>
           </w:p>
         </w:tc>
@@ -11816,17 +11820,21 @@
               <w:pStyle w:val="Compact"/>
             </w:pPr>
             <w:r>
-              <w:t xml:space="preserve">WF-43</w:t>
-            </w:r>
-          </w:p>
-        </w:tc>
-        <w:tc>
-          <w:tcPr/>
-          <w:p>
-            <w:pPr>
-              <w:pStyle w:val="Compact"/>
-            </w:pPr>
-            <w:r>
+              <w:t xml:space="preserve">WF-43 Dealer Commission Payout</w:t>
+            </w:r>
+          </w:p>
+        </w:tc>
+        <w:tc>
+          <w:tcPr/>
+          <w:p>
+            <w:pPr>
+              <w:pStyle w:val="Compact"/>
+            </w:pPr>
+            <w:r>
+              <w:rPr>
+                <w:b/>
+                <w:bCs/>
+              </w:rPr>
               <w:t xml:space="preserve">CONFIRM</w:t>
             </w:r>
           </w:p>
@@ -11838,23 +11846,146 @@
               <w:pStyle w:val="Compact"/>
             </w:pPr>
             <w:r>
-              <w:t xml:space="preserve">CONFIRM</w:t>
-            </w:r>
-          </w:p>
-        </w:tc>
-        <w:tc>
-          <w:tcPr/>
-          <w:p>
-            <w:pPr>
-              <w:pStyle w:val="Compact"/>
-            </w:pPr>
-            <w:r>
-              <w:t xml:space="preserve">Not sourceable from the repository. Scott to supply.</w:t>
+              <w:t xml:space="preserve">Handle commission once the deal is won, against the ladder below</w:t>
+            </w:r>
+          </w:p>
+        </w:tc>
+        <w:tc>
+          <w:tcPr/>
+          <w:p>
+            <w:pPr>
+              <w:pStyle w:val="Compact"/>
+            </w:pPr>
+            <w:r>
+              <w:t xml:space="preserve">Trigger and actions still to be confirmed against the live account.</w:t>
             </w:r>
           </w:p>
         </w:tc>
       </w:tr>
     </w:tbl>
+    <w:p>
+      <w:pPr>
+        <w:pStyle w:val="BodyText"/>
+      </w:pPr>
+      <w:r>
+        <w:rPr>
+          <w:b/>
+          <w:bCs/>
+        </w:rPr>
+        <w:t xml:space="preserve">The four workflows follow the Commercial pipeline stages in Section 10.</w:t>
+      </w:r>
+      <w:r>
+        <w:t xml:space="preserve"> </w:t>
+      </w:r>
+      <w:r>
+        <w:t xml:space="preserve">A registration arrives at</w:t>
+      </w:r>
+      <w:r>
+        <w:t xml:space="preserve"> </w:t>
+      </w:r>
+      <w:r>
+        <w:rPr>
+          <w:rStyle w:val="VerbatimChar"/>
+        </w:rPr>
+        <w:t xml:space="preserve">Registration Submitted</w:t>
+      </w:r>
+      <w:r>
+        <w:t xml:space="preserve"> </w:t>
+      </w:r>
+      <w:r>
+        <w:t xml:space="preserve">(WF-40), clears or fails at</w:t>
+      </w:r>
+      <w:r>
+        <w:t xml:space="preserve"> </w:t>
+      </w:r>
+      <w:r>
+        <w:rPr>
+          <w:rStyle w:val="VerbatimChar"/>
+        </w:rPr>
+        <w:t xml:space="preserve">Conflict Check</w:t>
+      </w:r>
+      <w:r>
+        <w:t xml:space="preserve"> </w:t>
+      </w:r>
+      <w:r>
+        <w:t xml:space="preserve">(WF-41), holds attribution for 90 days while the deal works through</w:t>
+      </w:r>
+      <w:r>
+        <w:t xml:space="preserve"> </w:t>
+      </w:r>
+      <w:r>
+        <w:rPr>
+          <w:rStyle w:val="VerbatimChar"/>
+        </w:rPr>
+        <w:t xml:space="preserve">Prospect</w:t>
+      </w:r>
+      <w:r>
+        <w:t xml:space="preserve"> </w:t>
+      </w:r>
+      <w:r>
+        <w:t xml:space="preserve">to</w:t>
+      </w:r>
+      <w:r>
+        <w:t xml:space="preserve"> </w:t>
+      </w:r>
+      <w:r>
+        <w:rPr>
+          <w:rStyle w:val="VerbatimChar"/>
+        </w:rPr>
+        <w:t xml:space="preserve">Negotiation</w:t>
+      </w:r>
+      <w:r>
+        <w:t xml:space="preserve"> </w:t>
+      </w:r>
+      <w:r>
+        <w:t xml:space="preserve">(WF-42 guards the clock), and pays out after</w:t>
+      </w:r>
+      <w:r>
+        <w:t xml:space="preserve"> </w:t>
+      </w:r>
+      <w:r>
+        <w:rPr>
+          <w:rStyle w:val="VerbatimChar"/>
+        </w:rPr>
+        <w:t xml:space="preserve">Contract Signed</w:t>
+      </w:r>
+      <w:r>
+        <w:t xml:space="preserve"> </w:t>
+      </w:r>
+      <w:r>
+        <w:t xml:space="preserve">flips the status to Won (WF-43).</w:t>
+      </w:r>
+      <w:r>
+        <w:t xml:space="preserve"> </w:t>
+      </w:r>
+      <w:r>
+        <w:rPr>
+          <w:rStyle w:val="VerbatimChar"/>
+        </w:rPr>
+        <w:t xml:space="preserve">Registration Submitted</w:t>
+      </w:r>
+      <w:r>
+        <w:t xml:space="preserve"> </w:t>
+      </w:r>
+      <w:r>
+        <w:t xml:space="preserve">and</w:t>
+      </w:r>
+      <w:r>
+        <w:t xml:space="preserve"> </w:t>
+      </w:r>
+      <w:r>
+        <w:rPr>
+          <w:rStyle w:val="VerbatimChar"/>
+        </w:rPr>
+        <w:t xml:space="preserve">Conflict Check</w:t>
+      </w:r>
+      <w:r>
+        <w:t xml:space="preserve"> </w:t>
+      </w:r>
+      <w:r>
+        <w:t xml:space="preserve">both sit at probability 0 and are excluded from the funnel and pie charts, because a submission that has not cleared conflict is not a deal.</w:t>
+      </w:r>
+    </w:p>
     <w:p>
       <w:pPr>
         <w:pStyle w:val="BodyText"/>

</xml_diff>

<commit_message>
GHL guide: resolve the workflow numbering gaps
WF-23, WF-24 and WF-36 to WF-39 do not exist. The numbers were skipped when
the blocks were allocated, confirmed by Scott. Recorded so nobody goes
hunting for them in the live account.

Co-Authored-By: Claude Opus 5 <noreply@anthropic.com>
</commit_message>
<xml_diff>
--- a/Enyrgy_GHL_Implementation_Guide_v3_9.docx
+++ b/Enyrgy_GHL_Implementation_Guide_v3_9.docx
@@ -10800,7 +10800,7 @@
           <w:b/>
           <w:bCs/>
         </w:rPr>
-        <w:t xml:space="preserve">Numbering gaps.</w:t>
+        <w:t xml:space="preserve">Numbering gaps, resolved.</w:t>
       </w:r>
       <w:r>
         <w:t xml:space="preserve"> </w:t>
@@ -10810,29 +10810,13 @@
           <w:b/>
           <w:bCs/>
         </w:rPr>
-        <w:t xml:space="preserve">WF-23 and WF-24 do not appear in this register and are not documented anywhere in the repository.</w:t>
-      </w:r>
-      <w:r>
-        <w:t xml:space="preserve"> </w:t>
-      </w:r>
-      <w:r>
-        <w:t xml:space="preserve">Either the numbers were skipped when the block was allocated, or two workflows exist in GHL that nobody has written down.</w:t>
-      </w:r>
-      <w:r>
-        <w:t xml:space="preserve"> </w:t>
-      </w:r>
-      <w:r>
-        <w:rPr>
-          <w:b/>
-          <w:bCs/>
-        </w:rPr>
-        <w:t xml:space="preserve">CONFIRM against the live account.</w:t>
-      </w:r>
-      <w:r>
-        <w:t xml:space="preserve"> </w:t>
-      </w:r>
-      <w:r>
-        <w:t xml:space="preserve">WF-36 to WF-39 are likewise unallocated; the dealer registration block starts at WF-40.</w:t>
+        <w:t xml:space="preserve">WF-23, WF-24 and WF-36 to WF-39 do not exist.</w:t>
+      </w:r>
+      <w:r>
+        <w:t xml:space="preserve"> </w:t>
+      </w:r>
+      <w:r>
+        <w:t xml:space="preserve">The numbers were skipped when the blocks were allocated (confirmed by Scott, 2026-08-25). Nothing is missing from this register, and nobody should go looking for them in the live account. The dealer registration block starts at WF-40.</w:t>
       </w:r>
     </w:p>
     <w:bookmarkEnd w:id="53"/>

</xml_diff>